<commit_message>
changed dal models to entities
</commit_message>
<xml_diff>
--- a/BachelorThesis.docx
+++ b/BachelorThesis.docx
@@ -2609,7 +2609,25 @@
           <w:sz w:val="24"/>
           <w:szCs w:val="24"/>
         </w:rPr>
-        <w:t xml:space="preserve"> the end of the chapter, there is a part dedicated to web applications, focusing on how they have improved over the years, what is their structure and also there is section dedicated to websockets.</w:t>
+        <w:t xml:space="preserve"> the end of the chapter, there is a part dedicated to web applications, focusing on how they have improved over the years, what is their structure and also there is section dedicated to </w:t>
+      </w:r>
+      <w:proofErr w:type="spellStart"/>
+      <w:r>
+        <w:rPr>
+          <w:rFonts w:ascii="Times New Roman" w:hAnsi="Times New Roman" w:cs="Times New Roman"/>
+          <w:sz w:val="24"/>
+          <w:szCs w:val="24"/>
+        </w:rPr>
+        <w:t>websockets</w:t>
+      </w:r>
+      <w:proofErr w:type="spellEnd"/>
+      <w:r>
+        <w:rPr>
+          <w:rFonts w:ascii="Times New Roman" w:hAnsi="Times New Roman" w:cs="Times New Roman"/>
+          <w:sz w:val="24"/>
+          <w:szCs w:val="24"/>
+        </w:rPr>
+        <w:t>.</w:t>
       </w:r>
     </w:p>
     <w:p>
@@ -5046,10 +5064,22 @@
       </w:pPr>
       <w:bookmarkStart w:id="8" w:name="_Toc104214478"/>
       <w:r>
-        <w:t xml:space="preserve">Why and How to </w:t>
-      </w:r>
-      <w:r>
-        <w:t>Implement a Software System for Patient-Doctor Relationship</w:t>
+        <w:t>Why and h</w:t>
+      </w:r>
+      <w:r>
+        <w:t xml:space="preserve">ow to </w:t>
+      </w:r>
+      <w:r>
+        <w:t>implement a software s</w:t>
+      </w:r>
+      <w:r>
+        <w:t xml:space="preserve">ystem for </w:t>
+      </w:r>
+      <w:r>
+        <w:t>patient-doctor r</w:t>
+      </w:r>
+      <w:r>
+        <w:t>elationship</w:t>
       </w:r>
       <w:r>
         <w:t>?</w:t>
@@ -5292,6 +5322,215 @@
     </w:p>
     <w:p>
       <w:pPr>
+        <w:keepNext/>
+        <w:spacing w:line="360" w:lineRule="auto"/>
+        <w:jc w:val="center"/>
+      </w:pPr>
+      <w:r>
+        <w:rPr>
+          <w:rFonts w:ascii="Times New Roman" w:hAnsi="Times New Roman" w:cs="Times New Roman"/>
+          <w:noProof/>
+          <w:sz w:val="24"/>
+          <w:szCs w:val="24"/>
+        </w:rPr>
+        <w:drawing>
+          <wp:inline distT="0" distB="0" distL="0" distR="0" wp14:anchorId="359022CB" wp14:editId="75939218">
+            <wp:extent cx="5265927" cy="3028950"/>
+            <wp:effectExtent l="0" t="0" r="0" b="0"/>
+            <wp:docPr id="8" name="Picture 8"/>
+            <wp:cNvGraphicFramePr>
+              <a:graphicFrameLocks xmlns:a="http://schemas.openxmlformats.org/drawingml/2006/main" noChangeAspect="1"/>
+            </wp:cNvGraphicFramePr>
+            <a:graphic xmlns:a="http://schemas.openxmlformats.org/drawingml/2006/main">
+              <a:graphicData uri="http://schemas.openxmlformats.org/drawingml/2006/picture">
+                <pic:pic xmlns:pic="http://schemas.openxmlformats.org/drawingml/2006/picture">
+                  <pic:nvPicPr>
+                    <pic:cNvPr id="0" name="Picture 3"/>
+                    <pic:cNvPicPr>
+                      <a:picLocks noChangeAspect="1" noChangeArrowheads="1"/>
+                    </pic:cNvPicPr>
+                  </pic:nvPicPr>
+                  <pic:blipFill>
+                    <a:blip r:embed="rId12">
+                      <a:extLst>
+                        <a:ext uri="{28A0092B-C50C-407E-A947-70E740481C1C}">
+                          <a14:useLocalDpi xmlns:a14="http://schemas.microsoft.com/office/drawing/2010/main" val="0"/>
+                        </a:ext>
+                      </a:extLst>
+                    </a:blip>
+                    <a:srcRect/>
+                    <a:stretch>
+                      <a:fillRect/>
+                    </a:stretch>
+                  </pic:blipFill>
+                  <pic:spPr bwMode="auto">
+                    <a:xfrm>
+                      <a:off x="0" y="0"/>
+                      <a:ext cx="5265927" cy="3028950"/>
+                    </a:xfrm>
+                    <a:prstGeom prst="rect">
+                      <a:avLst/>
+                    </a:prstGeom>
+                    <a:noFill/>
+                    <a:ln>
+                      <a:noFill/>
+                    </a:ln>
+                  </pic:spPr>
+                </pic:pic>
+              </a:graphicData>
+            </a:graphic>
+          </wp:inline>
+        </w:drawing>
+      </w:r>
+    </w:p>
+    <w:p>
+      <w:pPr>
+        <w:pStyle w:val="Caption"/>
+        <w:jc w:val="center"/>
+        <w:rPr>
+          <w:rFonts w:ascii="Times New Roman" w:hAnsi="Times New Roman" w:cs="Times New Roman"/>
+          <w:b w:val="0"/>
+          <w:color w:val="000000" w:themeColor="text1"/>
+          <w:sz w:val="24"/>
+          <w:szCs w:val="24"/>
+        </w:rPr>
+      </w:pPr>
+      <w:r>
+        <w:rPr>
+          <w:rFonts w:ascii="Times New Roman" w:hAnsi="Times New Roman" w:cs="Times New Roman"/>
+          <w:b w:val="0"/>
+          <w:color w:val="000000" w:themeColor="text1"/>
+          <w:sz w:val="24"/>
+          <w:szCs w:val="24"/>
+        </w:rPr>
+        <w:t xml:space="preserve">Figure </w:t>
+      </w:r>
+      <w:r>
+        <w:rPr>
+          <w:rFonts w:ascii="Times New Roman" w:hAnsi="Times New Roman" w:cs="Times New Roman"/>
+          <w:b w:val="0"/>
+          <w:color w:val="000000" w:themeColor="text1"/>
+          <w:sz w:val="24"/>
+          <w:szCs w:val="24"/>
+        </w:rPr>
+        <w:fldChar w:fldCharType="begin"/>
+      </w:r>
+      <w:r>
+        <w:rPr>
+          <w:rFonts w:ascii="Times New Roman" w:hAnsi="Times New Roman" w:cs="Times New Roman"/>
+          <w:b w:val="0"/>
+          <w:color w:val="000000" w:themeColor="text1"/>
+          <w:sz w:val="24"/>
+          <w:szCs w:val="24"/>
+        </w:rPr>
+        <w:instrText xml:space="preserve"> STYLEREF 1 \s </w:instrText>
+      </w:r>
+      <w:r>
+        <w:rPr>
+          <w:rFonts w:ascii="Times New Roman" w:hAnsi="Times New Roman" w:cs="Times New Roman"/>
+          <w:b w:val="0"/>
+          <w:color w:val="000000" w:themeColor="text1"/>
+          <w:sz w:val="24"/>
+          <w:szCs w:val="24"/>
+        </w:rPr>
+        <w:fldChar w:fldCharType="separate"/>
+      </w:r>
+      <w:r>
+        <w:rPr>
+          <w:rFonts w:ascii="Times New Roman" w:hAnsi="Times New Roman" w:cs="Times New Roman"/>
+          <w:b w:val="0"/>
+          <w:noProof/>
+          <w:color w:val="000000" w:themeColor="text1"/>
+          <w:sz w:val="24"/>
+          <w:szCs w:val="24"/>
+        </w:rPr>
+        <w:t>2</w:t>
+      </w:r>
+      <w:r>
+        <w:rPr>
+          <w:rFonts w:ascii="Times New Roman" w:hAnsi="Times New Roman" w:cs="Times New Roman"/>
+          <w:b w:val="0"/>
+          <w:color w:val="000000" w:themeColor="text1"/>
+          <w:sz w:val="24"/>
+          <w:szCs w:val="24"/>
+        </w:rPr>
+        <w:fldChar w:fldCharType="end"/>
+      </w:r>
+      <w:r>
+        <w:rPr>
+          <w:rFonts w:ascii="Times New Roman" w:hAnsi="Times New Roman" w:cs="Times New Roman"/>
+          <w:b w:val="0"/>
+          <w:color w:val="000000" w:themeColor="text1"/>
+          <w:sz w:val="24"/>
+          <w:szCs w:val="24"/>
+        </w:rPr>
+        <w:noBreakHyphen/>
+      </w:r>
+      <w:r>
+        <w:rPr>
+          <w:rFonts w:ascii="Times New Roman" w:hAnsi="Times New Roman" w:cs="Times New Roman"/>
+          <w:b w:val="0"/>
+          <w:color w:val="000000" w:themeColor="text1"/>
+          <w:sz w:val="24"/>
+          <w:szCs w:val="24"/>
+        </w:rPr>
+        <w:fldChar w:fldCharType="begin"/>
+      </w:r>
+      <w:r>
+        <w:rPr>
+          <w:rFonts w:ascii="Times New Roman" w:hAnsi="Times New Roman" w:cs="Times New Roman"/>
+          <w:b w:val="0"/>
+          <w:color w:val="000000" w:themeColor="text1"/>
+          <w:sz w:val="24"/>
+          <w:szCs w:val="24"/>
+        </w:rPr>
+        <w:instrText xml:space="preserve"> SEQ Figure \* ARABIC \s 1 </w:instrText>
+      </w:r>
+      <w:r>
+        <w:rPr>
+          <w:rFonts w:ascii="Times New Roman" w:hAnsi="Times New Roman" w:cs="Times New Roman"/>
+          <w:b w:val="0"/>
+          <w:color w:val="000000" w:themeColor="text1"/>
+          <w:sz w:val="24"/>
+          <w:szCs w:val="24"/>
+        </w:rPr>
+        <w:fldChar w:fldCharType="separate"/>
+      </w:r>
+      <w:r>
+        <w:rPr>
+          <w:rFonts w:ascii="Times New Roman" w:hAnsi="Times New Roman" w:cs="Times New Roman"/>
+          <w:b w:val="0"/>
+          <w:noProof/>
+          <w:color w:val="000000" w:themeColor="text1"/>
+          <w:sz w:val="24"/>
+          <w:szCs w:val="24"/>
+        </w:rPr>
+        <w:t>4</w:t>
+      </w:r>
+      <w:r>
+        <w:rPr>
+          <w:rFonts w:ascii="Times New Roman" w:hAnsi="Times New Roman" w:cs="Times New Roman"/>
+          <w:b w:val="0"/>
+          <w:color w:val="000000" w:themeColor="text1"/>
+          <w:sz w:val="24"/>
+          <w:szCs w:val="24"/>
+        </w:rPr>
+        <w:fldChar w:fldCharType="end"/>
+      </w:r>
+      <w:r>
+        <w:rPr>
+          <w:rFonts w:ascii="Times New Roman" w:hAnsi="Times New Roman" w:cs="Times New Roman"/>
+          <w:b w:val="0"/>
+          <w:color w:val="000000" w:themeColor="text1"/>
+          <w:sz w:val="24"/>
+          <w:szCs w:val="24"/>
+        </w:rPr>
+        <w:t xml:space="preserve"> Software Engineering Methodology for Healthcare Applications [11]</w:t>
+      </w:r>
+    </w:p>
+    <w:p/>
+    <w:p>
+      <w:pPr>
         <w:spacing w:line="360" w:lineRule="auto"/>
         <w:jc w:val="both"/>
         <w:rPr>
@@ -5300,55 +5539,670 @@
           <w:szCs w:val="24"/>
         </w:rPr>
       </w:pPr>
-      <w:bookmarkStart w:id="9" w:name="_GoBack"/>
-      <w:bookmarkEnd w:id="9"/>
+      <w:r>
+        <w:rPr>
+          <w:rFonts w:ascii="Times New Roman" w:hAnsi="Times New Roman" w:cs="Times New Roman"/>
+          <w:sz w:val="24"/>
+          <w:szCs w:val="24"/>
+        </w:rPr>
+        <w:lastRenderedPageBreak/>
+        <w:t>After seeing the arguments for developing a software system for managing the patient-doctor relationship, we will turn our attention to how this process should be done.</w:t>
+      </w:r>
+      <w:r>
+        <w:rPr>
+          <w:rFonts w:ascii="Times New Roman" w:hAnsi="Times New Roman" w:cs="Times New Roman"/>
+          <w:sz w:val="24"/>
+          <w:szCs w:val="24"/>
+        </w:rPr>
+        <w:t xml:space="preserve"> In article [11], there is proposed a new software engineering methodology for healthcare applications SEMHTA.</w:t>
+      </w:r>
+      <w:r>
+        <w:rPr>
+          <w:rFonts w:ascii="Times New Roman" w:hAnsi="Times New Roman" w:cs="Times New Roman"/>
+          <w:sz w:val="24"/>
+          <w:szCs w:val="24"/>
+        </w:rPr>
+        <w:t xml:space="preserve"> This methodology considers the healthcare background of the end user and the impact on the development activities. SEMHTA is built on four main phases: Planning and Analysis, Design and Build, Implementation, Validation and del</w:t>
+      </w:r>
+      <w:r>
+        <w:rPr>
+          <w:rFonts w:ascii="Times New Roman" w:hAnsi="Times New Roman" w:cs="Times New Roman"/>
+          <w:sz w:val="24"/>
+          <w:szCs w:val="24"/>
+        </w:rPr>
+        <w:t>ivery [11]. Each phase requires multiple activities and all phases are strongly related to others.</w:t>
+      </w:r>
+      <w:r>
+        <w:rPr>
+          <w:rFonts w:ascii="Times New Roman" w:hAnsi="Times New Roman" w:cs="Times New Roman"/>
+          <w:sz w:val="24"/>
+          <w:szCs w:val="24"/>
+        </w:rPr>
+        <w:t xml:space="preserve"> SEMHTA framework is presented in figure 2-4.</w:t>
+      </w:r>
+    </w:p>
+    <w:p>
+      <w:pPr>
+        <w:spacing w:line="360" w:lineRule="auto"/>
+        <w:jc w:val="both"/>
+        <w:rPr>
+          <w:rFonts w:ascii="Times New Roman" w:hAnsi="Times New Roman" w:cs="Times New Roman"/>
+          <w:sz w:val="24"/>
+          <w:szCs w:val="24"/>
+        </w:rPr>
+      </w:pPr>
+      <w:r>
+        <w:rPr>
+          <w:rFonts w:ascii="Times New Roman" w:hAnsi="Times New Roman" w:cs="Times New Roman"/>
+          <w:sz w:val="24"/>
+          <w:szCs w:val="24"/>
+        </w:rPr>
+        <w:t>The</w:t>
+      </w:r>
+      <w:r>
+        <w:rPr>
+          <w:rFonts w:ascii="Times New Roman" w:hAnsi="Times New Roman" w:cs="Times New Roman"/>
+          <w:sz w:val="24"/>
+          <w:szCs w:val="24"/>
+        </w:rPr>
+        <w:t xml:space="preserve"> Planning and Analysis Phase</w:t>
+      </w:r>
+      <w:r>
+        <w:rPr>
+          <w:rFonts w:ascii="Times New Roman" w:hAnsi="Times New Roman" w:cs="Times New Roman"/>
+          <w:sz w:val="24"/>
+          <w:szCs w:val="24"/>
+        </w:rPr>
+        <w:t xml:space="preserve"> is arguably the most challenging one when developing a healthcare application. Initially, there must be created plans which have the aim to guide the development and healthcare team throughout the entire process. Also, there should be build communication channels between the healthcare specialists and software engineers. During the analysis phase, the main activity is to gather hospital’s requirements and environmental considerations</w:t>
+      </w:r>
+      <w:r>
+        <w:rPr>
+          <w:rFonts w:ascii="Times New Roman" w:hAnsi="Times New Roman" w:cs="Times New Roman"/>
+          <w:sz w:val="24"/>
+          <w:szCs w:val="24"/>
+        </w:rPr>
+        <w:t xml:space="preserve"> [11]</w:t>
+      </w:r>
+      <w:r>
+        <w:rPr>
+          <w:rFonts w:ascii="Times New Roman" w:hAnsi="Times New Roman" w:cs="Times New Roman"/>
+          <w:sz w:val="24"/>
+          <w:szCs w:val="24"/>
+        </w:rPr>
+        <w:t>.</w:t>
+      </w:r>
+      <w:r>
+        <w:rPr>
+          <w:rFonts w:ascii="Times New Roman" w:hAnsi="Times New Roman" w:cs="Times New Roman"/>
+          <w:sz w:val="24"/>
+          <w:szCs w:val="24"/>
+        </w:rPr>
+        <w:t xml:space="preserve"> In SEMHTA methodology, this can be achieved through workshops where different categories will participate like physicians, developers or even possible patients.</w:t>
+      </w:r>
+      <w:r>
+        <w:rPr>
+          <w:rFonts w:ascii="Times New Roman" w:hAnsi="Times New Roman" w:cs="Times New Roman"/>
+          <w:sz w:val="24"/>
+          <w:szCs w:val="24"/>
+        </w:rPr>
+        <w:t xml:space="preserve"> </w:t>
+      </w:r>
+    </w:p>
+    <w:p>
+      <w:pPr>
+        <w:spacing w:line="360" w:lineRule="auto"/>
+        <w:jc w:val="both"/>
+        <w:rPr>
+          <w:rFonts w:ascii="Times New Roman" w:hAnsi="Times New Roman" w:cs="Times New Roman"/>
+          <w:sz w:val="24"/>
+          <w:szCs w:val="24"/>
+        </w:rPr>
+      </w:pPr>
+      <w:r>
+        <w:rPr>
+          <w:rFonts w:ascii="Times New Roman" w:hAnsi="Times New Roman" w:cs="Times New Roman"/>
+          <w:sz w:val="24"/>
+          <w:szCs w:val="24"/>
+        </w:rPr>
+        <w:t>The aim of the Design and Build Phase</w:t>
+      </w:r>
+      <w:r>
+        <w:rPr>
+          <w:rFonts w:ascii="Times New Roman" w:hAnsi="Times New Roman" w:cs="Times New Roman"/>
+          <w:sz w:val="24"/>
+          <w:szCs w:val="24"/>
+        </w:rPr>
+        <w:t xml:space="preserve"> </w:t>
+      </w:r>
+      <w:r>
+        <w:rPr>
+          <w:rFonts w:ascii="Times New Roman" w:hAnsi="Times New Roman" w:cs="Times New Roman"/>
+          <w:sz w:val="24"/>
+          <w:szCs w:val="24"/>
+        </w:rPr>
+        <w:t xml:space="preserve">is to create the technical plan to implement the requirements. This phase requires the plans from the previous stage based on which the design document will be created. In this document, different technical aspects like the used programming languages, machines or the architecture will be specified. The healthcare specialists should have an important contribution to this document. In the Implementation Phase, the </w:t>
+      </w:r>
+      <w:r>
+        <w:rPr>
+          <w:rFonts w:ascii="Times New Roman" w:hAnsi="Times New Roman" w:cs="Times New Roman"/>
+          <w:sz w:val="24"/>
+          <w:szCs w:val="24"/>
+        </w:rPr>
+        <w:t>application</w:t>
+      </w:r>
+      <w:r>
+        <w:rPr>
+          <w:rFonts w:ascii="Times New Roman" w:hAnsi="Times New Roman" w:cs="Times New Roman"/>
+          <w:sz w:val="24"/>
+          <w:szCs w:val="24"/>
+        </w:rPr>
+        <w:t xml:space="preserve"> is developed</w:t>
+      </w:r>
+      <w:r>
+        <w:rPr>
+          <w:rFonts w:ascii="Times New Roman" w:hAnsi="Times New Roman" w:cs="Times New Roman"/>
+          <w:sz w:val="24"/>
+          <w:szCs w:val="24"/>
+        </w:rPr>
+        <w:t xml:space="preserve"> based on the components identified during the design period. There are followed</w:t>
+      </w:r>
+      <w:r>
+        <w:rPr>
+          <w:rFonts w:ascii="Times New Roman" w:hAnsi="Times New Roman" w:cs="Times New Roman"/>
+          <w:sz w:val="24"/>
+          <w:szCs w:val="24"/>
+        </w:rPr>
+        <w:t xml:space="preserve"> some concerns like reliability, performance or security.</w:t>
+      </w:r>
+    </w:p>
+    <w:p>
+      <w:pPr>
+        <w:spacing w:line="360" w:lineRule="auto"/>
+        <w:jc w:val="both"/>
+        <w:rPr>
+          <w:rFonts w:ascii="Times New Roman" w:hAnsi="Times New Roman" w:cs="Times New Roman"/>
+          <w:sz w:val="24"/>
+          <w:szCs w:val="24"/>
+        </w:rPr>
+      </w:pPr>
+      <w:r>
+        <w:rPr>
+          <w:rFonts w:ascii="Times New Roman" w:hAnsi="Times New Roman" w:cs="Times New Roman"/>
+          <w:sz w:val="24"/>
+          <w:szCs w:val="24"/>
+        </w:rPr>
+        <w:t>The SEMHTA methodology suggests that the Validation and Delivery Phase should be executed by a joint team and not by another team as it is the case in many other software engineering methods. This joint team includes the developers of the application but also healthcare specialists and end users. Assigning the validation phase to a total different team seems to lead to many errors.</w:t>
+      </w:r>
+    </w:p>
+    <w:p>
+      <w:pPr>
+        <w:spacing w:line="360" w:lineRule="auto"/>
+        <w:jc w:val="both"/>
+        <w:rPr>
+          <w:rFonts w:ascii="Times New Roman" w:hAnsi="Times New Roman" w:cs="Times New Roman"/>
+          <w:sz w:val="24"/>
+          <w:szCs w:val="24"/>
+        </w:rPr>
+      </w:pPr>
+      <w:r>
+        <w:rPr>
+          <w:rFonts w:ascii="Times New Roman" w:hAnsi="Times New Roman" w:cs="Times New Roman"/>
+          <w:sz w:val="24"/>
+          <w:szCs w:val="24"/>
+        </w:rPr>
+        <w:t xml:space="preserve">The same research paper [11] presents a comparison between some software engineering methodologies, based on the healthcare system issues such as reliability, performance and availability. The conclusions of the study show that the SEMHTA is the best approach in </w:t>
+      </w:r>
+      <w:r>
+        <w:rPr>
+          <w:rFonts w:ascii="Times New Roman" w:hAnsi="Times New Roman" w:cs="Times New Roman"/>
+          <w:sz w:val="24"/>
+          <w:szCs w:val="24"/>
+        </w:rPr>
+        <w:lastRenderedPageBreak/>
+        <w:t>developing a healthcare application compared to Waterfall, Incremental and Agile methodologies.</w:t>
+      </w:r>
+      <w:r>
+        <w:rPr>
+          <w:rFonts w:ascii="Times New Roman" w:hAnsi="Times New Roman" w:cs="Times New Roman"/>
+          <w:sz w:val="24"/>
+          <w:szCs w:val="24"/>
+        </w:rPr>
+        <w:t xml:space="preserve"> In the same time, it is stated the obtained results are valid only for the development of healthcare applications.</w:t>
+      </w:r>
+      <w:r>
+        <w:rPr>
+          <w:rFonts w:ascii="Times New Roman" w:hAnsi="Times New Roman" w:cs="Times New Roman"/>
+          <w:sz w:val="24"/>
+          <w:szCs w:val="24"/>
+        </w:rPr>
+        <w:t xml:space="preserve"> </w:t>
+      </w:r>
+    </w:p>
+    <w:p>
+      <w:pPr>
+        <w:spacing w:line="360" w:lineRule="auto"/>
+        <w:jc w:val="both"/>
+        <w:rPr>
+          <w:rFonts w:ascii="Times New Roman" w:hAnsi="Times New Roman" w:cs="Times New Roman"/>
+          <w:sz w:val="24"/>
+          <w:szCs w:val="24"/>
+        </w:rPr>
+      </w:pPr>
     </w:p>
     <w:p>
       <w:pPr>
         <w:pStyle w:val="Heading3"/>
-      </w:pPr>
-      <w:bookmarkStart w:id="10" w:name="_Toc104214479"/>
-      <w:r>
-        <w:t>Disadvantages of technology in managing the relationship</w:t>
-      </w:r>
-      <w:bookmarkEnd w:id="10"/>
-    </w:p>
-    <w:p/>
-    <w:p>
-      <w:pPr>
-        <w:pStyle w:val="Heading3"/>
-      </w:pPr>
-      <w:bookmarkStart w:id="11" w:name="_Toc104214480"/>
-      <w:r>
-        <w:t>Analyze</w:t>
-      </w:r>
-      <w:r>
-        <w:t xml:space="preserve"> of solutions for managing </w:t>
-      </w:r>
-      <w:r>
-        <w:t>patient-doctor relationship</w:t>
-      </w:r>
-      <w:bookmarkEnd w:id="11"/>
-    </w:p>
-    <w:p/>
-    <w:p/>
-    <w:p/>
-    <w:p/>
-    <w:p/>
-    <w:p/>
-    <w:p/>
-    <w:p/>
+        <w:spacing w:line="360" w:lineRule="auto"/>
+      </w:pPr>
+      <w:r>
+        <w:t>Problems with a software system for managing the patient-doctor interaction</w:t>
+      </w:r>
+    </w:p>
+    <w:p>
+      <w:pPr>
+        <w:spacing w:line="360" w:lineRule="auto"/>
+        <w:jc w:val="both"/>
+        <w:rPr>
+          <w:rFonts w:ascii="Times New Roman" w:hAnsi="Times New Roman" w:cs="Times New Roman"/>
+          <w:sz w:val="24"/>
+          <w:szCs w:val="24"/>
+        </w:rPr>
+      </w:pPr>
+    </w:p>
+    <w:p>
+      <w:pPr>
+        <w:spacing w:line="360" w:lineRule="auto"/>
+        <w:jc w:val="both"/>
+        <w:rPr>
+          <w:rFonts w:ascii="Times New Roman" w:hAnsi="Times New Roman" w:cs="Times New Roman"/>
+          <w:sz w:val="24"/>
+          <w:szCs w:val="24"/>
+        </w:rPr>
+      </w:pPr>
+      <w:r>
+        <w:rPr>
+          <w:rFonts w:ascii="Times New Roman" w:hAnsi="Times New Roman" w:cs="Times New Roman"/>
+          <w:sz w:val="24"/>
+          <w:szCs w:val="24"/>
+        </w:rPr>
+        <w:t>We must specify from the very beginning that a complete transition of the patient-doctor relationship to the online environment is not yet possible. Face-to-face communication is extremely important in establishing any kind of interpersonal relationships</w:t>
+      </w:r>
+      <w:r>
+        <w:rPr>
+          <w:rFonts w:ascii="Times New Roman" w:hAnsi="Times New Roman" w:cs="Times New Roman"/>
+          <w:sz w:val="24"/>
+          <w:szCs w:val="24"/>
+        </w:rPr>
+        <w:t>, but in this field it is all the more necessary as a consultation often involves a physical evaluation of the patient</w:t>
+      </w:r>
+      <w:r>
+        <w:rPr>
+          <w:rFonts w:ascii="Times New Roman" w:hAnsi="Times New Roman" w:cs="Times New Roman"/>
+          <w:sz w:val="24"/>
+          <w:szCs w:val="24"/>
+        </w:rPr>
+        <w:t>.</w:t>
+      </w:r>
+      <w:r>
+        <w:rPr>
+          <w:rFonts w:ascii="Times New Roman" w:hAnsi="Times New Roman" w:cs="Times New Roman"/>
+          <w:sz w:val="24"/>
+          <w:szCs w:val="24"/>
+        </w:rPr>
+        <w:t xml:space="preserve"> In the same time, the creation of an application to manage this interaction between doctors and patients is clearly justified, as we could see in the previous subsection. </w:t>
+      </w:r>
+    </w:p>
+    <w:p>
+      <w:pPr>
+        <w:spacing w:line="360" w:lineRule="auto"/>
+        <w:jc w:val="both"/>
+        <w:rPr>
+          <w:rFonts w:ascii="Times New Roman" w:hAnsi="Times New Roman" w:cs="Times New Roman"/>
+          <w:sz w:val="24"/>
+          <w:szCs w:val="24"/>
+        </w:rPr>
+      </w:pPr>
+      <w:r>
+        <w:rPr>
+          <w:rFonts w:ascii="Times New Roman" w:hAnsi="Times New Roman" w:cs="Times New Roman"/>
+          <w:sz w:val="24"/>
+          <w:szCs w:val="24"/>
+        </w:rPr>
+        <w:t>As in any application, a major issue when developing a software system for managing patient-doctor relationship is the performance. T</w:t>
+      </w:r>
+      <w:r>
+        <w:rPr>
+          <w:rFonts w:ascii="Times New Roman" w:hAnsi="Times New Roman" w:cs="Times New Roman"/>
+          <w:sz w:val="24"/>
+          <w:szCs w:val="24"/>
+        </w:rPr>
+        <w:t>his aspect can be seen from multiple perspectives, one being the performance related to the data accuracy and the data availability. Another problem is represented by the performance from the patient’s view who wants a decrease in waiting time and privacy. Last but not least, there are issues from the perspective of the medical stuff like the performance of the communication between doctors and patients and the integrity of the system.</w:t>
+      </w:r>
+    </w:p>
+    <w:p>
+      <w:pPr>
+        <w:spacing w:line="360" w:lineRule="auto"/>
+        <w:jc w:val="both"/>
+        <w:rPr>
+          <w:rFonts w:ascii="Times New Roman" w:hAnsi="Times New Roman" w:cs="Times New Roman"/>
+          <w:sz w:val="24"/>
+          <w:szCs w:val="24"/>
+        </w:rPr>
+      </w:pPr>
+      <w:r>
+        <w:rPr>
+          <w:rFonts w:ascii="Times New Roman" w:hAnsi="Times New Roman" w:cs="Times New Roman"/>
+          <w:sz w:val="24"/>
+          <w:szCs w:val="24"/>
+        </w:rPr>
+        <w:t xml:space="preserve">Reliability is also a problem, but it is not entirely specific to the type of application we want to make, being more of a problem related to the software development itself. </w:t>
+      </w:r>
+      <w:r>
+        <w:rPr>
+          <w:rFonts w:ascii="Times New Roman" w:hAnsi="Times New Roman" w:cs="Times New Roman"/>
+          <w:sz w:val="24"/>
+          <w:szCs w:val="24"/>
+        </w:rPr>
+        <w:t>On the other hand, the availability represent a critical problem when development a software for managing the patient-doctor relationship. Availability is defined as being the percentage of time when the system is up and running [13]. It represents such an important issue for an application of this type because of the nature of its purpose: there can be cases when patients really need help and there is no time to waste.</w:t>
+      </w:r>
+    </w:p>
+    <w:p>
+      <w:pPr>
+        <w:spacing w:line="360" w:lineRule="auto"/>
+        <w:jc w:val="both"/>
+        <w:rPr>
+          <w:rFonts w:ascii="Times New Roman" w:hAnsi="Times New Roman" w:cs="Times New Roman"/>
+          <w:sz w:val="24"/>
+          <w:szCs w:val="24"/>
+        </w:rPr>
+      </w:pPr>
+      <w:r>
+        <w:rPr>
+          <w:rFonts w:ascii="Times New Roman" w:hAnsi="Times New Roman" w:cs="Times New Roman"/>
+          <w:sz w:val="24"/>
+          <w:szCs w:val="24"/>
+        </w:rPr>
+        <w:t>An issue that has been debated countless times regarding the development of a medical application is its security.</w:t>
+      </w:r>
+      <w:r>
+        <w:rPr>
+          <w:rFonts w:ascii="Times New Roman" w:hAnsi="Times New Roman" w:cs="Times New Roman"/>
+          <w:sz w:val="24"/>
+          <w:szCs w:val="24"/>
+        </w:rPr>
+        <w:t xml:space="preserve"> It is normal to be an important issue as personal data of the patient are </w:t>
+      </w:r>
+      <w:r>
+        <w:rPr>
+          <w:rFonts w:ascii="Times New Roman" w:hAnsi="Times New Roman" w:cs="Times New Roman"/>
+          <w:sz w:val="24"/>
+          <w:szCs w:val="24"/>
+        </w:rPr>
+        <w:lastRenderedPageBreak/>
+        <w:t>present and must be protected.</w:t>
+      </w:r>
+      <w:r>
+        <w:rPr>
+          <w:rFonts w:ascii="Times New Roman" w:hAnsi="Times New Roman" w:cs="Times New Roman"/>
+          <w:sz w:val="24"/>
+          <w:szCs w:val="24"/>
+        </w:rPr>
+        <w:t xml:space="preserve"> In the research paper [12]</w:t>
+      </w:r>
+      <w:r>
+        <w:rPr>
+          <w:rFonts w:ascii="Times New Roman" w:hAnsi="Times New Roman" w:cs="Times New Roman"/>
+          <w:sz w:val="24"/>
+          <w:szCs w:val="24"/>
+        </w:rPr>
+        <w:t xml:space="preserve">, there are presented some security problems and how they can be solved. </w:t>
+      </w:r>
+      <w:r>
+        <w:rPr>
+          <w:rFonts w:ascii="Times New Roman" w:hAnsi="Times New Roman" w:cs="Times New Roman"/>
+          <w:sz w:val="24"/>
+          <w:szCs w:val="24"/>
+        </w:rPr>
+        <w:t xml:space="preserve">One of them is the unauthorized access to patient’s electronic records. When roles and privileges are not properly defined among users of the e-health database, it means anyone can access information and carry out any type of actions even if it’s a malicious action; this is a security threat to the e-health system [12]. A solution for this issue is represented by using the </w:t>
+      </w:r>
+      <w:proofErr w:type="spellStart"/>
+      <w:r>
+        <w:rPr>
+          <w:rFonts w:ascii="Times New Roman" w:hAnsi="Times New Roman" w:cs="Times New Roman"/>
+          <w:sz w:val="24"/>
+          <w:szCs w:val="24"/>
+        </w:rPr>
+        <w:t>Nu.Sa</w:t>
+      </w:r>
+      <w:proofErr w:type="spellEnd"/>
+      <w:r>
+        <w:rPr>
+          <w:rFonts w:ascii="Times New Roman" w:hAnsi="Times New Roman" w:cs="Times New Roman"/>
+          <w:sz w:val="24"/>
+          <w:szCs w:val="24"/>
+        </w:rPr>
+        <w:t xml:space="preserve"> (</w:t>
+      </w:r>
+      <w:proofErr w:type="spellStart"/>
+      <w:r>
+        <w:rPr>
+          <w:rFonts w:ascii="Times New Roman" w:hAnsi="Times New Roman" w:cs="Times New Roman"/>
+          <w:sz w:val="24"/>
+          <w:szCs w:val="24"/>
+        </w:rPr>
+        <w:t>Nuvola</w:t>
+      </w:r>
+      <w:proofErr w:type="spellEnd"/>
+      <w:r>
+        <w:rPr>
+          <w:rFonts w:ascii="Times New Roman" w:hAnsi="Times New Roman" w:cs="Times New Roman"/>
+          <w:sz w:val="24"/>
+          <w:szCs w:val="24"/>
+        </w:rPr>
+        <w:t xml:space="preserve"> Sanitaria) framework</w:t>
+      </w:r>
+      <w:r>
+        <w:rPr>
+          <w:rFonts w:ascii="Times New Roman" w:hAnsi="Times New Roman" w:cs="Times New Roman"/>
+          <w:sz w:val="24"/>
+          <w:szCs w:val="24"/>
+        </w:rPr>
+        <w:t>, which is based on collecting the data as electronic health records (EHR) from patients and combining them into a cloud system architecture. This architecture provides privacy and security though data encryption algorithms [12].</w:t>
+      </w:r>
+    </w:p>
+    <w:p>
+      <w:pPr>
+        <w:spacing w:line="360" w:lineRule="auto"/>
+        <w:jc w:val="both"/>
+        <w:rPr>
+          <w:rFonts w:ascii="Times New Roman" w:hAnsi="Times New Roman" w:cs="Times New Roman"/>
+          <w:sz w:val="24"/>
+          <w:szCs w:val="24"/>
+        </w:rPr>
+      </w:pPr>
+      <w:r>
+        <w:rPr>
+          <w:rFonts w:ascii="Times New Roman" w:hAnsi="Times New Roman" w:cs="Times New Roman"/>
+          <w:sz w:val="24"/>
+          <w:szCs w:val="24"/>
+        </w:rPr>
+        <w:t xml:space="preserve">Another security </w:t>
+      </w:r>
+      <w:r>
+        <w:rPr>
+          <w:rFonts w:ascii="Times New Roman" w:hAnsi="Times New Roman" w:cs="Times New Roman"/>
+          <w:sz w:val="24"/>
+          <w:szCs w:val="24"/>
+        </w:rPr>
+        <w:t>concern</w:t>
+      </w:r>
+      <w:r>
+        <w:rPr>
+          <w:rFonts w:ascii="Times New Roman" w:hAnsi="Times New Roman" w:cs="Times New Roman"/>
+          <w:sz w:val="24"/>
+          <w:szCs w:val="24"/>
+        </w:rPr>
+        <w:t xml:space="preserve"> is represented by </w:t>
+      </w:r>
+      <w:r>
+        <w:rPr>
+          <w:rFonts w:ascii="Times New Roman" w:hAnsi="Times New Roman" w:cs="Times New Roman"/>
+          <w:sz w:val="24"/>
+          <w:szCs w:val="24"/>
+        </w:rPr>
+        <w:t xml:space="preserve">tracking of users activities. Let’s imagine the case when someone can see a patient’s oxygen saturation and heart rate data. Having this information, it is an easy task to deduce how regularly that patient is doing physical activity. </w:t>
+      </w:r>
+      <w:r>
+        <w:rPr>
+          <w:rFonts w:ascii="Times New Roman" w:hAnsi="Times New Roman" w:cs="Times New Roman"/>
+          <w:sz w:val="24"/>
+          <w:szCs w:val="24"/>
+        </w:rPr>
+        <w:t>With this kind of information, access to insurance benefits could be restricted by insurance companies for users with delicate life styles by taking undue advantage of the information and by so doing, compromising the user's right of privacy</w:t>
+      </w:r>
+      <w:r>
+        <w:rPr>
+          <w:rFonts w:ascii="Times New Roman" w:hAnsi="Times New Roman" w:cs="Times New Roman"/>
+          <w:sz w:val="24"/>
+          <w:szCs w:val="24"/>
+        </w:rPr>
+        <w:t xml:space="preserve"> [12]</w:t>
+      </w:r>
+      <w:r>
+        <w:rPr>
+          <w:rFonts w:ascii="Times New Roman" w:hAnsi="Times New Roman" w:cs="Times New Roman"/>
+          <w:sz w:val="24"/>
+          <w:szCs w:val="24"/>
+        </w:rPr>
+        <w:t>.</w:t>
+      </w:r>
+      <w:r>
+        <w:rPr>
+          <w:rFonts w:ascii="Times New Roman" w:hAnsi="Times New Roman" w:cs="Times New Roman"/>
+          <w:sz w:val="24"/>
+          <w:szCs w:val="24"/>
+        </w:rPr>
+        <w:t xml:space="preserve"> A solution to this problem is that the database administrators should establish the exact privileges </w:t>
+      </w:r>
+      <w:r>
+        <w:rPr>
+          <w:rFonts w:ascii="Times New Roman" w:hAnsi="Times New Roman" w:cs="Times New Roman"/>
+          <w:sz w:val="24"/>
+          <w:szCs w:val="24"/>
+        </w:rPr>
+        <w:t>in the application with the aim to restrict the access to sensitive information.</w:t>
+      </w:r>
+    </w:p>
+    <w:p>
+      <w:pPr>
+        <w:spacing w:line="360" w:lineRule="auto"/>
+        <w:jc w:val="both"/>
+        <w:rPr>
+          <w:rFonts w:ascii="Times New Roman" w:hAnsi="Times New Roman" w:cs="Times New Roman"/>
+          <w:sz w:val="24"/>
+          <w:szCs w:val="24"/>
+        </w:rPr>
+      </w:pPr>
+    </w:p>
+    <w:p>
+      <w:pPr>
+        <w:spacing w:line="360" w:lineRule="auto"/>
+        <w:jc w:val="both"/>
+        <w:rPr>
+          <w:rFonts w:ascii="Times New Roman" w:hAnsi="Times New Roman" w:cs="Times New Roman"/>
+          <w:sz w:val="24"/>
+          <w:szCs w:val="24"/>
+        </w:rPr>
+      </w:pPr>
+    </w:p>
+    <w:p>
+      <w:pPr>
+        <w:spacing w:line="360" w:lineRule="auto"/>
+        <w:jc w:val="both"/>
+        <w:rPr>
+          <w:rFonts w:ascii="Times New Roman" w:hAnsi="Times New Roman" w:cs="Times New Roman"/>
+          <w:sz w:val="24"/>
+          <w:szCs w:val="24"/>
+        </w:rPr>
+      </w:pPr>
+    </w:p>
+    <w:p>
+      <w:pPr>
+        <w:spacing w:line="360" w:lineRule="auto"/>
+        <w:jc w:val="both"/>
+        <w:rPr>
+          <w:rFonts w:ascii="Times New Roman" w:hAnsi="Times New Roman" w:cs="Times New Roman"/>
+          <w:sz w:val="24"/>
+          <w:szCs w:val="24"/>
+        </w:rPr>
+      </w:pPr>
+    </w:p>
+    <w:p>
+      <w:pPr>
+        <w:spacing w:line="360" w:lineRule="auto"/>
+        <w:jc w:val="both"/>
+        <w:rPr>
+          <w:rFonts w:ascii="Times New Roman" w:hAnsi="Times New Roman" w:cs="Times New Roman"/>
+          <w:sz w:val="24"/>
+          <w:szCs w:val="24"/>
+        </w:rPr>
+      </w:pPr>
+    </w:p>
+    <w:p>
+      <w:pPr>
+        <w:spacing w:line="360" w:lineRule="auto"/>
+        <w:jc w:val="both"/>
+        <w:rPr>
+          <w:rFonts w:ascii="Times New Roman" w:hAnsi="Times New Roman" w:cs="Times New Roman"/>
+          <w:sz w:val="24"/>
+          <w:szCs w:val="24"/>
+        </w:rPr>
+      </w:pPr>
+    </w:p>
+    <w:p>
+      <w:pPr>
+        <w:spacing w:line="360" w:lineRule="auto"/>
+        <w:jc w:val="both"/>
+        <w:rPr>
+          <w:rFonts w:ascii="Times New Roman" w:hAnsi="Times New Roman" w:cs="Times New Roman"/>
+          <w:sz w:val="24"/>
+          <w:szCs w:val="24"/>
+        </w:rPr>
+      </w:pPr>
+    </w:p>
+    <w:p>
+      <w:pPr>
+        <w:spacing w:line="360" w:lineRule="auto"/>
+        <w:jc w:val="both"/>
+        <w:rPr>
+          <w:rFonts w:ascii="Times New Roman" w:hAnsi="Times New Roman" w:cs="Times New Roman"/>
+          <w:sz w:val="24"/>
+          <w:szCs w:val="24"/>
+        </w:rPr>
+      </w:pPr>
+    </w:p>
+    <w:p>
+      <w:pPr>
+        <w:spacing w:line="360" w:lineRule="auto"/>
+        <w:jc w:val="both"/>
+        <w:rPr>
+          <w:rFonts w:ascii="Times New Roman" w:hAnsi="Times New Roman" w:cs="Times New Roman"/>
+          <w:sz w:val="24"/>
+          <w:szCs w:val="24"/>
+        </w:rPr>
+      </w:pPr>
+    </w:p>
     <w:p>
       <w:pPr>
         <w:pStyle w:val="Heading2"/>
         <w:spacing w:line="360" w:lineRule="auto"/>
       </w:pPr>
-      <w:bookmarkStart w:id="12" w:name="_Toc104214481"/>
+      <w:bookmarkStart w:id="9" w:name="_Toc104214481"/>
       <w:r>
         <w:lastRenderedPageBreak/>
         <w:t>Web applications</w:t>
       </w:r>
-      <w:bookmarkEnd w:id="12"/>
+      <w:bookmarkEnd w:id="9"/>
     </w:p>
     <w:p>
       <w:pPr>
@@ -5365,11 +6219,11 @@
         <w:pStyle w:val="Heading3"/>
         <w:spacing w:line="360" w:lineRule="auto"/>
       </w:pPr>
-      <w:bookmarkStart w:id="13" w:name="_Toc104214482"/>
+      <w:bookmarkStart w:id="10" w:name="_Toc104214482"/>
       <w:r>
         <w:t>Brief history</w:t>
       </w:r>
-      <w:bookmarkEnd w:id="13"/>
+      <w:bookmarkEnd w:id="10"/>
     </w:p>
     <w:p>
       <w:pPr>
@@ -5674,11 +6528,11 @@
         <w:pStyle w:val="Heading3"/>
         <w:spacing w:line="360" w:lineRule="auto"/>
       </w:pPr>
-      <w:bookmarkStart w:id="14" w:name="_Toc104214483"/>
+      <w:bookmarkStart w:id="11" w:name="_Toc104214483"/>
       <w:r>
         <w:t>Structure</w:t>
       </w:r>
-      <w:bookmarkEnd w:id="14"/>
+      <w:bookmarkEnd w:id="11"/>
     </w:p>
     <w:p/>
     <w:p>
@@ -5867,7 +6721,7 @@
           <w:noProof/>
         </w:rPr>
         <w:drawing>
-          <wp:inline distT="0" distB="0" distL="0" distR="0" wp14:anchorId="38B4DB00" wp14:editId="0D42695E">
+          <wp:inline distT="0" distB="0" distL="0" distR="0" wp14:anchorId="3287A128" wp14:editId="183E517A">
             <wp:extent cx="5454650" cy="2391490"/>
             <wp:effectExtent l="0" t="0" r="0" b="8890"/>
             <wp:docPr id="5" name="Picture 5" descr="A modern web application structure and its components. | Download  Scientific Diagram"/>
@@ -5884,7 +6738,7 @@
                     </pic:cNvPicPr>
                   </pic:nvPicPr>
                   <pic:blipFill>
-                    <a:blip r:embed="rId12">
+                    <a:blip r:embed="rId13">
                       <a:extLst>
                         <a:ext uri="{28A0092B-C50C-407E-A947-70E740481C1C}">
                           <a14:useLocalDpi xmlns:a14="http://schemas.microsoft.com/office/drawing/2010/main" val="0"/>
@@ -6038,7 +6892,7 @@
           <w:sz w:val="24"/>
           <w:szCs w:val="24"/>
         </w:rPr>
-        <w:t>4</w:t>
+        <w:t>5</w:t>
       </w:r>
       <w:r>
         <w:rPr>
@@ -6103,7 +6957,15 @@
           <w:sz w:val="24"/>
           <w:szCs w:val="24"/>
         </w:rPr>
-        <w:t xml:space="preserve">As it can be seen in figure 2-4, there are two sides of a </w:t>
+        <w:t>As it can be seen in figure 2-5</w:t>
+      </w:r>
+      <w:r>
+        <w:rPr>
+          <w:rFonts w:ascii="Times New Roman" w:hAnsi="Times New Roman" w:cs="Times New Roman"/>
+          <w:sz w:val="24"/>
+          <w:szCs w:val="24"/>
+        </w:rPr>
+        <w:t xml:space="preserve">, there are two sides of a </w:t>
       </w:r>
       <w:r>
         <w:rPr>
@@ -6434,13 +7296,23 @@
         </w:rPr>
         <w:t xml:space="preserve">data. Examples include cookies, </w:t>
       </w:r>
-      <w:r>
-        <w:rPr>
-          <w:rFonts w:ascii="Times New Roman" w:hAnsi="Times New Roman" w:cs="Times New Roman"/>
-          <w:sz w:val="24"/>
-          <w:szCs w:val="24"/>
-        </w:rPr>
-        <w:t>localStorage,</w:t>
+      <w:proofErr w:type="spellStart"/>
+      <w:r>
+        <w:rPr>
+          <w:rFonts w:ascii="Times New Roman" w:hAnsi="Times New Roman" w:cs="Times New Roman"/>
+          <w:sz w:val="24"/>
+          <w:szCs w:val="24"/>
+        </w:rPr>
+        <w:t>localStorage</w:t>
+      </w:r>
+      <w:proofErr w:type="spellEnd"/>
+      <w:r>
+        <w:rPr>
+          <w:rFonts w:ascii="Times New Roman" w:hAnsi="Times New Roman" w:cs="Times New Roman"/>
+          <w:sz w:val="24"/>
+          <w:szCs w:val="24"/>
+        </w:rPr>
+        <w:t>,</w:t>
       </w:r>
       <w:r>
         <w:rPr>
@@ -6982,14 +7854,14 @@
         <w:pStyle w:val="Heading3"/>
         <w:spacing w:line="360" w:lineRule="auto"/>
       </w:pPr>
-      <w:bookmarkStart w:id="15" w:name="_Toc104214484"/>
+      <w:bookmarkStart w:id="12" w:name="_Toc104214484"/>
       <w:r>
         <w:t xml:space="preserve">Web </w:t>
       </w:r>
       <w:r>
         <w:t>Sockets</w:t>
       </w:r>
-      <w:bookmarkEnd w:id="15"/>
+      <w:bookmarkEnd w:id="12"/>
     </w:p>
     <w:p>
       <w:pPr>
@@ -7088,7 +7960,7 @@
           <w:noProof/>
         </w:rPr>
         <w:drawing>
-          <wp:inline distT="0" distB="0" distL="0" distR="0" wp14:anchorId="4436587C" wp14:editId="73ED5C18">
+          <wp:inline distT="0" distB="0" distL="0" distR="0" wp14:anchorId="29C875E9" wp14:editId="0A603527">
             <wp:extent cx="3028950" cy="2587759"/>
             <wp:effectExtent l="0" t="0" r="0" b="3175"/>
             <wp:docPr id="4" name="Picture 4" descr="Websocket over TCP sequence diagram | Download Scientific Diagram"/>
@@ -7105,7 +7977,7 @@
                     </pic:cNvPicPr>
                   </pic:nvPicPr>
                   <pic:blipFill>
-                    <a:blip r:embed="rId13">
+                    <a:blip r:embed="rId14">
                       <a:extLst>
                         <a:ext uri="{28A0092B-C50C-407E-A947-70E740481C1C}">
                           <a14:useLocalDpi xmlns:a14="http://schemas.microsoft.com/office/drawing/2010/main" val="0"/>
@@ -7259,7 +8131,7 @@
           <w:sz w:val="24"/>
           <w:szCs w:val="24"/>
         </w:rPr>
-        <w:t>5</w:t>
+        <w:t>6</w:t>
       </w:r>
       <w:r>
         <w:rPr>
@@ -7319,15 +8191,113 @@
           <w:szCs w:val="24"/>
         </w:rPr>
         <w:lastRenderedPageBreak/>
-        <w:t>In figure 2-5, it is presented a sequence diagram of a Websocket session, but in the same time, we can notice that the communication via Websocket protocol is a TCP-based one. This implies that before the client and the server can exchange data through Websocket protocol, it is mandatory to establish a TCP connection between the two sides.</w:t>
-      </w:r>
-      <w:r>
-        <w:rPr>
-          <w:rFonts w:ascii="Times New Roman" w:hAnsi="Times New Roman" w:cs="Times New Roman"/>
-          <w:sz w:val="24"/>
-          <w:szCs w:val="24"/>
-        </w:rPr>
-        <w:t xml:space="preserve"> As it can be seen in the picture, there are needed three messages to be exchanged in order to start the connection (this phase is also called handshaking). For the purpose of having a Websocket-based communication, the two sides have to create a Websocket session because at this point, after the handshaking, there is possible only to transfer data through the plain TCP protocol.</w:t>
+        <w:t>In figure 2-6</w:t>
+      </w:r>
+      <w:r>
+        <w:rPr>
+          <w:rFonts w:ascii="Times New Roman" w:hAnsi="Times New Roman" w:cs="Times New Roman"/>
+          <w:sz w:val="24"/>
+          <w:szCs w:val="24"/>
+        </w:rPr>
+        <w:t xml:space="preserve">, it is presented a sequence diagram of a </w:t>
+      </w:r>
+      <w:proofErr w:type="spellStart"/>
+      <w:r>
+        <w:rPr>
+          <w:rFonts w:ascii="Times New Roman" w:hAnsi="Times New Roman" w:cs="Times New Roman"/>
+          <w:sz w:val="24"/>
+          <w:szCs w:val="24"/>
+        </w:rPr>
+        <w:t>Websocket</w:t>
+      </w:r>
+      <w:proofErr w:type="spellEnd"/>
+      <w:r>
+        <w:rPr>
+          <w:rFonts w:ascii="Times New Roman" w:hAnsi="Times New Roman" w:cs="Times New Roman"/>
+          <w:sz w:val="24"/>
+          <w:szCs w:val="24"/>
+        </w:rPr>
+        <w:t xml:space="preserve"> session, but in the same time, we can notice that the communication via </w:t>
+      </w:r>
+      <w:proofErr w:type="spellStart"/>
+      <w:r>
+        <w:rPr>
+          <w:rFonts w:ascii="Times New Roman" w:hAnsi="Times New Roman" w:cs="Times New Roman"/>
+          <w:sz w:val="24"/>
+          <w:szCs w:val="24"/>
+        </w:rPr>
+        <w:t>Websocket</w:t>
+      </w:r>
+      <w:proofErr w:type="spellEnd"/>
+      <w:r>
+        <w:rPr>
+          <w:rFonts w:ascii="Times New Roman" w:hAnsi="Times New Roman" w:cs="Times New Roman"/>
+          <w:sz w:val="24"/>
+          <w:szCs w:val="24"/>
+        </w:rPr>
+        <w:t xml:space="preserve"> protocol is a TCP-based one. This implies that before the client and the server can exchange data through </w:t>
+      </w:r>
+      <w:proofErr w:type="spellStart"/>
+      <w:r>
+        <w:rPr>
+          <w:rFonts w:ascii="Times New Roman" w:hAnsi="Times New Roman" w:cs="Times New Roman"/>
+          <w:sz w:val="24"/>
+          <w:szCs w:val="24"/>
+        </w:rPr>
+        <w:t>Websocket</w:t>
+      </w:r>
+      <w:proofErr w:type="spellEnd"/>
+      <w:r>
+        <w:rPr>
+          <w:rFonts w:ascii="Times New Roman" w:hAnsi="Times New Roman" w:cs="Times New Roman"/>
+          <w:sz w:val="24"/>
+          <w:szCs w:val="24"/>
+        </w:rPr>
+        <w:t xml:space="preserve"> protocol, it is mandatory to establish a TCP connection between the two sides.</w:t>
+      </w:r>
+      <w:r>
+        <w:rPr>
+          <w:rFonts w:ascii="Times New Roman" w:hAnsi="Times New Roman" w:cs="Times New Roman"/>
+          <w:sz w:val="24"/>
+          <w:szCs w:val="24"/>
+        </w:rPr>
+        <w:t xml:space="preserve"> As it can be seen in the picture, there are needed three messages to be exchanged in order to start the connection (this phase is also called handshaking). For the purpose of having a </w:t>
+      </w:r>
+      <w:proofErr w:type="spellStart"/>
+      <w:r>
+        <w:rPr>
+          <w:rFonts w:ascii="Times New Roman" w:hAnsi="Times New Roman" w:cs="Times New Roman"/>
+          <w:sz w:val="24"/>
+          <w:szCs w:val="24"/>
+        </w:rPr>
+        <w:t>Websocket</w:t>
+      </w:r>
+      <w:proofErr w:type="spellEnd"/>
+      <w:r>
+        <w:rPr>
+          <w:rFonts w:ascii="Times New Roman" w:hAnsi="Times New Roman" w:cs="Times New Roman"/>
+          <w:sz w:val="24"/>
+          <w:szCs w:val="24"/>
+        </w:rPr>
+        <w:t xml:space="preserve">-based communication, the two sides have to create a </w:t>
+      </w:r>
+      <w:proofErr w:type="spellStart"/>
+      <w:r>
+        <w:rPr>
+          <w:rFonts w:ascii="Times New Roman" w:hAnsi="Times New Roman" w:cs="Times New Roman"/>
+          <w:sz w:val="24"/>
+          <w:szCs w:val="24"/>
+        </w:rPr>
+        <w:t>Websocket</w:t>
+      </w:r>
+      <w:proofErr w:type="spellEnd"/>
+      <w:r>
+        <w:rPr>
+          <w:rFonts w:ascii="Times New Roman" w:hAnsi="Times New Roman" w:cs="Times New Roman"/>
+          <w:sz w:val="24"/>
+          <w:szCs w:val="24"/>
+        </w:rPr>
+        <w:t xml:space="preserve"> session because at this point, after the handshaking, there is possible only to transfer data through the plain TCP protocol.</w:t>
       </w:r>
     </w:p>
     <w:p>
@@ -7346,7 +8316,43 @@
           <w:sz w:val="24"/>
           <w:szCs w:val="24"/>
         </w:rPr>
-        <w:t>To establish a session, client sends a Websocket Upgrade Request to the server, upon which server responds with a Websocket Upgrade Response</w:t>
+        <w:t xml:space="preserve">To establish a session, client sends a </w:t>
+      </w:r>
+      <w:proofErr w:type="spellStart"/>
+      <w:r>
+        <w:rPr>
+          <w:rFonts w:ascii="Times New Roman" w:hAnsi="Times New Roman" w:cs="Times New Roman"/>
+          <w:sz w:val="24"/>
+          <w:szCs w:val="24"/>
+        </w:rPr>
+        <w:t>Websocket</w:t>
+      </w:r>
+      <w:proofErr w:type="spellEnd"/>
+      <w:r>
+        <w:rPr>
+          <w:rFonts w:ascii="Times New Roman" w:hAnsi="Times New Roman" w:cs="Times New Roman"/>
+          <w:sz w:val="24"/>
+          <w:szCs w:val="24"/>
+        </w:rPr>
+        <w:t xml:space="preserve"> Upgrade Request to the server, upon which server responds with a </w:t>
+      </w:r>
+      <w:proofErr w:type="spellStart"/>
+      <w:r>
+        <w:rPr>
+          <w:rFonts w:ascii="Times New Roman" w:hAnsi="Times New Roman" w:cs="Times New Roman"/>
+          <w:sz w:val="24"/>
+          <w:szCs w:val="24"/>
+        </w:rPr>
+        <w:t>Websocket</w:t>
+      </w:r>
+      <w:proofErr w:type="spellEnd"/>
+      <w:r>
+        <w:rPr>
+          <w:rFonts w:ascii="Times New Roman" w:hAnsi="Times New Roman" w:cs="Times New Roman"/>
+          <w:sz w:val="24"/>
+          <w:szCs w:val="24"/>
+        </w:rPr>
+        <w:t xml:space="preserve"> Upgrade Response</w:t>
       </w:r>
       <w:r>
         <w:rPr>
@@ -7378,15 +8384,69 @@
           <w:sz w:val="24"/>
           <w:szCs w:val="24"/>
         </w:rPr>
-        <w:t xml:space="preserve">The Websocket Upgrade Request is nothing more than a HTTP GET Request with the headers Connection and Upgrade telling the server the client’s intention of using the Websocket protocol over the regular HTTP for the rest of the session. </w:t>
-      </w:r>
-      <w:r>
-        <w:rPr>
-          <w:rFonts w:ascii="Times New Roman" w:hAnsi="Times New Roman" w:cs="Times New Roman"/>
-          <w:sz w:val="24"/>
-          <w:szCs w:val="24"/>
-        </w:rPr>
-        <w:t>If there is possible to establish the Websocket session, the server sends back a HTTP response, with the status code having the value 101 Switching Protocols.</w:t>
+        <w:t xml:space="preserve">The </w:t>
+      </w:r>
+      <w:proofErr w:type="spellStart"/>
+      <w:r>
+        <w:rPr>
+          <w:rFonts w:ascii="Times New Roman" w:hAnsi="Times New Roman" w:cs="Times New Roman"/>
+          <w:sz w:val="24"/>
+          <w:szCs w:val="24"/>
+        </w:rPr>
+        <w:t>Websocket</w:t>
+      </w:r>
+      <w:proofErr w:type="spellEnd"/>
+      <w:r>
+        <w:rPr>
+          <w:rFonts w:ascii="Times New Roman" w:hAnsi="Times New Roman" w:cs="Times New Roman"/>
+          <w:sz w:val="24"/>
+          <w:szCs w:val="24"/>
+        </w:rPr>
+        <w:t xml:space="preserve"> Upgrade Request is nothing more than a HTTP GET Request with the headers Connection and Upgrade telling the server the client’s intention of using the </w:t>
+      </w:r>
+      <w:proofErr w:type="spellStart"/>
+      <w:r>
+        <w:rPr>
+          <w:rFonts w:ascii="Times New Roman" w:hAnsi="Times New Roman" w:cs="Times New Roman"/>
+          <w:sz w:val="24"/>
+          <w:szCs w:val="24"/>
+        </w:rPr>
+        <w:t>Websocket</w:t>
+      </w:r>
+      <w:proofErr w:type="spellEnd"/>
+      <w:r>
+        <w:rPr>
+          <w:rFonts w:ascii="Times New Roman" w:hAnsi="Times New Roman" w:cs="Times New Roman"/>
+          <w:sz w:val="24"/>
+          <w:szCs w:val="24"/>
+        </w:rPr>
+        <w:t xml:space="preserve"> protocol over the regular HTTP for the rest of the session. </w:t>
+      </w:r>
+      <w:r>
+        <w:rPr>
+          <w:rFonts w:ascii="Times New Roman" w:hAnsi="Times New Roman" w:cs="Times New Roman"/>
+          <w:sz w:val="24"/>
+          <w:szCs w:val="24"/>
+        </w:rPr>
+        <w:t xml:space="preserve">If there is possible to establish the </w:t>
+      </w:r>
+      <w:proofErr w:type="spellStart"/>
+      <w:r>
+        <w:rPr>
+          <w:rFonts w:ascii="Times New Roman" w:hAnsi="Times New Roman" w:cs="Times New Roman"/>
+          <w:sz w:val="24"/>
+          <w:szCs w:val="24"/>
+        </w:rPr>
+        <w:t>Websocket</w:t>
+      </w:r>
+      <w:proofErr w:type="spellEnd"/>
+      <w:r>
+        <w:rPr>
+          <w:rFonts w:ascii="Times New Roman" w:hAnsi="Times New Roman" w:cs="Times New Roman"/>
+          <w:sz w:val="24"/>
+          <w:szCs w:val="24"/>
+        </w:rPr>
+        <w:t xml:space="preserve"> session, the server sends back a HTTP response, with the status code having the value 101 Switching Protocols.</w:t>
       </w:r>
     </w:p>
     <w:p>
@@ -7413,7 +8473,61 @@
           <w:sz w:val="24"/>
           <w:szCs w:val="24"/>
         </w:rPr>
-        <w:t>there was conducted a test to realize a comparison between Websocket and HTTP requests performances in asynchronous transmission. The results of the test are impressive, showing that the Websocket communication was ten times efficient than the HTTP one. In the same time, other studies emphasize that Websocket’s performance is much better</w:t>
+        <w:t xml:space="preserve">there was conducted a test to realize a comparison between </w:t>
+      </w:r>
+      <w:proofErr w:type="spellStart"/>
+      <w:r>
+        <w:rPr>
+          <w:rFonts w:ascii="Times New Roman" w:hAnsi="Times New Roman" w:cs="Times New Roman"/>
+          <w:sz w:val="24"/>
+          <w:szCs w:val="24"/>
+        </w:rPr>
+        <w:t>Websocket</w:t>
+      </w:r>
+      <w:proofErr w:type="spellEnd"/>
+      <w:r>
+        <w:rPr>
+          <w:rFonts w:ascii="Times New Roman" w:hAnsi="Times New Roman" w:cs="Times New Roman"/>
+          <w:sz w:val="24"/>
+          <w:szCs w:val="24"/>
+        </w:rPr>
+        <w:t xml:space="preserve"> and HTTP requests performances in asynchronous transmission. The results of the test are impressive, showing that the </w:t>
+      </w:r>
+      <w:proofErr w:type="spellStart"/>
+      <w:r>
+        <w:rPr>
+          <w:rFonts w:ascii="Times New Roman" w:hAnsi="Times New Roman" w:cs="Times New Roman"/>
+          <w:sz w:val="24"/>
+          <w:szCs w:val="24"/>
+        </w:rPr>
+        <w:t>Websocket</w:t>
+      </w:r>
+      <w:proofErr w:type="spellEnd"/>
+      <w:r>
+        <w:rPr>
+          <w:rFonts w:ascii="Times New Roman" w:hAnsi="Times New Roman" w:cs="Times New Roman"/>
+          <w:sz w:val="24"/>
+          <w:szCs w:val="24"/>
+        </w:rPr>
+        <w:t xml:space="preserve"> communication was ten times efficient than the HTTP one. In the same time, other studies emphasize that </w:t>
+      </w:r>
+      <w:proofErr w:type="spellStart"/>
+      <w:r>
+        <w:rPr>
+          <w:rFonts w:ascii="Times New Roman" w:hAnsi="Times New Roman" w:cs="Times New Roman"/>
+          <w:sz w:val="24"/>
+          <w:szCs w:val="24"/>
+        </w:rPr>
+        <w:t>Websocket’s</w:t>
+      </w:r>
+      <w:proofErr w:type="spellEnd"/>
+      <w:r>
+        <w:rPr>
+          <w:rFonts w:ascii="Times New Roman" w:hAnsi="Times New Roman" w:cs="Times New Roman"/>
+          <w:sz w:val="24"/>
+          <w:szCs w:val="24"/>
+        </w:rPr>
+        <w:t xml:space="preserve"> performance is much better</w:t>
       </w:r>
       <w:r>
         <w:rPr>
@@ -7434,12 +8548,12 @@
       <w:pPr>
         <w:pStyle w:val="Heading1"/>
       </w:pPr>
-      <w:bookmarkStart w:id="16" w:name="_Toc104214485"/>
+      <w:bookmarkStart w:id="13" w:name="_Toc104214485"/>
       <w:r>
         <w:lastRenderedPageBreak/>
         <w:t>Application Description</w:t>
       </w:r>
-      <w:bookmarkEnd w:id="16"/>
+      <w:bookmarkEnd w:id="13"/>
     </w:p>
     <w:p>
       <w:pPr>
@@ -7454,57 +8568,1414 @@
       <w:pPr>
         <w:pStyle w:val="Heading2"/>
       </w:pPr>
-      <w:bookmarkStart w:id="17" w:name="_Toc104214486"/>
-      <w:r>
-        <w:t>Requirements</w:t>
-      </w:r>
-      <w:r>
-        <w:t xml:space="preserve"> and specifications</w:t>
-      </w:r>
-      <w:bookmarkEnd w:id="17"/>
+      <w:r>
+        <w:t>Introduction</w:t>
+      </w:r>
+    </w:p>
+    <w:p>
+      <w:pPr>
+        <w:spacing w:line="360" w:lineRule="auto"/>
+        <w:rPr>
+          <w:rFonts w:ascii="Times New Roman" w:hAnsi="Times New Roman" w:cs="Times New Roman"/>
+          <w:sz w:val="24"/>
+          <w:szCs w:val="24"/>
+        </w:rPr>
+      </w:pPr>
+    </w:p>
+    <w:p>
+      <w:pPr>
+        <w:spacing w:line="360" w:lineRule="auto"/>
+        <w:jc w:val="both"/>
+        <w:rPr>
+          <w:rFonts w:ascii="Times New Roman" w:hAnsi="Times New Roman" w:cs="Times New Roman"/>
+          <w:sz w:val="24"/>
+          <w:szCs w:val="24"/>
+        </w:rPr>
+      </w:pPr>
+      <w:r>
+        <w:rPr>
+          <w:rFonts w:ascii="Times New Roman" w:hAnsi="Times New Roman" w:cs="Times New Roman"/>
+          <w:sz w:val="24"/>
+          <w:szCs w:val="24"/>
+        </w:rPr>
+        <w:t>This chapter focuses on our implementation of a patient-doctor relationship management application. We chose to implement it as a web application for the reasons presented in the previous chapter, such as the impressive evolution in this field in the last decades</w:t>
+      </w:r>
+      <w:r>
+        <w:rPr>
+          <w:rFonts w:ascii="Times New Roman" w:hAnsi="Times New Roman" w:cs="Times New Roman"/>
+          <w:sz w:val="24"/>
+          <w:szCs w:val="24"/>
+        </w:rPr>
+        <w:t>, but also for the ease of developing and maintaining a web software system.</w:t>
+      </w:r>
+    </w:p>
+    <w:p>
+      <w:pPr>
+        <w:spacing w:line="360" w:lineRule="auto"/>
+        <w:jc w:val="both"/>
+        <w:rPr>
+          <w:rFonts w:ascii="Times New Roman" w:hAnsi="Times New Roman" w:cs="Times New Roman"/>
+          <w:sz w:val="24"/>
+          <w:szCs w:val="24"/>
+        </w:rPr>
+      </w:pPr>
+      <w:r>
+        <w:rPr>
+          <w:rFonts w:ascii="Times New Roman" w:hAnsi="Times New Roman" w:cs="Times New Roman"/>
+          <w:sz w:val="24"/>
+          <w:szCs w:val="24"/>
+        </w:rPr>
+        <w:t>As we have stated throughout this thesis, the application developed by us is only intended to improve the patient-doctor relationship and not completely replace face-to-face interaction. To achieve this, the first problem that arises is to identify the main features that the application should have</w:t>
+      </w:r>
+      <w:r>
+        <w:rPr>
+          <w:rFonts w:ascii="Times New Roman" w:hAnsi="Times New Roman" w:cs="Times New Roman"/>
+          <w:sz w:val="24"/>
+          <w:szCs w:val="24"/>
+        </w:rPr>
+        <w:t>.</w:t>
+      </w:r>
+    </w:p>
+    <w:p>
+      <w:pPr>
+        <w:spacing w:line="360" w:lineRule="auto"/>
+        <w:jc w:val="both"/>
+        <w:rPr>
+          <w:rFonts w:ascii="Times New Roman" w:hAnsi="Times New Roman" w:cs="Times New Roman"/>
+          <w:sz w:val="24"/>
+          <w:szCs w:val="24"/>
+        </w:rPr>
+      </w:pPr>
+      <w:r>
+        <w:rPr>
+          <w:rFonts w:ascii="Times New Roman" w:hAnsi="Times New Roman" w:cs="Times New Roman"/>
+          <w:sz w:val="24"/>
+          <w:szCs w:val="24"/>
+        </w:rPr>
+        <w:t>Specific to</w:t>
+      </w:r>
+      <w:r>
+        <w:rPr>
+          <w:rFonts w:ascii="Times New Roman" w:hAnsi="Times New Roman" w:cs="Times New Roman"/>
+          <w:sz w:val="24"/>
+          <w:szCs w:val="24"/>
+        </w:rPr>
+        <w:t xml:space="preserve"> any web application</w:t>
+      </w:r>
+      <w:r>
+        <w:rPr>
+          <w:rFonts w:ascii="Times New Roman" w:hAnsi="Times New Roman" w:cs="Times New Roman"/>
+          <w:sz w:val="24"/>
+          <w:szCs w:val="24"/>
+        </w:rPr>
+        <w:t xml:space="preserve">, each user should have an account with their personal information like first name, last name, email and a password, which he or she will use to log in to the application. </w:t>
+      </w:r>
+      <w:r>
+        <w:rPr>
+          <w:rFonts w:ascii="Times New Roman" w:hAnsi="Times New Roman" w:cs="Times New Roman"/>
+          <w:sz w:val="24"/>
+          <w:szCs w:val="24"/>
+        </w:rPr>
+        <w:t xml:space="preserve">Once the user has successfully access the application, its content should be displayed according to the type of user. A chat where doctors can communicate in real-time with their patients would be primarily for our topic. In the same time, the patients should have the possibility to make an appointment and the doctors must be able to see their schedule for a certain period of time. </w:t>
+      </w:r>
+      <w:r>
+        <w:rPr>
+          <w:rFonts w:ascii="Times New Roman" w:hAnsi="Times New Roman" w:cs="Times New Roman"/>
+          <w:sz w:val="24"/>
+          <w:szCs w:val="24"/>
+        </w:rPr>
+        <w:t xml:space="preserve">It would be nice for patients to write their feelings and observations about the disease’s evolution in a special section and doctors to have access to this information. </w:t>
+      </w:r>
+    </w:p>
+    <w:p>
+      <w:pPr>
+        <w:spacing w:line="360" w:lineRule="auto"/>
+        <w:jc w:val="both"/>
+        <w:rPr>
+          <w:rFonts w:ascii="Times New Roman" w:hAnsi="Times New Roman" w:cs="Times New Roman"/>
+          <w:sz w:val="24"/>
+          <w:szCs w:val="24"/>
+        </w:rPr>
+      </w:pPr>
+      <w:r>
+        <w:rPr>
+          <w:rFonts w:ascii="Times New Roman" w:hAnsi="Times New Roman" w:cs="Times New Roman"/>
+          <w:sz w:val="24"/>
+          <w:szCs w:val="24"/>
+        </w:rPr>
+        <w:t>These are just the features that immediately came to mind when we set out to develop this application, but the truth is that there are many more than that. This is due to the fact that the problem we are trying to solve is a complex one, being extremely difficult to r</w:t>
+      </w:r>
+      <w:r>
+        <w:rPr>
+          <w:rFonts w:ascii="Times New Roman" w:hAnsi="Times New Roman" w:cs="Times New Roman"/>
+          <w:sz w:val="24"/>
+          <w:szCs w:val="24"/>
+        </w:rPr>
+        <w:t>ealize a perfect solution. That being said, in the following we will present the features that we have implemented and considered the minimum necessary in an application to manage the patient-doctor relationship.</w:t>
+      </w:r>
+    </w:p>
+    <w:p>
+      <w:pPr>
+        <w:spacing w:line="360" w:lineRule="auto"/>
+        <w:jc w:val="both"/>
+        <w:rPr>
+          <w:rFonts w:ascii="Times New Roman" w:hAnsi="Times New Roman" w:cs="Times New Roman"/>
+          <w:sz w:val="24"/>
+          <w:szCs w:val="24"/>
+        </w:rPr>
+      </w:pPr>
+    </w:p>
+    <w:p>
+      <w:pPr>
+        <w:pStyle w:val="Heading2"/>
+        <w:spacing w:line="360" w:lineRule="auto"/>
+      </w:pPr>
+      <w:r>
+        <w:lastRenderedPageBreak/>
+        <w:t>Features</w:t>
+      </w:r>
+    </w:p>
+    <w:p>
+      <w:pPr>
+        <w:spacing w:line="360" w:lineRule="auto"/>
+        <w:jc w:val="both"/>
+        <w:rPr>
+          <w:rFonts w:ascii="Times New Roman" w:hAnsi="Times New Roman" w:cs="Times New Roman"/>
+          <w:sz w:val="24"/>
+          <w:szCs w:val="24"/>
+        </w:rPr>
+      </w:pPr>
+    </w:p>
+    <w:p>
+      <w:pPr>
+        <w:spacing w:line="360" w:lineRule="auto"/>
+        <w:jc w:val="both"/>
+        <w:rPr>
+          <w:rFonts w:ascii="Times New Roman" w:hAnsi="Times New Roman" w:cs="Times New Roman"/>
+          <w:sz w:val="24"/>
+          <w:szCs w:val="24"/>
+        </w:rPr>
+      </w:pPr>
+      <w:r>
+        <w:rPr>
+          <w:rFonts w:ascii="Times New Roman" w:hAnsi="Times New Roman" w:cs="Times New Roman"/>
+          <w:sz w:val="24"/>
+          <w:szCs w:val="24"/>
+        </w:rPr>
+        <w:t xml:space="preserve">As we have already mentioned, a feature that can be found in most web applications is the creation of accounts for each user. Thus, the first time a person wants to use our application, a login screen will be displayed, as it can be seen in </w:t>
+      </w:r>
+      <w:r>
+        <w:rPr>
+          <w:rFonts w:ascii="Times New Roman" w:hAnsi="Times New Roman" w:cs="Times New Roman"/>
+          <w:sz w:val="24"/>
+          <w:szCs w:val="24"/>
+        </w:rPr>
+        <w:t>Figure 3-1. If the respective user has previously accessed the application and his or her session has not expired, then this screen will be replaced by the content of the application. We have set a session to be 24 hours, which means that if the user has not used the application for more than this period they must log in again.</w:t>
+      </w:r>
+    </w:p>
+    <w:p>
+      <w:pPr>
+        <w:keepNext/>
+        <w:spacing w:line="360" w:lineRule="auto"/>
+        <w:jc w:val="both"/>
+      </w:pPr>
+      <w:r>
+        <w:rPr>
+          <w:rFonts w:ascii="Times New Roman" w:hAnsi="Times New Roman" w:cs="Times New Roman"/>
+          <w:noProof/>
+          <w:sz w:val="24"/>
+          <w:szCs w:val="24"/>
+        </w:rPr>
+        <w:drawing>
+          <wp:inline distT="0" distB="0" distL="0" distR="0" wp14:anchorId="0D7B747E" wp14:editId="5430B773">
+            <wp:extent cx="5943600" cy="1371600"/>
+            <wp:effectExtent l="0" t="0" r="0" b="0"/>
+            <wp:docPr id="6" name="Picture 6"/>
+            <wp:cNvGraphicFramePr>
+              <a:graphicFrameLocks xmlns:a="http://schemas.openxmlformats.org/drawingml/2006/main" noChangeAspect="1"/>
+            </wp:cNvGraphicFramePr>
+            <a:graphic xmlns:a="http://schemas.openxmlformats.org/drawingml/2006/main">
+              <a:graphicData uri="http://schemas.openxmlformats.org/drawingml/2006/picture">
+                <pic:pic xmlns:pic="http://schemas.openxmlformats.org/drawingml/2006/picture">
+                  <pic:nvPicPr>
+                    <pic:cNvPr id="0" name="Picture 1"/>
+                    <pic:cNvPicPr>
+                      <a:picLocks noChangeAspect="1" noChangeArrowheads="1"/>
+                    </pic:cNvPicPr>
+                  </pic:nvPicPr>
+                  <pic:blipFill>
+                    <a:blip r:embed="rId15">
+                      <a:extLst>
+                        <a:ext uri="{28A0092B-C50C-407E-A947-70E740481C1C}">
+                          <a14:useLocalDpi xmlns:a14="http://schemas.microsoft.com/office/drawing/2010/main" val="0"/>
+                        </a:ext>
+                      </a:extLst>
+                    </a:blip>
+                    <a:srcRect/>
+                    <a:stretch>
+                      <a:fillRect/>
+                    </a:stretch>
+                  </pic:blipFill>
+                  <pic:spPr bwMode="auto">
+                    <a:xfrm>
+                      <a:off x="0" y="0"/>
+                      <a:ext cx="5943600" cy="1371600"/>
+                    </a:xfrm>
+                    <a:prstGeom prst="rect">
+                      <a:avLst/>
+                    </a:prstGeom>
+                    <a:noFill/>
+                    <a:ln>
+                      <a:noFill/>
+                    </a:ln>
+                  </pic:spPr>
+                </pic:pic>
+              </a:graphicData>
+            </a:graphic>
+          </wp:inline>
+        </w:drawing>
+      </w:r>
+    </w:p>
+    <w:p>
+      <w:pPr>
+        <w:pStyle w:val="Caption"/>
+        <w:spacing w:line="360" w:lineRule="auto"/>
+        <w:jc w:val="center"/>
+        <w:rPr>
+          <w:rFonts w:ascii="Times New Roman" w:hAnsi="Times New Roman" w:cs="Times New Roman"/>
+          <w:b w:val="0"/>
+          <w:color w:val="000000" w:themeColor="text1"/>
+          <w:sz w:val="24"/>
+          <w:szCs w:val="24"/>
+        </w:rPr>
+      </w:pPr>
+      <w:r>
+        <w:rPr>
+          <w:rFonts w:ascii="Times New Roman" w:hAnsi="Times New Roman" w:cs="Times New Roman"/>
+          <w:b w:val="0"/>
+          <w:color w:val="000000" w:themeColor="text1"/>
+          <w:sz w:val="24"/>
+          <w:szCs w:val="24"/>
+        </w:rPr>
+        <w:t xml:space="preserve">Figure </w:t>
+      </w:r>
+      <w:r>
+        <w:rPr>
+          <w:rFonts w:ascii="Times New Roman" w:hAnsi="Times New Roman" w:cs="Times New Roman"/>
+          <w:b w:val="0"/>
+          <w:color w:val="000000" w:themeColor="text1"/>
+          <w:sz w:val="24"/>
+          <w:szCs w:val="24"/>
+        </w:rPr>
+        <w:fldChar w:fldCharType="begin"/>
+      </w:r>
+      <w:r>
+        <w:rPr>
+          <w:rFonts w:ascii="Times New Roman" w:hAnsi="Times New Roman" w:cs="Times New Roman"/>
+          <w:b w:val="0"/>
+          <w:color w:val="000000" w:themeColor="text1"/>
+          <w:sz w:val="24"/>
+          <w:szCs w:val="24"/>
+        </w:rPr>
+        <w:instrText xml:space="preserve"> STYLEREF 1 \s </w:instrText>
+      </w:r>
+      <w:r>
+        <w:rPr>
+          <w:rFonts w:ascii="Times New Roman" w:hAnsi="Times New Roman" w:cs="Times New Roman"/>
+          <w:b w:val="0"/>
+          <w:color w:val="000000" w:themeColor="text1"/>
+          <w:sz w:val="24"/>
+          <w:szCs w:val="24"/>
+        </w:rPr>
+        <w:fldChar w:fldCharType="separate"/>
+      </w:r>
+      <w:r>
+        <w:rPr>
+          <w:rFonts w:ascii="Times New Roman" w:hAnsi="Times New Roman" w:cs="Times New Roman"/>
+          <w:b w:val="0"/>
+          <w:noProof/>
+          <w:color w:val="000000" w:themeColor="text1"/>
+          <w:sz w:val="24"/>
+          <w:szCs w:val="24"/>
+        </w:rPr>
+        <w:t>3</w:t>
+      </w:r>
+      <w:r>
+        <w:rPr>
+          <w:rFonts w:ascii="Times New Roman" w:hAnsi="Times New Roman" w:cs="Times New Roman"/>
+          <w:b w:val="0"/>
+          <w:color w:val="000000" w:themeColor="text1"/>
+          <w:sz w:val="24"/>
+          <w:szCs w:val="24"/>
+        </w:rPr>
+        <w:fldChar w:fldCharType="end"/>
+      </w:r>
+      <w:r>
+        <w:rPr>
+          <w:rFonts w:ascii="Times New Roman" w:hAnsi="Times New Roman" w:cs="Times New Roman"/>
+          <w:b w:val="0"/>
+          <w:color w:val="000000" w:themeColor="text1"/>
+          <w:sz w:val="24"/>
+          <w:szCs w:val="24"/>
+        </w:rPr>
+        <w:noBreakHyphen/>
+      </w:r>
+      <w:r>
+        <w:rPr>
+          <w:rFonts w:ascii="Times New Roman" w:hAnsi="Times New Roman" w:cs="Times New Roman"/>
+          <w:b w:val="0"/>
+          <w:color w:val="000000" w:themeColor="text1"/>
+          <w:sz w:val="24"/>
+          <w:szCs w:val="24"/>
+        </w:rPr>
+        <w:fldChar w:fldCharType="begin"/>
+      </w:r>
+      <w:r>
+        <w:rPr>
+          <w:rFonts w:ascii="Times New Roman" w:hAnsi="Times New Roman" w:cs="Times New Roman"/>
+          <w:b w:val="0"/>
+          <w:color w:val="000000" w:themeColor="text1"/>
+          <w:sz w:val="24"/>
+          <w:szCs w:val="24"/>
+        </w:rPr>
+        <w:instrText xml:space="preserve"> SEQ Figure \* ARABIC \s 1 </w:instrText>
+      </w:r>
+      <w:r>
+        <w:rPr>
+          <w:rFonts w:ascii="Times New Roman" w:hAnsi="Times New Roman" w:cs="Times New Roman"/>
+          <w:b w:val="0"/>
+          <w:color w:val="000000" w:themeColor="text1"/>
+          <w:sz w:val="24"/>
+          <w:szCs w:val="24"/>
+        </w:rPr>
+        <w:fldChar w:fldCharType="separate"/>
+      </w:r>
+      <w:r>
+        <w:rPr>
+          <w:rFonts w:ascii="Times New Roman" w:hAnsi="Times New Roman" w:cs="Times New Roman"/>
+          <w:b w:val="0"/>
+          <w:noProof/>
+          <w:color w:val="000000" w:themeColor="text1"/>
+          <w:sz w:val="24"/>
+          <w:szCs w:val="24"/>
+        </w:rPr>
+        <w:t>1</w:t>
+      </w:r>
+      <w:r>
+        <w:rPr>
+          <w:rFonts w:ascii="Times New Roman" w:hAnsi="Times New Roman" w:cs="Times New Roman"/>
+          <w:b w:val="0"/>
+          <w:color w:val="000000" w:themeColor="text1"/>
+          <w:sz w:val="24"/>
+          <w:szCs w:val="24"/>
+        </w:rPr>
+        <w:fldChar w:fldCharType="end"/>
+      </w:r>
+      <w:r>
+        <w:rPr>
+          <w:rFonts w:ascii="Times New Roman" w:hAnsi="Times New Roman" w:cs="Times New Roman"/>
+          <w:b w:val="0"/>
+          <w:color w:val="000000" w:themeColor="text1"/>
+          <w:sz w:val="24"/>
+          <w:szCs w:val="24"/>
+        </w:rPr>
+        <w:t xml:space="preserve"> Login screen</w:t>
+      </w:r>
+    </w:p>
+    <w:p>
+      <w:pPr>
+        <w:spacing w:line="360" w:lineRule="auto"/>
+        <w:jc w:val="both"/>
+        <w:rPr>
+          <w:rFonts w:ascii="Times New Roman" w:hAnsi="Times New Roman" w:cs="Times New Roman"/>
+          <w:sz w:val="24"/>
+          <w:szCs w:val="24"/>
+        </w:rPr>
+      </w:pPr>
+      <w:r>
+        <w:rPr>
+          <w:rFonts w:ascii="Times New Roman" w:hAnsi="Times New Roman" w:cs="Times New Roman"/>
+          <w:sz w:val="24"/>
+          <w:szCs w:val="24"/>
+        </w:rPr>
+        <w:t>If the user does not already have an account, then he or she can press the “Create a new account”</w:t>
+      </w:r>
+      <w:r>
+        <w:rPr>
+          <w:rFonts w:ascii="Times New Roman" w:hAnsi="Times New Roman" w:cs="Times New Roman"/>
+          <w:sz w:val="24"/>
+          <w:szCs w:val="24"/>
+        </w:rPr>
+        <w:t xml:space="preserve"> </w:t>
+      </w:r>
+      <w:r>
+        <w:rPr>
+          <w:rFonts w:ascii="Times New Roman" w:hAnsi="Times New Roman" w:cs="Times New Roman"/>
+          <w:sz w:val="24"/>
+          <w:szCs w:val="24"/>
+        </w:rPr>
+        <w:t xml:space="preserve">button, which will send the user to the registration screen. </w:t>
+      </w:r>
+      <w:r>
+        <w:rPr>
+          <w:rFonts w:ascii="Times New Roman" w:hAnsi="Times New Roman" w:cs="Times New Roman"/>
+          <w:sz w:val="24"/>
+          <w:szCs w:val="24"/>
+        </w:rPr>
+        <w:t>As it can be seen in Figure 3-2, there are requested some general information like the name of the user, an email that must be unique and a password that have to be repeated. The most important thing to mention in this part is that only a patient account can be created. The reasons behind this decision are simple: it is unacceptable for an ordinary person to create an administrator account and also, it is not a wise idea to let anyone pretend to be a doctor. For these arguments, only an administrator account is authorized to add a doctor to the application. The doctor should contact an administrator and prove tha</w:t>
+      </w:r>
+      <w:r>
+        <w:rPr>
+          <w:rFonts w:ascii="Times New Roman" w:hAnsi="Times New Roman" w:cs="Times New Roman"/>
+          <w:sz w:val="24"/>
+          <w:szCs w:val="24"/>
+        </w:rPr>
+        <w:t>t he or she has this profession; after this, the administrator will create a doctor account for that person.</w:t>
+      </w:r>
+    </w:p>
+    <w:p>
+      <w:pPr>
+        <w:keepNext/>
+      </w:pPr>
+      <w:r>
+        <w:rPr>
+          <w:noProof/>
+        </w:rPr>
+        <w:lastRenderedPageBreak/>
+        <w:drawing>
+          <wp:inline distT="0" distB="0" distL="0" distR="0" wp14:anchorId="2E7DDDB7" wp14:editId="2DAF8761">
+            <wp:extent cx="5930900" cy="1701800"/>
+            <wp:effectExtent l="0" t="0" r="0" b="0"/>
+            <wp:docPr id="7" name="Picture 7"/>
+            <wp:cNvGraphicFramePr>
+              <a:graphicFrameLocks xmlns:a="http://schemas.openxmlformats.org/drawingml/2006/main" noChangeAspect="1"/>
+            </wp:cNvGraphicFramePr>
+            <a:graphic xmlns:a="http://schemas.openxmlformats.org/drawingml/2006/main">
+              <a:graphicData uri="http://schemas.openxmlformats.org/drawingml/2006/picture">
+                <pic:pic xmlns:pic="http://schemas.openxmlformats.org/drawingml/2006/picture">
+                  <pic:nvPicPr>
+                    <pic:cNvPr id="0" name="Picture 2"/>
+                    <pic:cNvPicPr>
+                      <a:picLocks noChangeAspect="1" noChangeArrowheads="1"/>
+                    </pic:cNvPicPr>
+                  </pic:nvPicPr>
+                  <pic:blipFill>
+                    <a:blip r:embed="rId16" cstate="print">
+                      <a:extLst>
+                        <a:ext uri="{28A0092B-C50C-407E-A947-70E740481C1C}">
+                          <a14:useLocalDpi xmlns:a14="http://schemas.microsoft.com/office/drawing/2010/main" val="0"/>
+                        </a:ext>
+                      </a:extLst>
+                    </a:blip>
+                    <a:srcRect/>
+                    <a:stretch>
+                      <a:fillRect/>
+                    </a:stretch>
+                  </pic:blipFill>
+                  <pic:spPr bwMode="auto">
+                    <a:xfrm>
+                      <a:off x="0" y="0"/>
+                      <a:ext cx="5930900" cy="1701800"/>
+                    </a:xfrm>
+                    <a:prstGeom prst="rect">
+                      <a:avLst/>
+                    </a:prstGeom>
+                    <a:noFill/>
+                    <a:ln>
+                      <a:noFill/>
+                    </a:ln>
+                  </pic:spPr>
+                </pic:pic>
+              </a:graphicData>
+            </a:graphic>
+          </wp:inline>
+        </w:drawing>
+      </w:r>
+    </w:p>
+    <w:p>
+      <w:pPr>
+        <w:pStyle w:val="Caption"/>
+        <w:spacing w:line="360" w:lineRule="auto"/>
+        <w:jc w:val="center"/>
+        <w:rPr>
+          <w:rFonts w:ascii="Times New Roman" w:hAnsi="Times New Roman" w:cs="Times New Roman"/>
+          <w:b w:val="0"/>
+          <w:color w:val="000000" w:themeColor="text1"/>
+          <w:sz w:val="24"/>
+          <w:szCs w:val="24"/>
+        </w:rPr>
+      </w:pPr>
+      <w:r>
+        <w:rPr>
+          <w:rFonts w:ascii="Times New Roman" w:hAnsi="Times New Roman" w:cs="Times New Roman"/>
+          <w:b w:val="0"/>
+          <w:color w:val="000000" w:themeColor="text1"/>
+          <w:sz w:val="24"/>
+          <w:szCs w:val="24"/>
+        </w:rPr>
+        <w:t xml:space="preserve">Figure </w:t>
+      </w:r>
+      <w:r>
+        <w:rPr>
+          <w:rFonts w:ascii="Times New Roman" w:hAnsi="Times New Roman" w:cs="Times New Roman"/>
+          <w:b w:val="0"/>
+          <w:color w:val="000000" w:themeColor="text1"/>
+          <w:sz w:val="24"/>
+          <w:szCs w:val="24"/>
+        </w:rPr>
+        <w:fldChar w:fldCharType="begin"/>
+      </w:r>
+      <w:r>
+        <w:rPr>
+          <w:rFonts w:ascii="Times New Roman" w:hAnsi="Times New Roman" w:cs="Times New Roman"/>
+          <w:b w:val="0"/>
+          <w:color w:val="000000" w:themeColor="text1"/>
+          <w:sz w:val="24"/>
+          <w:szCs w:val="24"/>
+        </w:rPr>
+        <w:instrText xml:space="preserve"> STYLEREF 1 \s </w:instrText>
+      </w:r>
+      <w:r>
+        <w:rPr>
+          <w:rFonts w:ascii="Times New Roman" w:hAnsi="Times New Roman" w:cs="Times New Roman"/>
+          <w:b w:val="0"/>
+          <w:color w:val="000000" w:themeColor="text1"/>
+          <w:sz w:val="24"/>
+          <w:szCs w:val="24"/>
+        </w:rPr>
+        <w:fldChar w:fldCharType="separate"/>
+      </w:r>
+      <w:r>
+        <w:rPr>
+          <w:rFonts w:ascii="Times New Roman" w:hAnsi="Times New Roman" w:cs="Times New Roman"/>
+          <w:b w:val="0"/>
+          <w:noProof/>
+          <w:color w:val="000000" w:themeColor="text1"/>
+          <w:sz w:val="24"/>
+          <w:szCs w:val="24"/>
+        </w:rPr>
+        <w:t>3</w:t>
+      </w:r>
+      <w:r>
+        <w:rPr>
+          <w:rFonts w:ascii="Times New Roman" w:hAnsi="Times New Roman" w:cs="Times New Roman"/>
+          <w:b w:val="0"/>
+          <w:color w:val="000000" w:themeColor="text1"/>
+          <w:sz w:val="24"/>
+          <w:szCs w:val="24"/>
+        </w:rPr>
+        <w:fldChar w:fldCharType="end"/>
+      </w:r>
+      <w:r>
+        <w:rPr>
+          <w:rFonts w:ascii="Times New Roman" w:hAnsi="Times New Roman" w:cs="Times New Roman"/>
+          <w:b w:val="0"/>
+          <w:color w:val="000000" w:themeColor="text1"/>
+          <w:sz w:val="24"/>
+          <w:szCs w:val="24"/>
+        </w:rPr>
+        <w:noBreakHyphen/>
+      </w:r>
+      <w:r>
+        <w:rPr>
+          <w:rFonts w:ascii="Times New Roman" w:hAnsi="Times New Roman" w:cs="Times New Roman"/>
+          <w:b w:val="0"/>
+          <w:color w:val="000000" w:themeColor="text1"/>
+          <w:sz w:val="24"/>
+          <w:szCs w:val="24"/>
+        </w:rPr>
+        <w:fldChar w:fldCharType="begin"/>
+      </w:r>
+      <w:r>
+        <w:rPr>
+          <w:rFonts w:ascii="Times New Roman" w:hAnsi="Times New Roman" w:cs="Times New Roman"/>
+          <w:b w:val="0"/>
+          <w:color w:val="000000" w:themeColor="text1"/>
+          <w:sz w:val="24"/>
+          <w:szCs w:val="24"/>
+        </w:rPr>
+        <w:instrText xml:space="preserve"> SEQ Figure \* ARABIC \s 1 </w:instrText>
+      </w:r>
+      <w:r>
+        <w:rPr>
+          <w:rFonts w:ascii="Times New Roman" w:hAnsi="Times New Roman" w:cs="Times New Roman"/>
+          <w:b w:val="0"/>
+          <w:color w:val="000000" w:themeColor="text1"/>
+          <w:sz w:val="24"/>
+          <w:szCs w:val="24"/>
+        </w:rPr>
+        <w:fldChar w:fldCharType="separate"/>
+      </w:r>
+      <w:r>
+        <w:rPr>
+          <w:rFonts w:ascii="Times New Roman" w:hAnsi="Times New Roman" w:cs="Times New Roman"/>
+          <w:b w:val="0"/>
+          <w:noProof/>
+          <w:color w:val="000000" w:themeColor="text1"/>
+          <w:sz w:val="24"/>
+          <w:szCs w:val="24"/>
+        </w:rPr>
+        <w:t>2</w:t>
+      </w:r>
+      <w:r>
+        <w:rPr>
+          <w:rFonts w:ascii="Times New Roman" w:hAnsi="Times New Roman" w:cs="Times New Roman"/>
+          <w:b w:val="0"/>
+          <w:color w:val="000000" w:themeColor="text1"/>
+          <w:sz w:val="24"/>
+          <w:szCs w:val="24"/>
+        </w:rPr>
+        <w:fldChar w:fldCharType="end"/>
+      </w:r>
+      <w:r>
+        <w:rPr>
+          <w:rFonts w:ascii="Times New Roman" w:hAnsi="Times New Roman" w:cs="Times New Roman"/>
+          <w:b w:val="0"/>
+          <w:color w:val="000000" w:themeColor="text1"/>
+          <w:sz w:val="24"/>
+          <w:szCs w:val="24"/>
+        </w:rPr>
+        <w:t xml:space="preserve"> Register screen</w:t>
+      </w:r>
+    </w:p>
+    <w:p>
+      <w:pPr>
+        <w:spacing w:line="360" w:lineRule="auto"/>
+        <w:jc w:val="both"/>
+        <w:rPr>
+          <w:rFonts w:ascii="Times New Roman" w:hAnsi="Times New Roman" w:cs="Times New Roman"/>
+          <w:sz w:val="24"/>
+          <w:szCs w:val="24"/>
+        </w:rPr>
+      </w:pPr>
+      <w:r>
+        <w:rPr>
+          <w:rFonts w:ascii="Times New Roman" w:hAnsi="Times New Roman" w:cs="Times New Roman"/>
+          <w:sz w:val="24"/>
+          <w:szCs w:val="24"/>
+        </w:rPr>
+        <w:t xml:space="preserve">After the administrator has successfully logged into the application and accessed the page specific to this type of user, the content displayed will be the one presented in Figure 3-3. </w:t>
+      </w:r>
+      <w:r>
+        <w:rPr>
+          <w:rFonts w:ascii="Times New Roman" w:hAnsi="Times New Roman" w:cs="Times New Roman"/>
+          <w:sz w:val="24"/>
+          <w:szCs w:val="24"/>
+        </w:rPr>
+        <w:t xml:space="preserve">The design is intuitive, being four categories of entities on which changes can be made: Accounts, Medicines, Diseases and Specializations. When selecting an option, under the menu with possible operations there will be displayed the content for the selected option. For example, if the administrator selects the option Update an existing disease and selects one disease from the dropdown list, then what will be displayed is </w:t>
+      </w:r>
+      <w:r>
+        <w:rPr>
+          <w:rFonts w:ascii="Times New Roman" w:hAnsi="Times New Roman" w:cs="Times New Roman"/>
+          <w:sz w:val="24"/>
+          <w:szCs w:val="24"/>
+        </w:rPr>
+        <w:t>described</w:t>
+      </w:r>
+      <w:r>
+        <w:rPr>
+          <w:rFonts w:ascii="Times New Roman" w:hAnsi="Times New Roman" w:cs="Times New Roman"/>
+          <w:sz w:val="24"/>
+          <w:szCs w:val="24"/>
+        </w:rPr>
+        <w:t xml:space="preserve"> </w:t>
+      </w:r>
+      <w:r>
+        <w:rPr>
+          <w:rFonts w:ascii="Times New Roman" w:hAnsi="Times New Roman" w:cs="Times New Roman"/>
+          <w:sz w:val="24"/>
+          <w:szCs w:val="24"/>
+        </w:rPr>
+        <w:t>by</w:t>
+      </w:r>
+      <w:r>
+        <w:rPr>
+          <w:rFonts w:ascii="Times New Roman" w:hAnsi="Times New Roman" w:cs="Times New Roman"/>
+          <w:sz w:val="24"/>
+          <w:szCs w:val="24"/>
+        </w:rPr>
+        <w:t xml:space="preserve"> Figure 3-4.</w:t>
+      </w:r>
+      <w:r>
+        <w:rPr>
+          <w:rFonts w:ascii="Times New Roman" w:hAnsi="Times New Roman" w:cs="Times New Roman"/>
+          <w:sz w:val="24"/>
+          <w:szCs w:val="24"/>
+        </w:rPr>
+        <w:t xml:space="preserve"> For the other options, the content that will be shown is similar. When the selected option is one to add an entity, the required fields will be empty, but for an update action, the administrator must firstly select from a dropdown an entity to be modified and then the fields will be initialized with the information for that entity. This was done to give the administrator the possibility to change only certain fields and not all of them.</w:t>
+      </w:r>
+    </w:p>
+    <w:p>
+      <w:pPr>
+        <w:spacing w:line="360" w:lineRule="auto"/>
+        <w:jc w:val="both"/>
+        <w:rPr>
+          <w:rFonts w:ascii="Times New Roman" w:hAnsi="Times New Roman" w:cs="Times New Roman"/>
+          <w:sz w:val="24"/>
+          <w:szCs w:val="24"/>
+        </w:rPr>
+      </w:pPr>
+    </w:p>
+    <w:p>
+      <w:pPr>
+        <w:keepNext/>
+        <w:spacing w:line="360" w:lineRule="auto"/>
+        <w:jc w:val="both"/>
+      </w:pPr>
+      <w:r>
+        <w:rPr>
+          <w:rFonts w:ascii="Times New Roman" w:hAnsi="Times New Roman" w:cs="Times New Roman"/>
+          <w:noProof/>
+          <w:sz w:val="24"/>
+          <w:szCs w:val="24"/>
+        </w:rPr>
+        <w:drawing>
+          <wp:inline distT="0" distB="0" distL="0" distR="0" wp14:anchorId="6072A564" wp14:editId="293FD1BC">
+            <wp:extent cx="5937250" cy="1416050"/>
+            <wp:effectExtent l="0" t="0" r="6350" b="0"/>
+            <wp:docPr id="9" name="Picture 9"/>
+            <wp:cNvGraphicFramePr>
+              <a:graphicFrameLocks xmlns:a="http://schemas.openxmlformats.org/drawingml/2006/main" noChangeAspect="1"/>
+            </wp:cNvGraphicFramePr>
+            <a:graphic xmlns:a="http://schemas.openxmlformats.org/drawingml/2006/main">
+              <a:graphicData uri="http://schemas.openxmlformats.org/drawingml/2006/picture">
+                <pic:pic xmlns:pic="http://schemas.openxmlformats.org/drawingml/2006/picture">
+                  <pic:nvPicPr>
+                    <pic:cNvPr id="0" name="Picture 1"/>
+                    <pic:cNvPicPr>
+                      <a:picLocks noChangeAspect="1" noChangeArrowheads="1"/>
+                    </pic:cNvPicPr>
+                  </pic:nvPicPr>
+                  <pic:blipFill>
+                    <a:blip r:embed="rId17" cstate="print">
+                      <a:extLst>
+                        <a:ext uri="{28A0092B-C50C-407E-A947-70E740481C1C}">
+                          <a14:useLocalDpi xmlns:a14="http://schemas.microsoft.com/office/drawing/2010/main" val="0"/>
+                        </a:ext>
+                      </a:extLst>
+                    </a:blip>
+                    <a:srcRect/>
+                    <a:stretch>
+                      <a:fillRect/>
+                    </a:stretch>
+                  </pic:blipFill>
+                  <pic:spPr bwMode="auto">
+                    <a:xfrm>
+                      <a:off x="0" y="0"/>
+                      <a:ext cx="5937250" cy="1416050"/>
+                    </a:xfrm>
+                    <a:prstGeom prst="rect">
+                      <a:avLst/>
+                    </a:prstGeom>
+                    <a:noFill/>
+                    <a:ln>
+                      <a:noFill/>
+                    </a:ln>
+                  </pic:spPr>
+                </pic:pic>
+              </a:graphicData>
+            </a:graphic>
+          </wp:inline>
+        </w:drawing>
+      </w:r>
+    </w:p>
+    <w:p>
+      <w:pPr>
+        <w:pStyle w:val="Caption"/>
+        <w:spacing w:line="360" w:lineRule="auto"/>
+        <w:jc w:val="center"/>
+        <w:rPr>
+          <w:rFonts w:ascii="Times New Roman" w:hAnsi="Times New Roman" w:cs="Times New Roman"/>
+          <w:b w:val="0"/>
+          <w:color w:val="000000" w:themeColor="text1"/>
+          <w:sz w:val="24"/>
+          <w:szCs w:val="24"/>
+        </w:rPr>
+      </w:pPr>
+      <w:r>
+        <w:rPr>
+          <w:rFonts w:ascii="Times New Roman" w:hAnsi="Times New Roman" w:cs="Times New Roman"/>
+          <w:b w:val="0"/>
+          <w:color w:val="000000" w:themeColor="text1"/>
+          <w:sz w:val="24"/>
+          <w:szCs w:val="24"/>
+        </w:rPr>
+        <w:t xml:space="preserve">Figure </w:t>
+      </w:r>
+      <w:r>
+        <w:rPr>
+          <w:rFonts w:ascii="Times New Roman" w:hAnsi="Times New Roman" w:cs="Times New Roman"/>
+          <w:b w:val="0"/>
+          <w:color w:val="000000" w:themeColor="text1"/>
+          <w:sz w:val="24"/>
+          <w:szCs w:val="24"/>
+        </w:rPr>
+        <w:fldChar w:fldCharType="begin"/>
+      </w:r>
+      <w:r>
+        <w:rPr>
+          <w:rFonts w:ascii="Times New Roman" w:hAnsi="Times New Roman" w:cs="Times New Roman"/>
+          <w:b w:val="0"/>
+          <w:color w:val="000000" w:themeColor="text1"/>
+          <w:sz w:val="24"/>
+          <w:szCs w:val="24"/>
+        </w:rPr>
+        <w:instrText xml:space="preserve"> STYLEREF 1 \s </w:instrText>
+      </w:r>
+      <w:r>
+        <w:rPr>
+          <w:rFonts w:ascii="Times New Roman" w:hAnsi="Times New Roman" w:cs="Times New Roman"/>
+          <w:b w:val="0"/>
+          <w:color w:val="000000" w:themeColor="text1"/>
+          <w:sz w:val="24"/>
+          <w:szCs w:val="24"/>
+        </w:rPr>
+        <w:fldChar w:fldCharType="separate"/>
+      </w:r>
+      <w:r>
+        <w:rPr>
+          <w:rFonts w:ascii="Times New Roman" w:hAnsi="Times New Roman" w:cs="Times New Roman"/>
+          <w:b w:val="0"/>
+          <w:noProof/>
+          <w:color w:val="000000" w:themeColor="text1"/>
+          <w:sz w:val="24"/>
+          <w:szCs w:val="24"/>
+        </w:rPr>
+        <w:t>3</w:t>
+      </w:r>
+      <w:r>
+        <w:rPr>
+          <w:rFonts w:ascii="Times New Roman" w:hAnsi="Times New Roman" w:cs="Times New Roman"/>
+          <w:b w:val="0"/>
+          <w:color w:val="000000" w:themeColor="text1"/>
+          <w:sz w:val="24"/>
+          <w:szCs w:val="24"/>
+        </w:rPr>
+        <w:fldChar w:fldCharType="end"/>
+      </w:r>
+      <w:r>
+        <w:rPr>
+          <w:rFonts w:ascii="Times New Roman" w:hAnsi="Times New Roman" w:cs="Times New Roman"/>
+          <w:b w:val="0"/>
+          <w:color w:val="000000" w:themeColor="text1"/>
+          <w:sz w:val="24"/>
+          <w:szCs w:val="24"/>
+        </w:rPr>
+        <w:noBreakHyphen/>
+      </w:r>
+      <w:r>
+        <w:rPr>
+          <w:rFonts w:ascii="Times New Roman" w:hAnsi="Times New Roman" w:cs="Times New Roman"/>
+          <w:b w:val="0"/>
+          <w:color w:val="000000" w:themeColor="text1"/>
+          <w:sz w:val="24"/>
+          <w:szCs w:val="24"/>
+        </w:rPr>
+        <w:fldChar w:fldCharType="begin"/>
+      </w:r>
+      <w:r>
+        <w:rPr>
+          <w:rFonts w:ascii="Times New Roman" w:hAnsi="Times New Roman" w:cs="Times New Roman"/>
+          <w:b w:val="0"/>
+          <w:color w:val="000000" w:themeColor="text1"/>
+          <w:sz w:val="24"/>
+          <w:szCs w:val="24"/>
+        </w:rPr>
+        <w:instrText xml:space="preserve"> SEQ Figure \* ARABIC \s 1 </w:instrText>
+      </w:r>
+      <w:r>
+        <w:rPr>
+          <w:rFonts w:ascii="Times New Roman" w:hAnsi="Times New Roman" w:cs="Times New Roman"/>
+          <w:b w:val="0"/>
+          <w:color w:val="000000" w:themeColor="text1"/>
+          <w:sz w:val="24"/>
+          <w:szCs w:val="24"/>
+        </w:rPr>
+        <w:fldChar w:fldCharType="separate"/>
+      </w:r>
+      <w:r>
+        <w:rPr>
+          <w:rFonts w:ascii="Times New Roman" w:hAnsi="Times New Roman" w:cs="Times New Roman"/>
+          <w:b w:val="0"/>
+          <w:noProof/>
+          <w:color w:val="000000" w:themeColor="text1"/>
+          <w:sz w:val="24"/>
+          <w:szCs w:val="24"/>
+        </w:rPr>
+        <w:t>3</w:t>
+      </w:r>
+      <w:r>
+        <w:rPr>
+          <w:rFonts w:ascii="Times New Roman" w:hAnsi="Times New Roman" w:cs="Times New Roman"/>
+          <w:b w:val="0"/>
+          <w:color w:val="000000" w:themeColor="text1"/>
+          <w:sz w:val="24"/>
+          <w:szCs w:val="24"/>
+        </w:rPr>
+        <w:fldChar w:fldCharType="end"/>
+      </w:r>
+      <w:r>
+        <w:rPr>
+          <w:rFonts w:ascii="Times New Roman" w:hAnsi="Times New Roman" w:cs="Times New Roman"/>
+          <w:b w:val="0"/>
+          <w:color w:val="000000" w:themeColor="text1"/>
+          <w:sz w:val="24"/>
+          <w:szCs w:val="24"/>
+        </w:rPr>
+        <w:t xml:space="preserve"> Administrator features</w:t>
+      </w:r>
+    </w:p>
+    <w:p>
+      <w:pPr>
+        <w:keepNext/>
+      </w:pPr>
+      <w:r>
+        <w:rPr>
+          <w:noProof/>
+        </w:rPr>
+        <w:lastRenderedPageBreak/>
+        <w:drawing>
+          <wp:inline distT="0" distB="0" distL="0" distR="0" wp14:anchorId="1F47DF13" wp14:editId="23459CF1">
+            <wp:extent cx="5937250" cy="1397000"/>
+            <wp:effectExtent l="0" t="0" r="6350" b="0"/>
+            <wp:docPr id="10" name="Picture 10"/>
+            <wp:cNvGraphicFramePr>
+              <a:graphicFrameLocks xmlns:a="http://schemas.openxmlformats.org/drawingml/2006/main" noChangeAspect="1"/>
+            </wp:cNvGraphicFramePr>
+            <a:graphic xmlns:a="http://schemas.openxmlformats.org/drawingml/2006/main">
+              <a:graphicData uri="http://schemas.openxmlformats.org/drawingml/2006/picture">
+                <pic:pic xmlns:pic="http://schemas.openxmlformats.org/drawingml/2006/picture">
+                  <pic:nvPicPr>
+                    <pic:cNvPr id="0" name="Picture 2"/>
+                    <pic:cNvPicPr>
+                      <a:picLocks noChangeAspect="1" noChangeArrowheads="1"/>
+                    </pic:cNvPicPr>
+                  </pic:nvPicPr>
+                  <pic:blipFill>
+                    <a:blip r:embed="rId18" cstate="print">
+                      <a:extLst>
+                        <a:ext uri="{28A0092B-C50C-407E-A947-70E740481C1C}">
+                          <a14:useLocalDpi xmlns:a14="http://schemas.microsoft.com/office/drawing/2010/main" val="0"/>
+                        </a:ext>
+                      </a:extLst>
+                    </a:blip>
+                    <a:srcRect/>
+                    <a:stretch>
+                      <a:fillRect/>
+                    </a:stretch>
+                  </pic:blipFill>
+                  <pic:spPr bwMode="auto">
+                    <a:xfrm>
+                      <a:off x="0" y="0"/>
+                      <a:ext cx="5937250" cy="1397000"/>
+                    </a:xfrm>
+                    <a:prstGeom prst="rect">
+                      <a:avLst/>
+                    </a:prstGeom>
+                    <a:noFill/>
+                    <a:ln>
+                      <a:noFill/>
+                    </a:ln>
+                  </pic:spPr>
+                </pic:pic>
+              </a:graphicData>
+            </a:graphic>
+          </wp:inline>
+        </w:drawing>
+      </w:r>
+    </w:p>
+    <w:p>
+      <w:pPr>
+        <w:pStyle w:val="Caption"/>
+        <w:spacing w:line="360" w:lineRule="auto"/>
+        <w:jc w:val="center"/>
+        <w:rPr>
+          <w:rFonts w:ascii="Times New Roman" w:hAnsi="Times New Roman" w:cs="Times New Roman"/>
+          <w:b w:val="0"/>
+          <w:color w:val="000000" w:themeColor="text1"/>
+          <w:sz w:val="24"/>
+          <w:szCs w:val="24"/>
+        </w:rPr>
+      </w:pPr>
+      <w:r>
+        <w:rPr>
+          <w:rFonts w:ascii="Times New Roman" w:hAnsi="Times New Roman" w:cs="Times New Roman"/>
+          <w:b w:val="0"/>
+          <w:color w:val="000000" w:themeColor="text1"/>
+          <w:sz w:val="24"/>
+          <w:szCs w:val="24"/>
+        </w:rPr>
+        <w:t xml:space="preserve">Figure </w:t>
+      </w:r>
+      <w:r>
+        <w:rPr>
+          <w:rFonts w:ascii="Times New Roman" w:hAnsi="Times New Roman" w:cs="Times New Roman"/>
+          <w:b w:val="0"/>
+          <w:color w:val="000000" w:themeColor="text1"/>
+          <w:sz w:val="24"/>
+          <w:szCs w:val="24"/>
+        </w:rPr>
+        <w:fldChar w:fldCharType="begin"/>
+      </w:r>
+      <w:r>
+        <w:rPr>
+          <w:rFonts w:ascii="Times New Roman" w:hAnsi="Times New Roman" w:cs="Times New Roman"/>
+          <w:b w:val="0"/>
+          <w:color w:val="000000" w:themeColor="text1"/>
+          <w:sz w:val="24"/>
+          <w:szCs w:val="24"/>
+        </w:rPr>
+        <w:instrText xml:space="preserve"> STYLEREF 1 \s </w:instrText>
+      </w:r>
+      <w:r>
+        <w:rPr>
+          <w:rFonts w:ascii="Times New Roman" w:hAnsi="Times New Roman" w:cs="Times New Roman"/>
+          <w:b w:val="0"/>
+          <w:color w:val="000000" w:themeColor="text1"/>
+          <w:sz w:val="24"/>
+          <w:szCs w:val="24"/>
+        </w:rPr>
+        <w:fldChar w:fldCharType="separate"/>
+      </w:r>
+      <w:r>
+        <w:rPr>
+          <w:rFonts w:ascii="Times New Roman" w:hAnsi="Times New Roman" w:cs="Times New Roman"/>
+          <w:b w:val="0"/>
+          <w:noProof/>
+          <w:color w:val="000000" w:themeColor="text1"/>
+          <w:sz w:val="24"/>
+          <w:szCs w:val="24"/>
+        </w:rPr>
+        <w:t>3</w:t>
+      </w:r>
+      <w:r>
+        <w:rPr>
+          <w:rFonts w:ascii="Times New Roman" w:hAnsi="Times New Roman" w:cs="Times New Roman"/>
+          <w:b w:val="0"/>
+          <w:color w:val="000000" w:themeColor="text1"/>
+          <w:sz w:val="24"/>
+          <w:szCs w:val="24"/>
+        </w:rPr>
+        <w:fldChar w:fldCharType="end"/>
+      </w:r>
+      <w:r>
+        <w:rPr>
+          <w:rFonts w:ascii="Times New Roman" w:hAnsi="Times New Roman" w:cs="Times New Roman"/>
+          <w:b w:val="0"/>
+          <w:color w:val="000000" w:themeColor="text1"/>
+          <w:sz w:val="24"/>
+          <w:szCs w:val="24"/>
+        </w:rPr>
+        <w:noBreakHyphen/>
+      </w:r>
+      <w:r>
+        <w:rPr>
+          <w:rFonts w:ascii="Times New Roman" w:hAnsi="Times New Roman" w:cs="Times New Roman"/>
+          <w:b w:val="0"/>
+          <w:color w:val="000000" w:themeColor="text1"/>
+          <w:sz w:val="24"/>
+          <w:szCs w:val="24"/>
+        </w:rPr>
+        <w:fldChar w:fldCharType="begin"/>
+      </w:r>
+      <w:r>
+        <w:rPr>
+          <w:rFonts w:ascii="Times New Roman" w:hAnsi="Times New Roman" w:cs="Times New Roman"/>
+          <w:b w:val="0"/>
+          <w:color w:val="000000" w:themeColor="text1"/>
+          <w:sz w:val="24"/>
+          <w:szCs w:val="24"/>
+        </w:rPr>
+        <w:instrText xml:space="preserve"> SEQ Figure \* ARABIC \s 1 </w:instrText>
+      </w:r>
+      <w:r>
+        <w:rPr>
+          <w:rFonts w:ascii="Times New Roman" w:hAnsi="Times New Roman" w:cs="Times New Roman"/>
+          <w:b w:val="0"/>
+          <w:color w:val="000000" w:themeColor="text1"/>
+          <w:sz w:val="24"/>
+          <w:szCs w:val="24"/>
+        </w:rPr>
+        <w:fldChar w:fldCharType="separate"/>
+      </w:r>
+      <w:r>
+        <w:rPr>
+          <w:rFonts w:ascii="Times New Roman" w:hAnsi="Times New Roman" w:cs="Times New Roman"/>
+          <w:b w:val="0"/>
+          <w:noProof/>
+          <w:color w:val="000000" w:themeColor="text1"/>
+          <w:sz w:val="24"/>
+          <w:szCs w:val="24"/>
+        </w:rPr>
+        <w:t>4</w:t>
+      </w:r>
+      <w:r>
+        <w:rPr>
+          <w:rFonts w:ascii="Times New Roman" w:hAnsi="Times New Roman" w:cs="Times New Roman"/>
+          <w:b w:val="0"/>
+          <w:color w:val="000000" w:themeColor="text1"/>
+          <w:sz w:val="24"/>
+          <w:szCs w:val="24"/>
+        </w:rPr>
+        <w:fldChar w:fldCharType="end"/>
+      </w:r>
+      <w:r>
+        <w:rPr>
+          <w:rFonts w:ascii="Times New Roman" w:hAnsi="Times New Roman" w:cs="Times New Roman"/>
+          <w:b w:val="0"/>
+          <w:color w:val="000000" w:themeColor="text1"/>
+          <w:sz w:val="24"/>
+          <w:szCs w:val="24"/>
+        </w:rPr>
+        <w:t xml:space="preserve"> Update an existing disease feature</w:t>
+      </w:r>
+    </w:p>
+    <w:p>
+      <w:pPr>
+        <w:spacing w:line="360" w:lineRule="auto"/>
+        <w:jc w:val="both"/>
+        <w:rPr>
+          <w:rFonts w:ascii="Times New Roman" w:hAnsi="Times New Roman" w:cs="Times New Roman"/>
+          <w:sz w:val="24"/>
+          <w:szCs w:val="24"/>
+        </w:rPr>
+      </w:pPr>
+    </w:p>
+    <w:p>
+      <w:pPr>
+        <w:spacing w:line="360" w:lineRule="auto"/>
+        <w:jc w:val="both"/>
+        <w:rPr>
+          <w:rFonts w:ascii="Times New Roman" w:hAnsi="Times New Roman" w:cs="Times New Roman"/>
+          <w:sz w:val="24"/>
+          <w:szCs w:val="24"/>
+        </w:rPr>
+      </w:pPr>
+      <w:r>
+        <w:rPr>
+          <w:rFonts w:ascii="Times New Roman" w:hAnsi="Times New Roman" w:cs="Times New Roman"/>
+          <w:sz w:val="24"/>
+          <w:szCs w:val="24"/>
+        </w:rPr>
+        <w:t xml:space="preserve">In the following, we will present the features for a doctor account. Immediately after the doctor has successfully logged into the application, the content displayed will be as the one shown in Figure 3-5. In the top of the page we can notice </w:t>
+      </w:r>
+      <w:r>
+        <w:rPr>
+          <w:rFonts w:ascii="Times New Roman" w:hAnsi="Times New Roman" w:cs="Times New Roman"/>
+          <w:sz w:val="24"/>
+          <w:szCs w:val="24"/>
+        </w:rPr>
+        <w:t>a menu bar with the following options: My Account, See my appointments, Chat, Feedback, Recipes, Information and Logout. Initially, there is selected the My Account option. For this case, the information about the doctor is displayed together with the possibility to change the email or the password by clicking the “Modify” button. When this happen, the email field became enable and there are 2 more fields for password and repeating of the password and 2 buttons: one for saving the updated information and one for cancel this action.</w:t>
+      </w:r>
     </w:p>
     <w:p/>
     <w:p>
       <w:pPr>
+        <w:keepNext/>
         <w:spacing w:line="360" w:lineRule="auto"/>
         <w:jc w:val="both"/>
-        <w:rPr>
-          <w:rFonts w:ascii="Times New Roman" w:hAnsi="Times New Roman" w:cs="Times New Roman"/>
-          <w:sz w:val="24"/>
-          <w:szCs w:val="24"/>
-        </w:rPr>
-      </w:pPr>
-      <w:r>
-        <w:rPr>
-          <w:rFonts w:ascii="Times New Roman" w:hAnsi="Times New Roman" w:cs="Times New Roman"/>
-          <w:sz w:val="24"/>
-          <w:szCs w:val="24"/>
-        </w:rPr>
-        <w:t>As we have seen up to this point in thesis, the relationship between the doctor and the patient can unfold in different ways depending on the patient’s autonomy, his life values and his medical knowledge. The most commonly used model in this interaction nowadays is the deliberative one, in which the doctor has the purpose to morally persuade the patient to choose the best health-related medical interventions</w:t>
-      </w:r>
-      <w:r>
-        <w:rPr>
-          <w:rFonts w:ascii="Times New Roman" w:hAnsi="Times New Roman" w:cs="Times New Roman"/>
-          <w:sz w:val="24"/>
-          <w:szCs w:val="24"/>
-        </w:rPr>
-        <w:t xml:space="preserve">. In case the patient disagrees with the presented method, the two deliberate on other treatments. Web applications have developed considerably in recent years, making possible an interactive online communication between </w:t>
-      </w:r>
-      <w:r>
-        <w:rPr>
-          <w:rFonts w:ascii="Times New Roman" w:hAnsi="Times New Roman" w:cs="Times New Roman"/>
-          <w:sz w:val="24"/>
-          <w:szCs w:val="24"/>
-        </w:rPr>
-        <w:t>the doctor and the patient. They are able to solve problems like in the case in which people prefer to look themselves for information on the internet that is not necessarily verified instead of resorting to the knowledge of a specialist. Of course, web applications can’t completely replace face-to-face interaction between a patient and a doctor, but they can facilitate the process before the respective meeting and save time when it comes to just a little advice</w:t>
-      </w:r>
-      <w:r>
-        <w:rPr>
-          <w:rFonts w:ascii="Times New Roman" w:hAnsi="Times New Roman" w:cs="Times New Roman"/>
-          <w:sz w:val="24"/>
-          <w:szCs w:val="24"/>
-        </w:rPr>
-        <w:t>, or even an encouragement.</w:t>
+      </w:pPr>
+      <w:r>
+        <w:rPr>
+          <w:rFonts w:ascii="Times New Roman" w:hAnsi="Times New Roman" w:cs="Times New Roman"/>
+          <w:noProof/>
+          <w:sz w:val="24"/>
+          <w:szCs w:val="24"/>
+        </w:rPr>
+        <w:drawing>
+          <wp:inline distT="0" distB="0" distL="0" distR="0" wp14:anchorId="7C841E85" wp14:editId="7393CC0D">
+            <wp:extent cx="5930900" cy="1301750"/>
+            <wp:effectExtent l="0" t="0" r="0" b="0"/>
+            <wp:docPr id="11" name="Picture 11"/>
+            <wp:cNvGraphicFramePr>
+              <a:graphicFrameLocks xmlns:a="http://schemas.openxmlformats.org/drawingml/2006/main" noChangeAspect="1"/>
+            </wp:cNvGraphicFramePr>
+            <a:graphic xmlns:a="http://schemas.openxmlformats.org/drawingml/2006/main">
+              <a:graphicData uri="http://schemas.openxmlformats.org/drawingml/2006/picture">
+                <pic:pic xmlns:pic="http://schemas.openxmlformats.org/drawingml/2006/picture">
+                  <pic:nvPicPr>
+                    <pic:cNvPr id="0" name="Picture 3"/>
+                    <pic:cNvPicPr>
+                      <a:picLocks noChangeAspect="1" noChangeArrowheads="1"/>
+                    </pic:cNvPicPr>
+                  </pic:nvPicPr>
+                  <pic:blipFill>
+                    <a:blip r:embed="rId19" cstate="print">
+                      <a:extLst>
+                        <a:ext uri="{28A0092B-C50C-407E-A947-70E740481C1C}">
+                          <a14:useLocalDpi xmlns:a14="http://schemas.microsoft.com/office/drawing/2010/main" val="0"/>
+                        </a:ext>
+                      </a:extLst>
+                    </a:blip>
+                    <a:srcRect/>
+                    <a:stretch>
+                      <a:fillRect/>
+                    </a:stretch>
+                  </pic:blipFill>
+                  <pic:spPr bwMode="auto">
+                    <a:xfrm>
+                      <a:off x="0" y="0"/>
+                      <a:ext cx="5930900" cy="1301750"/>
+                    </a:xfrm>
+                    <a:prstGeom prst="rect">
+                      <a:avLst/>
+                    </a:prstGeom>
+                    <a:noFill/>
+                    <a:ln>
+                      <a:noFill/>
+                    </a:ln>
+                  </pic:spPr>
+                </pic:pic>
+              </a:graphicData>
+            </a:graphic>
+          </wp:inline>
+        </w:drawing>
+      </w:r>
+    </w:p>
+    <w:p>
+      <w:pPr>
+        <w:pStyle w:val="Caption"/>
+        <w:spacing w:line="360" w:lineRule="auto"/>
+        <w:jc w:val="center"/>
+        <w:rPr>
+          <w:rFonts w:ascii="Times New Roman" w:hAnsi="Times New Roman" w:cs="Times New Roman"/>
+          <w:b w:val="0"/>
+          <w:color w:val="000000" w:themeColor="text1"/>
+          <w:sz w:val="24"/>
+          <w:szCs w:val="24"/>
+        </w:rPr>
+      </w:pPr>
+      <w:r>
+        <w:rPr>
+          <w:rFonts w:ascii="Times New Roman" w:hAnsi="Times New Roman" w:cs="Times New Roman"/>
+          <w:b w:val="0"/>
+          <w:color w:val="000000" w:themeColor="text1"/>
+          <w:sz w:val="24"/>
+          <w:szCs w:val="24"/>
+        </w:rPr>
+        <w:t xml:space="preserve">Figure </w:t>
+      </w:r>
+      <w:r>
+        <w:rPr>
+          <w:rFonts w:ascii="Times New Roman" w:hAnsi="Times New Roman" w:cs="Times New Roman"/>
+          <w:b w:val="0"/>
+          <w:color w:val="000000" w:themeColor="text1"/>
+          <w:sz w:val="24"/>
+          <w:szCs w:val="24"/>
+        </w:rPr>
+        <w:fldChar w:fldCharType="begin"/>
+      </w:r>
+      <w:r>
+        <w:rPr>
+          <w:rFonts w:ascii="Times New Roman" w:hAnsi="Times New Roman" w:cs="Times New Roman"/>
+          <w:b w:val="0"/>
+          <w:color w:val="000000" w:themeColor="text1"/>
+          <w:sz w:val="24"/>
+          <w:szCs w:val="24"/>
+        </w:rPr>
+        <w:instrText xml:space="preserve"> STYLEREF 1 \s </w:instrText>
+      </w:r>
+      <w:r>
+        <w:rPr>
+          <w:rFonts w:ascii="Times New Roman" w:hAnsi="Times New Roman" w:cs="Times New Roman"/>
+          <w:b w:val="0"/>
+          <w:color w:val="000000" w:themeColor="text1"/>
+          <w:sz w:val="24"/>
+          <w:szCs w:val="24"/>
+        </w:rPr>
+        <w:fldChar w:fldCharType="separate"/>
+      </w:r>
+      <w:r>
+        <w:rPr>
+          <w:rFonts w:ascii="Times New Roman" w:hAnsi="Times New Roman" w:cs="Times New Roman"/>
+          <w:b w:val="0"/>
+          <w:noProof/>
+          <w:color w:val="000000" w:themeColor="text1"/>
+          <w:sz w:val="24"/>
+          <w:szCs w:val="24"/>
+        </w:rPr>
+        <w:t>3</w:t>
+      </w:r>
+      <w:r>
+        <w:rPr>
+          <w:rFonts w:ascii="Times New Roman" w:hAnsi="Times New Roman" w:cs="Times New Roman"/>
+          <w:b w:val="0"/>
+          <w:color w:val="000000" w:themeColor="text1"/>
+          <w:sz w:val="24"/>
+          <w:szCs w:val="24"/>
+        </w:rPr>
+        <w:fldChar w:fldCharType="end"/>
+      </w:r>
+      <w:r>
+        <w:rPr>
+          <w:rFonts w:ascii="Times New Roman" w:hAnsi="Times New Roman" w:cs="Times New Roman"/>
+          <w:b w:val="0"/>
+          <w:color w:val="000000" w:themeColor="text1"/>
+          <w:sz w:val="24"/>
+          <w:szCs w:val="24"/>
+        </w:rPr>
+        <w:noBreakHyphen/>
+      </w:r>
+      <w:r>
+        <w:rPr>
+          <w:rFonts w:ascii="Times New Roman" w:hAnsi="Times New Roman" w:cs="Times New Roman"/>
+          <w:b w:val="0"/>
+          <w:color w:val="000000" w:themeColor="text1"/>
+          <w:sz w:val="24"/>
+          <w:szCs w:val="24"/>
+        </w:rPr>
+        <w:fldChar w:fldCharType="begin"/>
+      </w:r>
+      <w:r>
+        <w:rPr>
+          <w:rFonts w:ascii="Times New Roman" w:hAnsi="Times New Roman" w:cs="Times New Roman"/>
+          <w:b w:val="0"/>
+          <w:color w:val="000000" w:themeColor="text1"/>
+          <w:sz w:val="24"/>
+          <w:szCs w:val="24"/>
+        </w:rPr>
+        <w:instrText xml:space="preserve"> SEQ Figure \* ARABIC \s 1 </w:instrText>
+      </w:r>
+      <w:r>
+        <w:rPr>
+          <w:rFonts w:ascii="Times New Roman" w:hAnsi="Times New Roman" w:cs="Times New Roman"/>
+          <w:b w:val="0"/>
+          <w:color w:val="000000" w:themeColor="text1"/>
+          <w:sz w:val="24"/>
+          <w:szCs w:val="24"/>
+        </w:rPr>
+        <w:fldChar w:fldCharType="separate"/>
+      </w:r>
+      <w:r>
+        <w:rPr>
+          <w:rFonts w:ascii="Times New Roman" w:hAnsi="Times New Roman" w:cs="Times New Roman"/>
+          <w:b w:val="0"/>
+          <w:noProof/>
+          <w:color w:val="000000" w:themeColor="text1"/>
+          <w:sz w:val="24"/>
+          <w:szCs w:val="24"/>
+        </w:rPr>
+        <w:t>5</w:t>
+      </w:r>
+      <w:r>
+        <w:rPr>
+          <w:rFonts w:ascii="Times New Roman" w:hAnsi="Times New Roman" w:cs="Times New Roman"/>
+          <w:b w:val="0"/>
+          <w:color w:val="000000" w:themeColor="text1"/>
+          <w:sz w:val="24"/>
+          <w:szCs w:val="24"/>
+        </w:rPr>
+        <w:fldChar w:fldCharType="end"/>
+      </w:r>
+      <w:r>
+        <w:rPr>
+          <w:rFonts w:ascii="Times New Roman" w:hAnsi="Times New Roman" w:cs="Times New Roman"/>
+          <w:b w:val="0"/>
+          <w:color w:val="000000" w:themeColor="text1"/>
+          <w:sz w:val="24"/>
+          <w:szCs w:val="24"/>
+        </w:rPr>
+        <w:t xml:space="preserve"> Doctor Perspective</w:t>
       </w:r>
     </w:p>
     <w:p>
@@ -7517,118 +9988,6 @@
           <w:szCs w:val="24"/>
         </w:rPr>
       </w:pPr>
-      <w:r>
-        <w:rPr>
-          <w:rFonts w:ascii="Times New Roman" w:hAnsi="Times New Roman" w:cs="Times New Roman"/>
-          <w:sz w:val="24"/>
-          <w:szCs w:val="24"/>
-        </w:rPr>
-        <w:t>That being said, we can further formulate the requirements and specifications of the web application of our approach. Both doctors and patients will have accounts in which their important data are present like their first name, second name</w:t>
-      </w:r>
-      <w:r>
-        <w:rPr>
-          <w:rFonts w:ascii="Times New Roman" w:hAnsi="Times New Roman" w:cs="Times New Roman"/>
-          <w:sz w:val="24"/>
-          <w:szCs w:val="24"/>
-        </w:rPr>
-        <w:t xml:space="preserve"> and email address. Also, the doctors should have a specialization in order to make it easier for the patients to identify the doctors they should go to for their problem.  Anyone can make a r</w:t>
-      </w:r>
-      <w:r>
-        <w:rPr>
-          <w:rFonts w:ascii="Times New Roman" w:hAnsi="Times New Roman" w:cs="Times New Roman"/>
-          <w:sz w:val="24"/>
-          <w:szCs w:val="24"/>
-        </w:rPr>
-        <w:t xml:space="preserve">egular patient account, but </w:t>
-      </w:r>
-      <w:r>
-        <w:rPr>
-          <w:rFonts w:ascii="Times New Roman" w:hAnsi="Times New Roman" w:cs="Times New Roman"/>
-          <w:sz w:val="24"/>
-          <w:szCs w:val="24"/>
-        </w:rPr>
-        <w:t xml:space="preserve">the doctors </w:t>
-      </w:r>
-      <w:r>
-        <w:rPr>
-          <w:rFonts w:ascii="Times New Roman" w:hAnsi="Times New Roman" w:cs="Times New Roman"/>
-          <w:sz w:val="24"/>
-          <w:szCs w:val="24"/>
-        </w:rPr>
-        <w:t>must</w:t>
-      </w:r>
-      <w:r>
-        <w:rPr>
-          <w:rFonts w:ascii="Times New Roman" w:hAnsi="Times New Roman" w:cs="Times New Roman"/>
-          <w:sz w:val="24"/>
-          <w:szCs w:val="24"/>
-        </w:rPr>
-        <w:t xml:space="preserve"> be introduced by an </w:t>
-      </w:r>
-      <w:r>
-        <w:rPr>
-          <w:rFonts w:ascii="Times New Roman" w:hAnsi="Times New Roman" w:cs="Times New Roman"/>
-          <w:sz w:val="24"/>
-          <w:szCs w:val="24"/>
-        </w:rPr>
-        <w:t>administrator account</w:t>
-      </w:r>
-      <w:r>
-        <w:rPr>
-          <w:rFonts w:ascii="Times New Roman" w:hAnsi="Times New Roman" w:cs="Times New Roman"/>
-          <w:sz w:val="24"/>
-          <w:szCs w:val="24"/>
-        </w:rPr>
-        <w:t xml:space="preserve">, which would receive on email </w:t>
-      </w:r>
-      <w:r>
-        <w:rPr>
-          <w:rFonts w:ascii="Times New Roman" w:hAnsi="Times New Roman" w:cs="Times New Roman"/>
-          <w:sz w:val="24"/>
-          <w:szCs w:val="24"/>
-        </w:rPr>
-        <w:t>the documents attesting his or her profession. The administrator account can perform multiple operations like adding new medicines or updating existing ones, adding new specializations</w:t>
-      </w:r>
-      <w:r>
-        <w:rPr>
-          <w:rFonts w:ascii="Times New Roman" w:hAnsi="Times New Roman" w:cs="Times New Roman"/>
-          <w:sz w:val="24"/>
-          <w:szCs w:val="24"/>
-        </w:rPr>
-        <w:t xml:space="preserve">. </w:t>
-      </w:r>
-      <w:r>
-        <w:rPr>
-          <w:rFonts w:ascii="Times New Roman" w:hAnsi="Times New Roman" w:cs="Times New Roman"/>
-          <w:sz w:val="24"/>
-          <w:szCs w:val="24"/>
-        </w:rPr>
-        <w:t>Each person can update its own account</w:t>
-      </w:r>
-      <w:r>
-        <w:rPr>
-          <w:rFonts w:ascii="Times New Roman" w:hAnsi="Times New Roman" w:cs="Times New Roman"/>
-          <w:sz w:val="24"/>
-          <w:szCs w:val="24"/>
-        </w:rPr>
-        <w:t xml:space="preserve"> </w:t>
-      </w:r>
-      <w:r>
-        <w:rPr>
-          <w:rFonts w:ascii="Times New Roman" w:hAnsi="Times New Roman" w:cs="Times New Roman"/>
-          <w:sz w:val="24"/>
-          <w:szCs w:val="24"/>
-        </w:rPr>
-        <w:t xml:space="preserve">and will log-in with his or her email address and a password (for doctors, they would have a default password chosen by the administrator and must change it as soon as possible). A medicine is characterized by its name and a description, same in the case of a disease. </w:t>
-      </w:r>
-      <w:r>
-        <w:rPr>
-          <w:rFonts w:ascii="Times New Roman" w:hAnsi="Times New Roman" w:cs="Times New Roman"/>
-          <w:sz w:val="24"/>
-          <w:szCs w:val="24"/>
-        </w:rPr>
-        <w:t>A treatment is given by a specific doctor to a specific patient, it contains one or more medicines, it is recommended for a disease and the start date must be specified.</w:t>
-      </w:r>
     </w:p>
     <w:p>
       <w:pPr>
@@ -7646,104 +10005,1092 @@
           <w:sz w:val="24"/>
           <w:szCs w:val="24"/>
         </w:rPr>
+        <w:t xml:space="preserve">By clicking the second option, See my appointments, the user will be redirected to the calendar page. On this page, the doctor can see his or her schedule over a week, like it is shown in Figure 3-6. On the top of the calendar will be the date of Monday of the current week and an arrow to </w:t>
+      </w:r>
+      <w:r>
+        <w:rPr>
+          <w:rFonts w:ascii="Times New Roman" w:hAnsi="Times New Roman" w:cs="Times New Roman"/>
+          <w:sz w:val="24"/>
+          <w:szCs w:val="24"/>
+        </w:rPr>
         <w:lastRenderedPageBreak/>
-        <w:t xml:space="preserve">A patient account has the following features: he or she can schedule an appointment by consulting a doctor’s calendar, can communicate directly with any doctor and can </w:t>
-      </w:r>
-      <w:r>
-        <w:rPr>
-          <w:rFonts w:ascii="Times New Roman" w:hAnsi="Times New Roman" w:cs="Times New Roman"/>
-          <w:sz w:val="24"/>
-          <w:szCs w:val="24"/>
-        </w:rPr>
-        <w:t>give his or her feedb</w:t>
-      </w:r>
-      <w:r>
-        <w:rPr>
-          <w:rFonts w:ascii="Times New Roman" w:hAnsi="Times New Roman" w:cs="Times New Roman"/>
-          <w:sz w:val="24"/>
-          <w:szCs w:val="24"/>
-        </w:rPr>
-        <w:t>ack about evolution in case of a disease. The calendar will show a doctor’s program over a week, the consultations having the standard duration of half an hour. In first phase, the program is also standard, from 9 am to 5 pm, but in a next phase it should be changeable by the doctor. The patient can select any week from a certain period of time (three months would be a reasonable amount of time). In order to be easier to patient to select the disease that he or she wants to give a feedback about its evolution, a list with all diseases for which there exist a current treatment will be shown on the page of this feature</w:t>
-      </w:r>
-      <w:r>
-        <w:rPr>
-          <w:rFonts w:ascii="Times New Roman" w:hAnsi="Times New Roman" w:cs="Times New Roman"/>
-          <w:sz w:val="24"/>
-          <w:szCs w:val="24"/>
-        </w:rPr>
-        <w:t>.</w:t>
-      </w:r>
-    </w:p>
-    <w:p>
-      <w:pPr>
+        <w:t>right. By clicking this arrow the content is changed to show the data for the next work week. In this case, an arrow to left will be shown in order to navigate to the previous week. The structure of the calendar is intuitive, being intervals of 30 minutes for an appointment</w:t>
+      </w:r>
+      <w:r>
+        <w:rPr>
+          <w:rFonts w:ascii="Times New Roman" w:hAnsi="Times New Roman" w:cs="Times New Roman"/>
+          <w:sz w:val="24"/>
+          <w:szCs w:val="24"/>
+        </w:rPr>
+        <w:t>, from 9:00 to 17:00</w:t>
+      </w:r>
+      <w:r>
+        <w:rPr>
+          <w:rFonts w:ascii="Times New Roman" w:hAnsi="Times New Roman" w:cs="Times New Roman"/>
+          <w:sz w:val="24"/>
+          <w:szCs w:val="24"/>
+        </w:rPr>
+        <w:t xml:space="preserve">. For the past dates, the color of the slot is gray. For the remaining slots, if there is appointment for someone, the color is yellow and the name of the person is displayed, otherwise the color of the slot is green.  </w:t>
+      </w:r>
+    </w:p>
+    <w:p>
+      <w:pPr>
+        <w:keepNext/>
         <w:spacing w:line="360" w:lineRule="auto"/>
         <w:jc w:val="both"/>
-        <w:rPr>
-          <w:rFonts w:ascii="Times New Roman" w:hAnsi="Times New Roman" w:cs="Times New Roman"/>
-          <w:sz w:val="24"/>
-          <w:szCs w:val="24"/>
-        </w:rPr>
-      </w:pPr>
-      <w:r>
-        <w:rPr>
-          <w:rFonts w:ascii="Times New Roman" w:hAnsi="Times New Roman" w:cs="Times New Roman"/>
-          <w:sz w:val="24"/>
-          <w:szCs w:val="24"/>
-        </w:rPr>
-        <w:t xml:space="preserve">After the patient makes an appointment on a free slot from calendar, the doctor receives an email with this information. The doctor account has as features the fact that can prescribe recipes, see his or her schedule over a week, communicate directly with the patients and </w:t>
-      </w:r>
-      <w:r>
-        <w:rPr>
-          <w:rFonts w:ascii="Times New Roman" w:hAnsi="Times New Roman" w:cs="Times New Roman"/>
-          <w:sz w:val="24"/>
-          <w:szCs w:val="24"/>
-        </w:rPr>
-        <w:t>writes his or her observations about evolution of a disease in case of a specific patient that he consulted (the feedback of the patient is visible for the doctor in order to understand what are patient’s life-values over the time, but the observations of the doctor are not visible for the patient). Each presented feature should be on a separate page. They will be accessible always from a horizontal menu placed on top of the screen.</w:t>
+      </w:pPr>
+      <w:r>
+        <w:rPr>
+          <w:rFonts w:ascii="Times New Roman" w:hAnsi="Times New Roman" w:cs="Times New Roman"/>
+          <w:noProof/>
+          <w:sz w:val="24"/>
+          <w:szCs w:val="24"/>
+        </w:rPr>
+        <w:drawing>
+          <wp:inline distT="0" distB="0" distL="0" distR="0" wp14:anchorId="4AF5089D" wp14:editId="355841FB">
+            <wp:extent cx="5943600" cy="2540000"/>
+            <wp:effectExtent l="0" t="0" r="0" b="0"/>
+            <wp:docPr id="12" name="Picture 12"/>
+            <wp:cNvGraphicFramePr>
+              <a:graphicFrameLocks xmlns:a="http://schemas.openxmlformats.org/drawingml/2006/main" noChangeAspect="1"/>
+            </wp:cNvGraphicFramePr>
+            <a:graphic xmlns:a="http://schemas.openxmlformats.org/drawingml/2006/main">
+              <a:graphicData uri="http://schemas.openxmlformats.org/drawingml/2006/picture">
+                <pic:pic xmlns:pic="http://schemas.openxmlformats.org/drawingml/2006/picture">
+                  <pic:nvPicPr>
+                    <pic:cNvPr id="0" name="Picture 4"/>
+                    <pic:cNvPicPr>
+                      <a:picLocks noChangeAspect="1" noChangeArrowheads="1"/>
+                    </pic:cNvPicPr>
+                  </pic:nvPicPr>
+                  <pic:blipFill>
+                    <a:blip r:embed="rId20" cstate="print">
+                      <a:extLst>
+                        <a:ext uri="{28A0092B-C50C-407E-A947-70E740481C1C}">
+                          <a14:useLocalDpi xmlns:a14="http://schemas.microsoft.com/office/drawing/2010/main" val="0"/>
+                        </a:ext>
+                      </a:extLst>
+                    </a:blip>
+                    <a:srcRect/>
+                    <a:stretch>
+                      <a:fillRect/>
+                    </a:stretch>
+                  </pic:blipFill>
+                  <pic:spPr bwMode="auto">
+                    <a:xfrm>
+                      <a:off x="0" y="0"/>
+                      <a:ext cx="5943600" cy="2540000"/>
+                    </a:xfrm>
+                    <a:prstGeom prst="rect">
+                      <a:avLst/>
+                    </a:prstGeom>
+                    <a:noFill/>
+                    <a:ln>
+                      <a:noFill/>
+                    </a:ln>
+                  </pic:spPr>
+                </pic:pic>
+              </a:graphicData>
+            </a:graphic>
+          </wp:inline>
+        </w:drawing>
+      </w:r>
+    </w:p>
+    <w:p>
+      <w:pPr>
+        <w:pStyle w:val="Caption"/>
+        <w:spacing w:line="360" w:lineRule="auto"/>
+        <w:jc w:val="center"/>
+        <w:rPr>
+          <w:rFonts w:ascii="Times New Roman" w:hAnsi="Times New Roman" w:cs="Times New Roman"/>
+          <w:b w:val="0"/>
+          <w:color w:val="000000" w:themeColor="text1"/>
+          <w:sz w:val="24"/>
+          <w:szCs w:val="24"/>
+        </w:rPr>
+      </w:pPr>
+      <w:r>
+        <w:rPr>
+          <w:rFonts w:ascii="Times New Roman" w:hAnsi="Times New Roman" w:cs="Times New Roman"/>
+          <w:b w:val="0"/>
+          <w:color w:val="000000" w:themeColor="text1"/>
+          <w:sz w:val="24"/>
+          <w:szCs w:val="24"/>
+        </w:rPr>
+        <w:t xml:space="preserve">Figure </w:t>
+      </w:r>
+      <w:r>
+        <w:rPr>
+          <w:rFonts w:ascii="Times New Roman" w:hAnsi="Times New Roman" w:cs="Times New Roman"/>
+          <w:b w:val="0"/>
+          <w:color w:val="000000" w:themeColor="text1"/>
+          <w:sz w:val="24"/>
+          <w:szCs w:val="24"/>
+        </w:rPr>
+        <w:fldChar w:fldCharType="begin"/>
+      </w:r>
+      <w:r>
+        <w:rPr>
+          <w:rFonts w:ascii="Times New Roman" w:hAnsi="Times New Roman" w:cs="Times New Roman"/>
+          <w:b w:val="0"/>
+          <w:color w:val="000000" w:themeColor="text1"/>
+          <w:sz w:val="24"/>
+          <w:szCs w:val="24"/>
+        </w:rPr>
+        <w:instrText xml:space="preserve"> STYLEREF 1 \s </w:instrText>
+      </w:r>
+      <w:r>
+        <w:rPr>
+          <w:rFonts w:ascii="Times New Roman" w:hAnsi="Times New Roman" w:cs="Times New Roman"/>
+          <w:b w:val="0"/>
+          <w:color w:val="000000" w:themeColor="text1"/>
+          <w:sz w:val="24"/>
+          <w:szCs w:val="24"/>
+        </w:rPr>
+        <w:fldChar w:fldCharType="separate"/>
+      </w:r>
+      <w:r>
+        <w:rPr>
+          <w:rFonts w:ascii="Times New Roman" w:hAnsi="Times New Roman" w:cs="Times New Roman"/>
+          <w:b w:val="0"/>
+          <w:noProof/>
+          <w:color w:val="000000" w:themeColor="text1"/>
+          <w:sz w:val="24"/>
+          <w:szCs w:val="24"/>
+        </w:rPr>
+        <w:t>3</w:t>
+      </w:r>
+      <w:r>
+        <w:rPr>
+          <w:rFonts w:ascii="Times New Roman" w:hAnsi="Times New Roman" w:cs="Times New Roman"/>
+          <w:b w:val="0"/>
+          <w:color w:val="000000" w:themeColor="text1"/>
+          <w:sz w:val="24"/>
+          <w:szCs w:val="24"/>
+        </w:rPr>
+        <w:fldChar w:fldCharType="end"/>
+      </w:r>
+      <w:r>
+        <w:rPr>
+          <w:rFonts w:ascii="Times New Roman" w:hAnsi="Times New Roman" w:cs="Times New Roman"/>
+          <w:b w:val="0"/>
+          <w:color w:val="000000" w:themeColor="text1"/>
+          <w:sz w:val="24"/>
+          <w:szCs w:val="24"/>
+        </w:rPr>
+        <w:noBreakHyphen/>
+      </w:r>
+      <w:r>
+        <w:rPr>
+          <w:rFonts w:ascii="Times New Roman" w:hAnsi="Times New Roman" w:cs="Times New Roman"/>
+          <w:b w:val="0"/>
+          <w:color w:val="000000" w:themeColor="text1"/>
+          <w:sz w:val="24"/>
+          <w:szCs w:val="24"/>
+        </w:rPr>
+        <w:fldChar w:fldCharType="begin"/>
+      </w:r>
+      <w:r>
+        <w:rPr>
+          <w:rFonts w:ascii="Times New Roman" w:hAnsi="Times New Roman" w:cs="Times New Roman"/>
+          <w:b w:val="0"/>
+          <w:color w:val="000000" w:themeColor="text1"/>
+          <w:sz w:val="24"/>
+          <w:szCs w:val="24"/>
+        </w:rPr>
+        <w:instrText xml:space="preserve"> SEQ Figure \* ARABIC \s 1 </w:instrText>
+      </w:r>
+      <w:r>
+        <w:rPr>
+          <w:rFonts w:ascii="Times New Roman" w:hAnsi="Times New Roman" w:cs="Times New Roman"/>
+          <w:b w:val="0"/>
+          <w:color w:val="000000" w:themeColor="text1"/>
+          <w:sz w:val="24"/>
+          <w:szCs w:val="24"/>
+        </w:rPr>
+        <w:fldChar w:fldCharType="separate"/>
+      </w:r>
+      <w:r>
+        <w:rPr>
+          <w:rFonts w:ascii="Times New Roman" w:hAnsi="Times New Roman" w:cs="Times New Roman"/>
+          <w:b w:val="0"/>
+          <w:noProof/>
+          <w:color w:val="000000" w:themeColor="text1"/>
+          <w:sz w:val="24"/>
+          <w:szCs w:val="24"/>
+        </w:rPr>
+        <w:t>6</w:t>
+      </w:r>
+      <w:r>
+        <w:rPr>
+          <w:rFonts w:ascii="Times New Roman" w:hAnsi="Times New Roman" w:cs="Times New Roman"/>
+          <w:b w:val="0"/>
+          <w:color w:val="000000" w:themeColor="text1"/>
+          <w:sz w:val="24"/>
+          <w:szCs w:val="24"/>
+        </w:rPr>
+        <w:fldChar w:fldCharType="end"/>
+      </w:r>
+      <w:r>
+        <w:rPr>
+          <w:rFonts w:ascii="Times New Roman" w:hAnsi="Times New Roman" w:cs="Times New Roman"/>
+          <w:b w:val="0"/>
+          <w:color w:val="000000" w:themeColor="text1"/>
+          <w:sz w:val="24"/>
+          <w:szCs w:val="24"/>
+        </w:rPr>
+        <w:t xml:space="preserve"> Calendar feature</w:t>
       </w:r>
     </w:p>
     <w:p/>
+    <w:p>
+      <w:pPr>
+        <w:keepNext/>
+        <w:spacing w:line="360" w:lineRule="auto"/>
+        <w:jc w:val="both"/>
+      </w:pPr>
+      <w:r>
+        <w:rPr>
+          <w:noProof/>
+        </w:rPr>
+        <w:drawing>
+          <wp:inline distT="0" distB="0" distL="0" distR="0">
+            <wp:extent cx="5943600" cy="2273300"/>
+            <wp:effectExtent l="0" t="0" r="0" b="0"/>
+            <wp:docPr id="14" name="Picture 14"/>
+            <wp:cNvGraphicFramePr>
+              <a:graphicFrameLocks xmlns:a="http://schemas.openxmlformats.org/drawingml/2006/main" noChangeAspect="1"/>
+            </wp:cNvGraphicFramePr>
+            <a:graphic xmlns:a="http://schemas.openxmlformats.org/drawingml/2006/main">
+              <a:graphicData uri="http://schemas.openxmlformats.org/drawingml/2006/picture">
+                <pic:pic xmlns:pic="http://schemas.openxmlformats.org/drawingml/2006/picture">
+                  <pic:nvPicPr>
+                    <pic:cNvPr id="0" name="Picture 6"/>
+                    <pic:cNvPicPr>
+                      <a:picLocks noChangeAspect="1" noChangeArrowheads="1"/>
+                    </pic:cNvPicPr>
+                  </pic:nvPicPr>
+                  <pic:blipFill>
+                    <a:blip r:embed="rId21" cstate="print">
+                      <a:extLst>
+                        <a:ext uri="{28A0092B-C50C-407E-A947-70E740481C1C}">
+                          <a14:useLocalDpi xmlns:a14="http://schemas.microsoft.com/office/drawing/2010/main" val="0"/>
+                        </a:ext>
+                      </a:extLst>
+                    </a:blip>
+                    <a:srcRect/>
+                    <a:stretch>
+                      <a:fillRect/>
+                    </a:stretch>
+                  </pic:blipFill>
+                  <pic:spPr bwMode="auto">
+                    <a:xfrm>
+                      <a:off x="0" y="0"/>
+                      <a:ext cx="5943600" cy="2273300"/>
+                    </a:xfrm>
+                    <a:prstGeom prst="rect">
+                      <a:avLst/>
+                    </a:prstGeom>
+                    <a:noFill/>
+                    <a:ln>
+                      <a:noFill/>
+                    </a:ln>
+                  </pic:spPr>
+                </pic:pic>
+              </a:graphicData>
+            </a:graphic>
+          </wp:inline>
+        </w:drawing>
+      </w:r>
+    </w:p>
+    <w:p>
+      <w:pPr>
+        <w:pStyle w:val="Caption"/>
+        <w:spacing w:line="360" w:lineRule="auto"/>
+        <w:jc w:val="center"/>
+        <w:rPr>
+          <w:rFonts w:ascii="Times New Roman" w:hAnsi="Times New Roman" w:cs="Times New Roman"/>
+          <w:b w:val="0"/>
+          <w:color w:val="000000" w:themeColor="text1"/>
+          <w:sz w:val="24"/>
+          <w:szCs w:val="24"/>
+        </w:rPr>
+      </w:pPr>
+      <w:r>
+        <w:rPr>
+          <w:rFonts w:ascii="Times New Roman" w:hAnsi="Times New Roman" w:cs="Times New Roman"/>
+          <w:b w:val="0"/>
+          <w:color w:val="000000" w:themeColor="text1"/>
+          <w:sz w:val="24"/>
+          <w:szCs w:val="24"/>
+        </w:rPr>
+        <w:t xml:space="preserve">Figure </w:t>
+      </w:r>
+      <w:r>
+        <w:rPr>
+          <w:rFonts w:ascii="Times New Roman" w:hAnsi="Times New Roman" w:cs="Times New Roman"/>
+          <w:b w:val="0"/>
+          <w:color w:val="000000" w:themeColor="text1"/>
+          <w:sz w:val="24"/>
+          <w:szCs w:val="24"/>
+        </w:rPr>
+        <w:fldChar w:fldCharType="begin"/>
+      </w:r>
+      <w:r>
+        <w:rPr>
+          <w:rFonts w:ascii="Times New Roman" w:hAnsi="Times New Roman" w:cs="Times New Roman"/>
+          <w:b w:val="0"/>
+          <w:color w:val="000000" w:themeColor="text1"/>
+          <w:sz w:val="24"/>
+          <w:szCs w:val="24"/>
+        </w:rPr>
+        <w:instrText xml:space="preserve"> STYLEREF 1 \s </w:instrText>
+      </w:r>
+      <w:r>
+        <w:rPr>
+          <w:rFonts w:ascii="Times New Roman" w:hAnsi="Times New Roman" w:cs="Times New Roman"/>
+          <w:b w:val="0"/>
+          <w:color w:val="000000" w:themeColor="text1"/>
+          <w:sz w:val="24"/>
+          <w:szCs w:val="24"/>
+        </w:rPr>
+        <w:fldChar w:fldCharType="separate"/>
+      </w:r>
+      <w:r>
+        <w:rPr>
+          <w:rFonts w:ascii="Times New Roman" w:hAnsi="Times New Roman" w:cs="Times New Roman"/>
+          <w:b w:val="0"/>
+          <w:noProof/>
+          <w:color w:val="000000" w:themeColor="text1"/>
+          <w:sz w:val="24"/>
+          <w:szCs w:val="24"/>
+        </w:rPr>
+        <w:t>3</w:t>
+      </w:r>
+      <w:r>
+        <w:rPr>
+          <w:rFonts w:ascii="Times New Roman" w:hAnsi="Times New Roman" w:cs="Times New Roman"/>
+          <w:b w:val="0"/>
+          <w:color w:val="000000" w:themeColor="text1"/>
+          <w:sz w:val="24"/>
+          <w:szCs w:val="24"/>
+        </w:rPr>
+        <w:fldChar w:fldCharType="end"/>
+      </w:r>
+      <w:r>
+        <w:rPr>
+          <w:rFonts w:ascii="Times New Roman" w:hAnsi="Times New Roman" w:cs="Times New Roman"/>
+          <w:b w:val="0"/>
+          <w:color w:val="000000" w:themeColor="text1"/>
+          <w:sz w:val="24"/>
+          <w:szCs w:val="24"/>
+        </w:rPr>
+        <w:noBreakHyphen/>
+      </w:r>
+      <w:r>
+        <w:rPr>
+          <w:rFonts w:ascii="Times New Roman" w:hAnsi="Times New Roman" w:cs="Times New Roman"/>
+          <w:b w:val="0"/>
+          <w:color w:val="000000" w:themeColor="text1"/>
+          <w:sz w:val="24"/>
+          <w:szCs w:val="24"/>
+        </w:rPr>
+        <w:fldChar w:fldCharType="begin"/>
+      </w:r>
+      <w:r>
+        <w:rPr>
+          <w:rFonts w:ascii="Times New Roman" w:hAnsi="Times New Roman" w:cs="Times New Roman"/>
+          <w:b w:val="0"/>
+          <w:color w:val="000000" w:themeColor="text1"/>
+          <w:sz w:val="24"/>
+          <w:szCs w:val="24"/>
+        </w:rPr>
+        <w:instrText xml:space="preserve"> SEQ Figure \* ARABIC \s 1 </w:instrText>
+      </w:r>
+      <w:r>
+        <w:rPr>
+          <w:rFonts w:ascii="Times New Roman" w:hAnsi="Times New Roman" w:cs="Times New Roman"/>
+          <w:b w:val="0"/>
+          <w:color w:val="000000" w:themeColor="text1"/>
+          <w:sz w:val="24"/>
+          <w:szCs w:val="24"/>
+        </w:rPr>
+        <w:fldChar w:fldCharType="separate"/>
+      </w:r>
+      <w:r>
+        <w:rPr>
+          <w:rFonts w:ascii="Times New Roman" w:hAnsi="Times New Roman" w:cs="Times New Roman"/>
+          <w:b w:val="0"/>
+          <w:noProof/>
+          <w:color w:val="000000" w:themeColor="text1"/>
+          <w:sz w:val="24"/>
+          <w:szCs w:val="24"/>
+        </w:rPr>
+        <w:t>7</w:t>
+      </w:r>
+      <w:r>
+        <w:rPr>
+          <w:rFonts w:ascii="Times New Roman" w:hAnsi="Times New Roman" w:cs="Times New Roman"/>
+          <w:b w:val="0"/>
+          <w:color w:val="000000" w:themeColor="text1"/>
+          <w:sz w:val="24"/>
+          <w:szCs w:val="24"/>
+        </w:rPr>
+        <w:fldChar w:fldCharType="end"/>
+      </w:r>
+      <w:r>
+        <w:rPr>
+          <w:rFonts w:ascii="Times New Roman" w:hAnsi="Times New Roman" w:cs="Times New Roman"/>
+          <w:b w:val="0"/>
+          <w:color w:val="000000" w:themeColor="text1"/>
+          <w:sz w:val="24"/>
+          <w:szCs w:val="24"/>
+        </w:rPr>
+        <w:t xml:space="preserve"> Chat </w:t>
+      </w:r>
+      <w:r>
+        <w:rPr>
+          <w:rFonts w:ascii="Times New Roman" w:hAnsi="Times New Roman" w:cs="Times New Roman"/>
+          <w:b w:val="0"/>
+          <w:color w:val="000000" w:themeColor="text1"/>
+          <w:sz w:val="24"/>
+          <w:szCs w:val="24"/>
+        </w:rPr>
+        <w:t>page</w:t>
+      </w:r>
+    </w:p>
     <w:p/>
+    <w:p>
+      <w:pPr>
+        <w:spacing w:line="360" w:lineRule="auto"/>
+        <w:jc w:val="both"/>
+        <w:rPr>
+          <w:rFonts w:ascii="Times New Roman" w:hAnsi="Times New Roman" w:cs="Times New Roman"/>
+          <w:sz w:val="24"/>
+          <w:szCs w:val="24"/>
+        </w:rPr>
+      </w:pPr>
+      <w:r>
+        <w:rPr>
+          <w:rFonts w:ascii="Times New Roman" w:hAnsi="Times New Roman" w:cs="Times New Roman"/>
+          <w:sz w:val="24"/>
+          <w:szCs w:val="24"/>
+        </w:rPr>
+        <w:lastRenderedPageBreak/>
+        <w:t>In figure 3-7, we can see the chat page. In the top left corner is a dropdown with patients and under it a list with the conversations of the current logged in doctor. The doctor can choose either from the dropdown or from the list of conversations a patient. After this happens, in the right part the messages between them will be displayed. The messages from the logged in user are on the right side and from the other person on the left side, having different colors. There is a box under the messages section to write a new message and a button in the right part to send it.</w:t>
+      </w:r>
+    </w:p>
+    <w:p>
+      <w:pPr>
+        <w:spacing w:line="360" w:lineRule="auto"/>
+        <w:jc w:val="both"/>
+        <w:rPr>
+          <w:rFonts w:ascii="Times New Roman" w:hAnsi="Times New Roman" w:cs="Times New Roman"/>
+          <w:sz w:val="24"/>
+          <w:szCs w:val="24"/>
+        </w:rPr>
+      </w:pPr>
+      <w:r>
+        <w:rPr>
+          <w:rFonts w:ascii="Times New Roman" w:hAnsi="Times New Roman" w:cs="Times New Roman"/>
+          <w:sz w:val="24"/>
+          <w:szCs w:val="24"/>
+        </w:rPr>
+        <w:t xml:space="preserve">In the Feedback section, there are 2 dropdowns: one to choose a patient and one to choose a disease. After the doctor selects </w:t>
+      </w:r>
+      <w:r>
+        <w:rPr>
+          <w:rFonts w:ascii="Times New Roman" w:hAnsi="Times New Roman" w:cs="Times New Roman"/>
+          <w:sz w:val="24"/>
+          <w:szCs w:val="24"/>
+        </w:rPr>
+        <w:t>one option from each dropdown, on the right side are the observations of the doctor about the disease’s evolution and in the left part are the notes of the patient.</w:t>
+      </w:r>
+    </w:p>
+    <w:p>
+      <w:pPr>
+        <w:keepNext/>
+        <w:spacing w:line="360" w:lineRule="auto"/>
+        <w:jc w:val="center"/>
+      </w:pPr>
+      <w:r>
+        <w:rPr>
+          <w:rFonts w:ascii="Times New Roman" w:hAnsi="Times New Roman" w:cs="Times New Roman"/>
+          <w:noProof/>
+          <w:sz w:val="24"/>
+          <w:szCs w:val="24"/>
+        </w:rPr>
+        <w:drawing>
+          <wp:inline distT="0" distB="0" distL="0" distR="0" wp14:anchorId="4073BE8B" wp14:editId="3361A4E7">
+            <wp:extent cx="5937250" cy="2228850"/>
+            <wp:effectExtent l="0" t="0" r="6350" b="0"/>
+            <wp:docPr id="15" name="Picture 15"/>
+            <wp:cNvGraphicFramePr>
+              <a:graphicFrameLocks xmlns:a="http://schemas.openxmlformats.org/drawingml/2006/main" noChangeAspect="1"/>
+            </wp:cNvGraphicFramePr>
+            <a:graphic xmlns:a="http://schemas.openxmlformats.org/drawingml/2006/main">
+              <a:graphicData uri="http://schemas.openxmlformats.org/drawingml/2006/picture">
+                <pic:pic xmlns:pic="http://schemas.openxmlformats.org/drawingml/2006/picture">
+                  <pic:nvPicPr>
+                    <pic:cNvPr id="0" name="Picture 7"/>
+                    <pic:cNvPicPr>
+                      <a:picLocks noChangeAspect="1" noChangeArrowheads="1"/>
+                    </pic:cNvPicPr>
+                  </pic:nvPicPr>
+                  <pic:blipFill>
+                    <a:blip r:embed="rId22" cstate="print">
+                      <a:extLst>
+                        <a:ext uri="{28A0092B-C50C-407E-A947-70E740481C1C}">
+                          <a14:useLocalDpi xmlns:a14="http://schemas.microsoft.com/office/drawing/2010/main" val="0"/>
+                        </a:ext>
+                      </a:extLst>
+                    </a:blip>
+                    <a:srcRect/>
+                    <a:stretch>
+                      <a:fillRect/>
+                    </a:stretch>
+                  </pic:blipFill>
+                  <pic:spPr bwMode="auto">
+                    <a:xfrm>
+                      <a:off x="0" y="0"/>
+                      <a:ext cx="5937250" cy="2228850"/>
+                    </a:xfrm>
+                    <a:prstGeom prst="rect">
+                      <a:avLst/>
+                    </a:prstGeom>
+                    <a:noFill/>
+                    <a:ln>
+                      <a:noFill/>
+                    </a:ln>
+                  </pic:spPr>
+                </pic:pic>
+              </a:graphicData>
+            </a:graphic>
+          </wp:inline>
+        </w:drawing>
+      </w:r>
+    </w:p>
+    <w:p>
+      <w:pPr>
+        <w:pStyle w:val="Caption"/>
+        <w:spacing w:line="360" w:lineRule="auto"/>
+        <w:jc w:val="center"/>
+        <w:rPr>
+          <w:rFonts w:ascii="Times New Roman" w:hAnsi="Times New Roman" w:cs="Times New Roman"/>
+          <w:b w:val="0"/>
+          <w:color w:val="000000" w:themeColor="text1"/>
+          <w:sz w:val="24"/>
+          <w:szCs w:val="24"/>
+        </w:rPr>
+      </w:pPr>
+      <w:r>
+        <w:rPr>
+          <w:rFonts w:ascii="Times New Roman" w:hAnsi="Times New Roman" w:cs="Times New Roman"/>
+          <w:b w:val="0"/>
+          <w:color w:val="000000" w:themeColor="text1"/>
+          <w:sz w:val="24"/>
+          <w:szCs w:val="24"/>
+        </w:rPr>
+        <w:t xml:space="preserve">Figure </w:t>
+      </w:r>
+      <w:r>
+        <w:rPr>
+          <w:rFonts w:ascii="Times New Roman" w:hAnsi="Times New Roman" w:cs="Times New Roman"/>
+          <w:b w:val="0"/>
+          <w:color w:val="000000" w:themeColor="text1"/>
+          <w:sz w:val="24"/>
+          <w:szCs w:val="24"/>
+        </w:rPr>
+        <w:fldChar w:fldCharType="begin"/>
+      </w:r>
+      <w:r>
+        <w:rPr>
+          <w:rFonts w:ascii="Times New Roman" w:hAnsi="Times New Roman" w:cs="Times New Roman"/>
+          <w:b w:val="0"/>
+          <w:color w:val="000000" w:themeColor="text1"/>
+          <w:sz w:val="24"/>
+          <w:szCs w:val="24"/>
+        </w:rPr>
+        <w:instrText xml:space="preserve"> STYLEREF 1 \s </w:instrText>
+      </w:r>
+      <w:r>
+        <w:rPr>
+          <w:rFonts w:ascii="Times New Roman" w:hAnsi="Times New Roman" w:cs="Times New Roman"/>
+          <w:b w:val="0"/>
+          <w:color w:val="000000" w:themeColor="text1"/>
+          <w:sz w:val="24"/>
+          <w:szCs w:val="24"/>
+        </w:rPr>
+        <w:fldChar w:fldCharType="separate"/>
+      </w:r>
+      <w:r>
+        <w:rPr>
+          <w:rFonts w:ascii="Times New Roman" w:hAnsi="Times New Roman" w:cs="Times New Roman"/>
+          <w:b w:val="0"/>
+          <w:noProof/>
+          <w:color w:val="000000" w:themeColor="text1"/>
+          <w:sz w:val="24"/>
+          <w:szCs w:val="24"/>
+        </w:rPr>
+        <w:t>3</w:t>
+      </w:r>
+      <w:r>
+        <w:rPr>
+          <w:rFonts w:ascii="Times New Roman" w:hAnsi="Times New Roman" w:cs="Times New Roman"/>
+          <w:b w:val="0"/>
+          <w:color w:val="000000" w:themeColor="text1"/>
+          <w:sz w:val="24"/>
+          <w:szCs w:val="24"/>
+        </w:rPr>
+        <w:fldChar w:fldCharType="end"/>
+      </w:r>
+      <w:r>
+        <w:rPr>
+          <w:rFonts w:ascii="Times New Roman" w:hAnsi="Times New Roman" w:cs="Times New Roman"/>
+          <w:b w:val="0"/>
+          <w:color w:val="000000" w:themeColor="text1"/>
+          <w:sz w:val="24"/>
+          <w:szCs w:val="24"/>
+        </w:rPr>
+        <w:noBreakHyphen/>
+      </w:r>
+      <w:r>
+        <w:rPr>
+          <w:rFonts w:ascii="Times New Roman" w:hAnsi="Times New Roman" w:cs="Times New Roman"/>
+          <w:b w:val="0"/>
+          <w:color w:val="000000" w:themeColor="text1"/>
+          <w:sz w:val="24"/>
+          <w:szCs w:val="24"/>
+        </w:rPr>
+        <w:fldChar w:fldCharType="begin"/>
+      </w:r>
+      <w:r>
+        <w:rPr>
+          <w:rFonts w:ascii="Times New Roman" w:hAnsi="Times New Roman" w:cs="Times New Roman"/>
+          <w:b w:val="0"/>
+          <w:color w:val="000000" w:themeColor="text1"/>
+          <w:sz w:val="24"/>
+          <w:szCs w:val="24"/>
+        </w:rPr>
+        <w:instrText xml:space="preserve"> SEQ Figure \* ARABIC \s 1 </w:instrText>
+      </w:r>
+      <w:r>
+        <w:rPr>
+          <w:rFonts w:ascii="Times New Roman" w:hAnsi="Times New Roman" w:cs="Times New Roman"/>
+          <w:b w:val="0"/>
+          <w:color w:val="000000" w:themeColor="text1"/>
+          <w:sz w:val="24"/>
+          <w:szCs w:val="24"/>
+        </w:rPr>
+        <w:fldChar w:fldCharType="separate"/>
+      </w:r>
+      <w:r>
+        <w:rPr>
+          <w:rFonts w:ascii="Times New Roman" w:hAnsi="Times New Roman" w:cs="Times New Roman"/>
+          <w:b w:val="0"/>
+          <w:noProof/>
+          <w:color w:val="000000" w:themeColor="text1"/>
+          <w:sz w:val="24"/>
+          <w:szCs w:val="24"/>
+        </w:rPr>
+        <w:t>8</w:t>
+      </w:r>
+      <w:r>
+        <w:rPr>
+          <w:rFonts w:ascii="Times New Roman" w:hAnsi="Times New Roman" w:cs="Times New Roman"/>
+          <w:b w:val="0"/>
+          <w:color w:val="000000" w:themeColor="text1"/>
+          <w:sz w:val="24"/>
+          <w:szCs w:val="24"/>
+        </w:rPr>
+        <w:fldChar w:fldCharType="end"/>
+      </w:r>
+      <w:r>
+        <w:rPr>
+          <w:rFonts w:ascii="Times New Roman" w:hAnsi="Times New Roman" w:cs="Times New Roman"/>
+          <w:b w:val="0"/>
+          <w:color w:val="000000" w:themeColor="text1"/>
+          <w:sz w:val="24"/>
+          <w:szCs w:val="24"/>
+        </w:rPr>
+        <w:t xml:space="preserve"> Recipes Page</w:t>
+      </w:r>
+    </w:p>
+    <w:p>
+      <w:pPr>
+        <w:spacing w:line="360" w:lineRule="auto"/>
+        <w:jc w:val="both"/>
+        <w:rPr>
+          <w:rFonts w:ascii="Times New Roman" w:hAnsi="Times New Roman" w:cs="Times New Roman"/>
+          <w:sz w:val="24"/>
+          <w:szCs w:val="24"/>
+        </w:rPr>
+      </w:pPr>
+    </w:p>
+    <w:p>
+      <w:pPr>
+        <w:spacing w:line="360" w:lineRule="auto"/>
+        <w:jc w:val="both"/>
+        <w:rPr>
+          <w:rFonts w:ascii="Times New Roman" w:hAnsi="Times New Roman" w:cs="Times New Roman"/>
+          <w:sz w:val="24"/>
+          <w:szCs w:val="24"/>
+        </w:rPr>
+      </w:pPr>
+      <w:r>
+        <w:rPr>
+          <w:rFonts w:ascii="Times New Roman" w:hAnsi="Times New Roman" w:cs="Times New Roman"/>
+          <w:sz w:val="24"/>
+          <w:szCs w:val="24"/>
+        </w:rPr>
+        <w:t xml:space="preserve">The Recipes page contains a table with the recipes prescribed by the current doctor to different patients. The columns have intuitive names in order to make it easier for the user to understand the content. Thus, there is displayed the Patient for whom the recipe is, the Disease that he or she is suffering, a list with the prescribed Medicines, some Observations made by the doctor </w:t>
+      </w:r>
+      <w:r>
+        <w:rPr>
+          <w:rFonts w:ascii="Times New Roman" w:hAnsi="Times New Roman" w:cs="Times New Roman"/>
+          <w:sz w:val="24"/>
+          <w:szCs w:val="24"/>
+        </w:rPr>
+        <w:t>and the Date when the recipe was prescribed. Under the table, doctor can add a new medicine by selecting the required data: a patient, a disease and some medicines; the observations are optional.</w:t>
+      </w:r>
+    </w:p>
+    <w:p>
+      <w:pPr>
+        <w:spacing w:line="360" w:lineRule="auto"/>
+        <w:jc w:val="both"/>
+        <w:rPr>
+          <w:rFonts w:ascii="Times New Roman" w:hAnsi="Times New Roman" w:cs="Times New Roman"/>
+          <w:sz w:val="24"/>
+          <w:szCs w:val="24"/>
+        </w:rPr>
+      </w:pPr>
+      <w:r>
+        <w:rPr>
+          <w:rFonts w:ascii="Times New Roman" w:hAnsi="Times New Roman" w:cs="Times New Roman"/>
+          <w:sz w:val="24"/>
+          <w:szCs w:val="24"/>
+        </w:rPr>
+        <w:lastRenderedPageBreak/>
+        <w:t>The Information page is more like a library when patients and doctors can found information about a disease or a medicine, being in fact the Description field introduced by the administrator. There is a dropdown list on the left side with all diseases from which users can select one and under the dropdown will be displayed information about that disease. The behavior for the medicines is exactly the same on the right side.</w:t>
+      </w:r>
+    </w:p>
+    <w:p>
+      <w:pPr>
+        <w:spacing w:line="360" w:lineRule="auto"/>
+        <w:jc w:val="both"/>
+        <w:rPr>
+          <w:rFonts w:ascii="Times New Roman" w:hAnsi="Times New Roman" w:cs="Times New Roman"/>
+          <w:sz w:val="24"/>
+          <w:szCs w:val="24"/>
+        </w:rPr>
+      </w:pPr>
+      <w:r>
+        <w:rPr>
+          <w:rFonts w:ascii="Times New Roman" w:hAnsi="Times New Roman" w:cs="Times New Roman"/>
+          <w:sz w:val="24"/>
+          <w:szCs w:val="24"/>
+        </w:rPr>
+        <w:t xml:space="preserve">In the case that the current logged in user is a patient, the content will suffer modifications. The first one is that the name of calendar page will be changed to “Make an appointment” in the menu from the top of the page. The colors of the slots are changed too: if a slot is occupied, its color is red, if one is free then the color is blue and the user can make an appointment for that interval by clicking the respective spot and if the slot was already booked by him the color is yellow. </w:t>
+      </w:r>
+      <w:r>
+        <w:rPr>
+          <w:rFonts w:ascii="Times New Roman" w:hAnsi="Times New Roman" w:cs="Times New Roman"/>
+          <w:sz w:val="24"/>
+          <w:szCs w:val="24"/>
+        </w:rPr>
+        <w:t>The chat page is almost identically with the difference of people from the dropdown list, being only doctors to select from. On the feedback page, the patient can’t see what are the observations of the doctor, being displayed only what he or she wrote about the disease. The recipe page doesn’t contain obviously the ability to prescribe a new recipe and the column Patient is replaced by Doctor. The Information page is exactly the same as for the doctor.</w:t>
+      </w:r>
+    </w:p>
+    <w:p>
+      <w:pPr>
+        <w:spacing w:line="360" w:lineRule="auto"/>
+        <w:jc w:val="both"/>
+        <w:rPr>
+          <w:rFonts w:ascii="Times New Roman" w:hAnsi="Times New Roman" w:cs="Times New Roman"/>
+          <w:sz w:val="24"/>
+          <w:szCs w:val="24"/>
+        </w:rPr>
+      </w:pPr>
+    </w:p>
+    <w:p>
+      <w:pPr>
+        <w:pStyle w:val="Heading2"/>
+      </w:pPr>
+      <w:r>
+        <w:t>Implementation</w:t>
+      </w:r>
+    </w:p>
+    <w:p>
+      <w:pPr>
+        <w:spacing w:line="360" w:lineRule="auto"/>
+        <w:jc w:val="both"/>
+        <w:rPr>
+          <w:rFonts w:ascii="Times New Roman" w:hAnsi="Times New Roman" w:cs="Times New Roman"/>
+          <w:sz w:val="24"/>
+          <w:szCs w:val="24"/>
+        </w:rPr>
+      </w:pPr>
+    </w:p>
+    <w:p>
+      <w:pPr>
+        <w:spacing w:line="360" w:lineRule="auto"/>
+        <w:jc w:val="both"/>
+        <w:rPr>
+          <w:rFonts w:ascii="Times New Roman" w:hAnsi="Times New Roman" w:cs="Times New Roman"/>
+          <w:sz w:val="24"/>
+          <w:szCs w:val="24"/>
+        </w:rPr>
+      </w:pPr>
+      <w:r>
+        <w:rPr>
+          <w:rFonts w:ascii="Times New Roman" w:hAnsi="Times New Roman" w:cs="Times New Roman"/>
+          <w:sz w:val="24"/>
+          <w:szCs w:val="24"/>
+        </w:rPr>
+        <w:t>Architecture</w:t>
+      </w:r>
+      <w:bookmarkStart w:id="14" w:name="_GoBack"/>
+      <w:bookmarkEnd w:id="14"/>
+    </w:p>
+    <w:p>
+      <w:pPr>
+        <w:spacing w:line="360" w:lineRule="auto"/>
+        <w:jc w:val="both"/>
+        <w:rPr>
+          <w:rFonts w:ascii="Times New Roman" w:hAnsi="Times New Roman" w:cs="Times New Roman"/>
+          <w:sz w:val="24"/>
+          <w:szCs w:val="24"/>
+        </w:rPr>
+      </w:pPr>
+    </w:p>
+    <w:p>
+      <w:pPr>
+        <w:keepNext/>
+        <w:spacing w:line="360" w:lineRule="auto"/>
+        <w:jc w:val="center"/>
+      </w:pPr>
+      <w:r>
+        <w:rPr>
+          <w:noProof/>
+        </w:rPr>
+        <w:lastRenderedPageBreak/>
+        <w:drawing>
+          <wp:inline distT="0" distB="0" distL="0" distR="0">
+            <wp:extent cx="5930900" cy="4095750"/>
+            <wp:effectExtent l="0" t="0" r="0" b="0"/>
+            <wp:docPr id="17" name="Picture 17"/>
+            <wp:cNvGraphicFramePr>
+              <a:graphicFrameLocks xmlns:a="http://schemas.openxmlformats.org/drawingml/2006/main" noChangeAspect="1"/>
+            </wp:cNvGraphicFramePr>
+            <a:graphic xmlns:a="http://schemas.openxmlformats.org/drawingml/2006/main">
+              <a:graphicData uri="http://schemas.openxmlformats.org/drawingml/2006/picture">
+                <pic:pic xmlns:pic="http://schemas.openxmlformats.org/drawingml/2006/picture">
+                  <pic:nvPicPr>
+                    <pic:cNvPr id="0" name="Picture 9"/>
+                    <pic:cNvPicPr>
+                      <a:picLocks noChangeAspect="1" noChangeArrowheads="1"/>
+                    </pic:cNvPicPr>
+                  </pic:nvPicPr>
+                  <pic:blipFill>
+                    <a:blip r:embed="rId23" cstate="print">
+                      <a:extLst>
+                        <a:ext uri="{28A0092B-C50C-407E-A947-70E740481C1C}">
+                          <a14:useLocalDpi xmlns:a14="http://schemas.microsoft.com/office/drawing/2010/main" val="0"/>
+                        </a:ext>
+                      </a:extLst>
+                    </a:blip>
+                    <a:srcRect/>
+                    <a:stretch>
+                      <a:fillRect/>
+                    </a:stretch>
+                  </pic:blipFill>
+                  <pic:spPr bwMode="auto">
+                    <a:xfrm>
+                      <a:off x="0" y="0"/>
+                      <a:ext cx="5930900" cy="4095750"/>
+                    </a:xfrm>
+                    <a:prstGeom prst="rect">
+                      <a:avLst/>
+                    </a:prstGeom>
+                    <a:noFill/>
+                    <a:ln>
+                      <a:noFill/>
+                    </a:ln>
+                  </pic:spPr>
+                </pic:pic>
+              </a:graphicData>
+            </a:graphic>
+          </wp:inline>
+        </w:drawing>
+      </w:r>
+    </w:p>
+    <w:p>
+      <w:pPr>
+        <w:pStyle w:val="Caption"/>
+        <w:spacing w:line="360" w:lineRule="auto"/>
+        <w:jc w:val="center"/>
+        <w:rPr>
+          <w:rFonts w:ascii="Times New Roman" w:hAnsi="Times New Roman" w:cs="Times New Roman"/>
+          <w:b w:val="0"/>
+          <w:color w:val="auto"/>
+          <w:sz w:val="24"/>
+          <w:szCs w:val="24"/>
+        </w:rPr>
+      </w:pPr>
+      <w:r>
+        <w:rPr>
+          <w:rFonts w:ascii="Times New Roman" w:hAnsi="Times New Roman" w:cs="Times New Roman"/>
+          <w:b w:val="0"/>
+          <w:color w:val="auto"/>
+          <w:sz w:val="24"/>
+          <w:szCs w:val="24"/>
+        </w:rPr>
+        <w:t xml:space="preserve">Figure </w:t>
+      </w:r>
+      <w:r>
+        <w:rPr>
+          <w:rFonts w:ascii="Times New Roman" w:hAnsi="Times New Roman" w:cs="Times New Roman"/>
+          <w:b w:val="0"/>
+          <w:color w:val="auto"/>
+          <w:sz w:val="24"/>
+          <w:szCs w:val="24"/>
+        </w:rPr>
+        <w:fldChar w:fldCharType="begin"/>
+      </w:r>
+      <w:r>
+        <w:rPr>
+          <w:rFonts w:ascii="Times New Roman" w:hAnsi="Times New Roman" w:cs="Times New Roman"/>
+          <w:b w:val="0"/>
+          <w:color w:val="auto"/>
+          <w:sz w:val="24"/>
+          <w:szCs w:val="24"/>
+        </w:rPr>
+        <w:instrText xml:space="preserve"> STYLEREF 1 \s </w:instrText>
+      </w:r>
+      <w:r>
+        <w:rPr>
+          <w:rFonts w:ascii="Times New Roman" w:hAnsi="Times New Roman" w:cs="Times New Roman"/>
+          <w:b w:val="0"/>
+          <w:color w:val="auto"/>
+          <w:sz w:val="24"/>
+          <w:szCs w:val="24"/>
+        </w:rPr>
+        <w:fldChar w:fldCharType="separate"/>
+      </w:r>
+      <w:r>
+        <w:rPr>
+          <w:rFonts w:ascii="Times New Roman" w:hAnsi="Times New Roman" w:cs="Times New Roman"/>
+          <w:b w:val="0"/>
+          <w:noProof/>
+          <w:color w:val="auto"/>
+          <w:sz w:val="24"/>
+          <w:szCs w:val="24"/>
+        </w:rPr>
+        <w:t>3</w:t>
+      </w:r>
+      <w:r>
+        <w:rPr>
+          <w:rFonts w:ascii="Times New Roman" w:hAnsi="Times New Roman" w:cs="Times New Roman"/>
+          <w:b w:val="0"/>
+          <w:color w:val="auto"/>
+          <w:sz w:val="24"/>
+          <w:szCs w:val="24"/>
+        </w:rPr>
+        <w:fldChar w:fldCharType="end"/>
+      </w:r>
+      <w:r>
+        <w:rPr>
+          <w:rFonts w:ascii="Times New Roman" w:hAnsi="Times New Roman" w:cs="Times New Roman"/>
+          <w:b w:val="0"/>
+          <w:color w:val="auto"/>
+          <w:sz w:val="24"/>
+          <w:szCs w:val="24"/>
+        </w:rPr>
+        <w:noBreakHyphen/>
+      </w:r>
+      <w:r>
+        <w:rPr>
+          <w:rFonts w:ascii="Times New Roman" w:hAnsi="Times New Roman" w:cs="Times New Roman"/>
+          <w:b w:val="0"/>
+          <w:color w:val="auto"/>
+          <w:sz w:val="24"/>
+          <w:szCs w:val="24"/>
+        </w:rPr>
+        <w:fldChar w:fldCharType="begin"/>
+      </w:r>
+      <w:r>
+        <w:rPr>
+          <w:rFonts w:ascii="Times New Roman" w:hAnsi="Times New Roman" w:cs="Times New Roman"/>
+          <w:b w:val="0"/>
+          <w:color w:val="auto"/>
+          <w:sz w:val="24"/>
+          <w:szCs w:val="24"/>
+        </w:rPr>
+        <w:instrText xml:space="preserve"> SEQ Figure \* ARABIC \s 1 </w:instrText>
+      </w:r>
+      <w:r>
+        <w:rPr>
+          <w:rFonts w:ascii="Times New Roman" w:hAnsi="Times New Roman" w:cs="Times New Roman"/>
+          <w:b w:val="0"/>
+          <w:color w:val="auto"/>
+          <w:sz w:val="24"/>
+          <w:szCs w:val="24"/>
+        </w:rPr>
+        <w:fldChar w:fldCharType="separate"/>
+      </w:r>
+      <w:r>
+        <w:rPr>
+          <w:rFonts w:ascii="Times New Roman" w:hAnsi="Times New Roman" w:cs="Times New Roman"/>
+          <w:b w:val="0"/>
+          <w:noProof/>
+          <w:color w:val="auto"/>
+          <w:sz w:val="24"/>
+          <w:szCs w:val="24"/>
+        </w:rPr>
+        <w:t>9</w:t>
+      </w:r>
+      <w:r>
+        <w:rPr>
+          <w:rFonts w:ascii="Times New Roman" w:hAnsi="Times New Roman" w:cs="Times New Roman"/>
+          <w:b w:val="0"/>
+          <w:color w:val="auto"/>
+          <w:sz w:val="24"/>
+          <w:szCs w:val="24"/>
+        </w:rPr>
+        <w:fldChar w:fldCharType="end"/>
+      </w:r>
+      <w:r>
+        <w:rPr>
+          <w:rFonts w:ascii="Times New Roman" w:hAnsi="Times New Roman" w:cs="Times New Roman"/>
+          <w:b w:val="0"/>
+          <w:color w:val="auto"/>
+          <w:sz w:val="24"/>
+          <w:szCs w:val="24"/>
+        </w:rPr>
+        <w:t xml:space="preserve"> Application architecture</w:t>
+      </w:r>
+    </w:p>
     <w:p/>
+    <w:p>
+      <w:pPr>
+        <w:pStyle w:val="Heading2"/>
+      </w:pPr>
+      <w:bookmarkStart w:id="15" w:name="_Toc104214488"/>
+      <w:r>
+        <w:t>Used technologies</w:t>
+      </w:r>
+      <w:bookmarkEnd w:id="15"/>
+    </w:p>
     <w:p/>
-    <w:p/>
-    <w:p/>
-    <w:p/>
-    <w:p/>
-    <w:p/>
-    <w:p/>
-    <w:p/>
-    <w:p>
-      <w:pPr>
-        <w:pStyle w:val="Heading2"/>
-      </w:pPr>
-      <w:bookmarkStart w:id="18" w:name="_Toc104214487"/>
-      <w:r>
-        <w:lastRenderedPageBreak/>
-        <w:t>Implementation and Design</w:t>
-      </w:r>
-      <w:bookmarkEnd w:id="18"/>
-    </w:p>
-    <w:p/>
-    <w:p>
-      <w:pPr>
-        <w:pStyle w:val="Heading2"/>
-      </w:pPr>
-      <w:bookmarkStart w:id="19" w:name="_Toc104214488"/>
-      <w:r>
-        <w:t>Used technologies</w:t>
-      </w:r>
-      <w:bookmarkEnd w:id="19"/>
-    </w:p>
-    <w:p/>
     <w:p>
       <w:pPr>
         <w:pStyle w:val="Heading1"/>
       </w:pPr>
-      <w:bookmarkStart w:id="20" w:name="_Toc104214489"/>
+      <w:bookmarkStart w:id="16" w:name="_Toc104214489"/>
       <w:r>
         <w:t>Conclusions</w:t>
       </w:r>
-      <w:bookmarkEnd w:id="20"/>
+      <w:bookmarkEnd w:id="16"/>
     </w:p>
     <w:p>
       <w:pPr>
@@ -7877,7 +11224,6 @@
           <w:sz w:val="48"/>
           <w:szCs w:val="48"/>
         </w:rPr>
-        <w:lastRenderedPageBreak/>
         <w:t>Bibliography</w:t>
       </w:r>
     </w:p>
@@ -8421,6 +11767,7 @@
           <w:szCs w:val="24"/>
           <w:shd w:val="clear" w:color="auto" w:fill="FFFFFF"/>
         </w:rPr>
+        <w:lastRenderedPageBreak/>
         <w:t xml:space="preserve">[5] </w:t>
       </w:r>
       <w:proofErr w:type="spellStart"/>
@@ -9468,8 +12815,9 @@
           <w:sz w:val="24"/>
           <w:szCs w:val="24"/>
         </w:rPr>
-        <w:t>Performance evaluation of Websocket protocol for implementat</w:t>
-      </w:r>
+        <w:t xml:space="preserve">Performance evaluation of </w:t>
+      </w:r>
+      <w:proofErr w:type="spellStart"/>
       <w:r>
         <w:rPr>
           <w:rFonts w:ascii="Times New Roman" w:hAnsi="Times New Roman" w:cs="Times New Roman"/>
@@ -9477,6 +12825,25 @@
           <w:sz w:val="24"/>
           <w:szCs w:val="24"/>
         </w:rPr>
+        <w:t>Websocket</w:t>
+      </w:r>
+      <w:proofErr w:type="spellEnd"/>
+      <w:r>
+        <w:rPr>
+          <w:rFonts w:ascii="Times New Roman" w:hAnsi="Times New Roman" w:cs="Times New Roman"/>
+          <w:i/>
+          <w:sz w:val="24"/>
+          <w:szCs w:val="24"/>
+        </w:rPr>
+        <w:t xml:space="preserve"> protocol for implementat</w:t>
+      </w:r>
+      <w:r>
+        <w:rPr>
+          <w:rFonts w:ascii="Times New Roman" w:hAnsi="Times New Roman" w:cs="Times New Roman"/>
+          <w:i/>
+          <w:sz w:val="24"/>
+          <w:szCs w:val="24"/>
+        </w:rPr>
         <w:t>ion of full-duplex web streams</w:t>
       </w:r>
       <w:r>
@@ -9493,16 +12860,7 @@
           <w:sz w:val="24"/>
           <w:szCs w:val="24"/>
         </w:rPr>
-        <w:t xml:space="preserve"> 2014 37th International Convention on Information </w:t>
-      </w:r>
-      <w:r>
-        <w:rPr>
-          <w:rFonts w:ascii="Times New Roman" w:hAnsi="Times New Roman" w:cs="Times New Roman"/>
-          <w:sz w:val="24"/>
-          <w:szCs w:val="24"/>
-        </w:rPr>
-        <w:lastRenderedPageBreak/>
-        <w:t>and Communication Technology, Electronics and Microelectronics (MIPRO), 201</w:t>
+        <w:t xml:space="preserve"> 2014 37th International Convention on Information and Communication Technology, Electronics and Microelectronics (MIPRO), 201</w:t>
       </w:r>
       <w:r>
         <w:rPr>
@@ -9624,7 +12982,15 @@
           <w:sz w:val="24"/>
           <w:szCs w:val="24"/>
         </w:rPr>
-        <w:t xml:space="preserve"> J Mod </w:t>
+        <w:t xml:space="preserve"> J</w:t>
+      </w:r>
+      <w:r>
+        <w:rPr>
+          <w:rFonts w:ascii="Times New Roman" w:hAnsi="Times New Roman" w:cs="Times New Roman"/>
+          <w:sz w:val="24"/>
+          <w:szCs w:val="24"/>
+        </w:rPr>
+        <w:t xml:space="preserve"> Mod </w:t>
       </w:r>
       <w:proofErr w:type="spellStart"/>
       <w:r>
@@ -9642,7 +13008,7 @@
           <w:sz w:val="24"/>
           <w:szCs w:val="24"/>
         </w:rPr>
-        <w:t xml:space="preserve"> Res. 2013;3(3):1566-70.</w:t>
+        <w:t xml:space="preserve"> Res. 2013;3(3):1566-70</w:t>
       </w:r>
     </w:p>
     <w:p>
@@ -9655,10 +13021,219 @@
           <w:szCs w:val="24"/>
         </w:rPr>
       </w:pPr>
+      <w:r>
+        <w:rPr>
+          <w:rFonts w:ascii="Times New Roman" w:hAnsi="Times New Roman" w:cs="Times New Roman"/>
+          <w:sz w:val="24"/>
+          <w:szCs w:val="24"/>
+        </w:rPr>
+        <w:t xml:space="preserve">[12] </w:t>
+      </w:r>
+      <w:r>
+        <w:rPr>
+          <w:rFonts w:ascii="Times New Roman" w:hAnsi="Times New Roman" w:cs="Times New Roman"/>
+          <w:sz w:val="24"/>
+          <w:szCs w:val="24"/>
+        </w:rPr>
+        <w:t xml:space="preserve">P. E. </w:t>
+      </w:r>
+      <w:proofErr w:type="spellStart"/>
+      <w:r>
+        <w:rPr>
+          <w:rFonts w:ascii="Times New Roman" w:hAnsi="Times New Roman" w:cs="Times New Roman"/>
+          <w:sz w:val="24"/>
+          <w:szCs w:val="24"/>
+        </w:rPr>
+        <w:t>Idoga</w:t>
+      </w:r>
+      <w:proofErr w:type="spellEnd"/>
+      <w:r>
+        <w:rPr>
+          <w:rFonts w:ascii="Times New Roman" w:hAnsi="Times New Roman" w:cs="Times New Roman"/>
+          <w:sz w:val="24"/>
+          <w:szCs w:val="24"/>
+        </w:rPr>
+        <w:t xml:space="preserve">, M. </w:t>
+      </w:r>
+      <w:proofErr w:type="spellStart"/>
+      <w:r>
+        <w:rPr>
+          <w:rFonts w:ascii="Times New Roman" w:hAnsi="Times New Roman" w:cs="Times New Roman"/>
+          <w:sz w:val="24"/>
+          <w:szCs w:val="24"/>
+        </w:rPr>
+        <w:t>Agoyi</w:t>
+      </w:r>
+      <w:proofErr w:type="spellEnd"/>
+      <w:r>
+        <w:rPr>
+          <w:rFonts w:ascii="Times New Roman" w:hAnsi="Times New Roman" w:cs="Times New Roman"/>
+          <w:sz w:val="24"/>
+          <w:szCs w:val="24"/>
+        </w:rPr>
+        <w:t>, E. Y. C</w:t>
+      </w:r>
+      <w:r>
+        <w:rPr>
+          <w:rFonts w:ascii="Times New Roman" w:hAnsi="Times New Roman" w:cs="Times New Roman"/>
+          <w:sz w:val="24"/>
+          <w:szCs w:val="24"/>
+        </w:rPr>
+        <w:t xml:space="preserve">oker-Farrell and O. L. </w:t>
+      </w:r>
+      <w:proofErr w:type="spellStart"/>
+      <w:r>
+        <w:rPr>
+          <w:rFonts w:ascii="Times New Roman" w:hAnsi="Times New Roman" w:cs="Times New Roman"/>
+          <w:sz w:val="24"/>
+          <w:szCs w:val="24"/>
+        </w:rPr>
+        <w:t>Ekeoma</w:t>
+      </w:r>
+      <w:proofErr w:type="spellEnd"/>
+      <w:r>
+        <w:rPr>
+          <w:rFonts w:ascii="Times New Roman" w:hAnsi="Times New Roman" w:cs="Times New Roman"/>
+          <w:sz w:val="24"/>
+          <w:szCs w:val="24"/>
+        </w:rPr>
+        <w:t xml:space="preserve">, </w:t>
+      </w:r>
+      <w:r>
+        <w:rPr>
+          <w:rFonts w:ascii="Times New Roman" w:hAnsi="Times New Roman" w:cs="Times New Roman"/>
+          <w:i/>
+          <w:sz w:val="24"/>
+          <w:szCs w:val="24"/>
+        </w:rPr>
+        <w:t>Review of security issues in e-Healthcare and solutions</w:t>
+      </w:r>
+      <w:r>
+        <w:rPr>
+          <w:rFonts w:ascii="Times New Roman" w:hAnsi="Times New Roman" w:cs="Times New Roman"/>
+          <w:sz w:val="24"/>
+          <w:szCs w:val="24"/>
+        </w:rPr>
+        <w:t>,</w:t>
+      </w:r>
+      <w:r>
+        <w:rPr>
+          <w:rFonts w:ascii="Times New Roman" w:hAnsi="Times New Roman" w:cs="Times New Roman"/>
+          <w:sz w:val="24"/>
+          <w:szCs w:val="24"/>
+        </w:rPr>
+        <w:t xml:space="preserve"> 2016 HONET-ICT, 2016, pp. 118-121</w:t>
+      </w:r>
+    </w:p>
+    <w:p>
+      <w:pPr>
+        <w:spacing w:line="360" w:lineRule="auto"/>
+        <w:jc w:val="both"/>
+        <w:rPr>
+          <w:rFonts w:ascii="Times New Roman" w:hAnsi="Times New Roman" w:cs="Times New Roman"/>
+          <w:sz w:val="24"/>
+          <w:szCs w:val="24"/>
+        </w:rPr>
+      </w:pPr>
+      <w:r>
+        <w:rPr>
+          <w:rFonts w:ascii="Times New Roman" w:hAnsi="Times New Roman" w:cs="Times New Roman"/>
+          <w:sz w:val="24"/>
+          <w:szCs w:val="24"/>
+        </w:rPr>
+        <w:t xml:space="preserve">[13] G. </w:t>
+      </w:r>
+      <w:proofErr w:type="spellStart"/>
+      <w:r>
+        <w:rPr>
+          <w:rFonts w:ascii="Times New Roman" w:hAnsi="Times New Roman" w:cs="Times New Roman"/>
+          <w:sz w:val="24"/>
+          <w:szCs w:val="24"/>
+        </w:rPr>
+        <w:t>Candea</w:t>
+      </w:r>
+      <w:proofErr w:type="spellEnd"/>
+      <w:r>
+        <w:rPr>
+          <w:rFonts w:ascii="Times New Roman" w:hAnsi="Times New Roman" w:cs="Times New Roman"/>
+          <w:sz w:val="24"/>
+          <w:szCs w:val="24"/>
+        </w:rPr>
+        <w:t xml:space="preserve">, </w:t>
+      </w:r>
+      <w:r>
+        <w:rPr>
+          <w:rFonts w:ascii="Times New Roman" w:hAnsi="Times New Roman" w:cs="Times New Roman"/>
+          <w:sz w:val="24"/>
+          <w:szCs w:val="24"/>
+        </w:rPr>
+        <w:t xml:space="preserve">A. </w:t>
+      </w:r>
+      <w:r>
+        <w:rPr>
+          <w:rFonts w:ascii="Times New Roman" w:hAnsi="Times New Roman" w:cs="Times New Roman"/>
+          <w:sz w:val="24"/>
+          <w:szCs w:val="24"/>
+        </w:rPr>
+        <w:t>Fox</w:t>
+      </w:r>
+      <w:r>
+        <w:rPr>
+          <w:rFonts w:ascii="Times New Roman" w:hAnsi="Times New Roman" w:cs="Times New Roman"/>
+          <w:sz w:val="24"/>
+          <w:szCs w:val="24"/>
+        </w:rPr>
+        <w:t xml:space="preserve">, </w:t>
+      </w:r>
+      <w:r>
+        <w:rPr>
+          <w:rFonts w:ascii="Times New Roman" w:hAnsi="Times New Roman" w:cs="Times New Roman"/>
+          <w:i/>
+          <w:sz w:val="24"/>
+          <w:szCs w:val="24"/>
+        </w:rPr>
+        <w:t>Designing for High Availability and Measurability</w:t>
+      </w:r>
+      <w:r>
+        <w:rPr>
+          <w:rFonts w:ascii="Times New Roman" w:hAnsi="Times New Roman" w:cs="Times New Roman"/>
+          <w:sz w:val="24"/>
+          <w:szCs w:val="24"/>
+        </w:rPr>
+        <w:t>, 1</w:t>
+      </w:r>
+      <w:r>
+        <w:rPr>
+          <w:rFonts w:ascii="Times New Roman" w:hAnsi="Times New Roman" w:cs="Times New Roman"/>
+          <w:sz w:val="24"/>
+          <w:szCs w:val="24"/>
+          <w:vertAlign w:val="superscript"/>
+        </w:rPr>
+        <w:t>st</w:t>
+      </w:r>
+      <w:r>
+        <w:rPr>
+          <w:rFonts w:ascii="Times New Roman" w:hAnsi="Times New Roman" w:cs="Times New Roman"/>
+          <w:sz w:val="24"/>
+          <w:szCs w:val="24"/>
+        </w:rPr>
+        <w:t xml:space="preserve"> Workshop on Evaluating and Architecting System Dependability (EASY), 2001</w:t>
+      </w:r>
+    </w:p>
+    <w:p>
+      <w:pPr>
+        <w:spacing w:line="360" w:lineRule="auto"/>
+        <w:jc w:val="both"/>
+        <w:rPr>
+          <w:rFonts w:ascii="Times New Roman" w:hAnsi="Times New Roman" w:cs="Times New Roman"/>
+          <w:sz w:val="24"/>
+          <w:szCs w:val="24"/>
+        </w:rPr>
+      </w:pPr>
     </w:p>
     <w:sectPr>
-      <w:footerReference w:type="even" r:id="rId14"/>
-      <w:footerReference w:type="default" r:id="rId15"/>
+      <w:footerReference w:type="even" r:id="rId24"/>
+      <w:footerReference w:type="default" r:id="rId25"/>
       <w:pgSz w:w="12240" w:h="15840"/>
       <w:pgMar w:top="1440" w:right="1440" w:bottom="1440" w:left="1440" w:header="720" w:footer="720" w:gutter="0"/>
       <w:cols w:space="720"/>
@@ -9727,7 +13302,7 @@
           <w:rPr>
             <w:noProof/>
           </w:rPr>
-          <w:t>12</w:t>
+          <w:t>26</w:t>
         </w:r>
         <w:r>
           <w:rPr>
@@ -9780,7 +13355,7 @@
           <w:rPr>
             <w:noProof/>
           </w:rPr>
-          <w:t>11</w:t>
+          <w:t>27</w:t>
         </w:r>
         <w:r>
           <w:rPr>
@@ -11022,6 +14597,7 @@
   <w:style w:type="character" w:default="1" w:styleId="DefaultParagraphFont">
     <w:name w:val="Default Paragraph Font"/>
     <w:uiPriority w:val="1"/>
+    <w:semiHidden/>
     <w:unhideWhenUsed/>
   </w:style>
   <w:style w:type="table" w:default="1" w:styleId="TableNormal">
@@ -11976,6 +15552,7 @@
   <w:style w:type="character" w:default="1" w:styleId="DefaultParagraphFont">
     <w:name w:val="Default Paragraph Font"/>
     <w:uiPriority w:val="1"/>
+    <w:semiHidden/>
     <w:unhideWhenUsed/>
   </w:style>
   <w:style w:type="table" w:default="1" w:styleId="TableNormal">
@@ -12830,7 +16407,7 @@
 </file>
 
 <file path=customXml/itemProps1.xml><?xml version="1.0" encoding="utf-8"?>
-<ds:datastoreItem xmlns:ds="http://schemas.openxmlformats.org/officeDocument/2006/customXml" ds:itemID="{8C07CC4C-C427-4A59-B541-3FA6791B9604}">
+<ds:datastoreItem xmlns:ds="http://schemas.openxmlformats.org/officeDocument/2006/customXml" ds:itemID="{FE93EC07-ED7F-48D0-A224-E3832CFFE7BB}">
   <ds:schemaRefs>
     <ds:schemaRef ds:uri="http://schemas.openxmlformats.org/officeDocument/2006/bibliography"/>
   </ds:schemaRefs>

</xml_diff>